<commit_message>
Textos neutros para Gasco y manual ajustado a las pantallas reales
- Ejemplos de correo sin referencias navieras; lema en castellano.
- Manual: alta de cuentas con contrasena inicial, Deshabilitar, perfil y configuracion.

Co-Authored-By: Claude Opus 5 <noreply@anthropic.com>
</commit_message>
<xml_diff>
--- a/docs/gasco/Manual_de_uso_PMS_SIMARP.docx
+++ b/docs/gasco/Manual_de_uso_PMS_SIMARP.docx
@@ -115,7 +115,7 @@
     <w:sdt>
       <w:sdtPr>
         <w:alias w:val="Contenido"/>
-        <w:id w:val="82730348"/>
+        <w:id w:val="1654945620"/>
       </w:sdtPr>
       <w:sdtEndPr/>
       <w:sdtContent>
@@ -143,7 +143,7 @@
           <w:r>
             <w:fldChar w:fldCharType="separate"/>
           </w:r>
-          <w:hyperlink w:anchor="_Toc240931738" w:history="1">
+          <w:hyperlink w:anchor="_Toc240932002" w:history="1">
             <w:r>
               <w:rPr>
                 <w:rStyle w:val="Hipervnculo"/>
@@ -167,7 +167,7 @@
               <w:rPr>
                 <w:noProof/>
               </w:rPr>
-              <w:instrText xml:space="preserve"> PAGEREF _Toc240931738 \h </w:instrText>
+              <w:instrText xml:space="preserve"> PAGEREF _Toc240932002 \h </w:instrText>
             </w:r>
             <w:r>
               <w:rPr>
@@ -209,7 +209,7 @@
               <w14:ligatures w14:val="standardContextual"/>
             </w:rPr>
           </w:pPr>
-          <w:hyperlink w:anchor="_Toc240931739" w:history="1">
+          <w:hyperlink w:anchor="_Toc240932003" w:history="1">
             <w:r>
               <w:rPr>
                 <w:rStyle w:val="Hipervnculo"/>
@@ -233,7 +233,7 @@
               <w:rPr>
                 <w:noProof/>
               </w:rPr>
-              <w:instrText xml:space="preserve"> PAGEREF _Toc240931739 \h </w:instrText>
+              <w:instrText xml:space="preserve"> PAGEREF _Toc240932003 \h </w:instrText>
             </w:r>
             <w:r>
               <w:rPr>
@@ -275,7 +275,7 @@
               <w14:ligatures w14:val="standardContextual"/>
             </w:rPr>
           </w:pPr>
-          <w:hyperlink w:anchor="_Toc240931740" w:history="1">
+          <w:hyperlink w:anchor="_Toc240932004" w:history="1">
             <w:r>
               <w:rPr>
                 <w:rStyle w:val="Hipervnculo"/>
@@ -299,7 +299,7 @@
               <w:rPr>
                 <w:noProof/>
               </w:rPr>
-              <w:instrText xml:space="preserve"> PAGEREF _Toc240931740 \h </w:instrText>
+              <w:instrText xml:space="preserve"> PAGEREF _Toc240932004 \h </w:instrText>
             </w:r>
             <w:r>
               <w:rPr>
@@ -341,7 +341,7 @@
               <w14:ligatures w14:val="standardContextual"/>
             </w:rPr>
           </w:pPr>
-          <w:hyperlink w:anchor="_Toc240931741" w:history="1">
+          <w:hyperlink w:anchor="_Toc240932005" w:history="1">
             <w:r>
               <w:rPr>
                 <w:rStyle w:val="Hipervnculo"/>
@@ -365,7 +365,7 @@
               <w:rPr>
                 <w:noProof/>
               </w:rPr>
-              <w:instrText xml:space="preserve"> PAGEREF _Toc240931741 \h </w:instrText>
+              <w:instrText xml:space="preserve"> PAGEREF _Toc240932005 \h </w:instrText>
             </w:r>
             <w:r>
               <w:rPr>
@@ -407,7 +407,7 @@
               <w14:ligatures w14:val="standardContextual"/>
             </w:rPr>
           </w:pPr>
-          <w:hyperlink w:anchor="_Toc240931742" w:history="1">
+          <w:hyperlink w:anchor="_Toc240932006" w:history="1">
             <w:r>
               <w:rPr>
                 <w:rStyle w:val="Hipervnculo"/>
@@ -431,7 +431,7 @@
               <w:rPr>
                 <w:noProof/>
               </w:rPr>
-              <w:instrText xml:space="preserve"> PAGEREF _Toc240931742 \h </w:instrText>
+              <w:instrText xml:space="preserve"> PAGEREF _Toc240932006 \h </w:instrText>
             </w:r>
             <w:r>
               <w:rPr>
@@ -473,7 +473,7 @@
               <w14:ligatures w14:val="standardContextual"/>
             </w:rPr>
           </w:pPr>
-          <w:hyperlink w:anchor="_Toc240931743" w:history="1">
+          <w:hyperlink w:anchor="_Toc240932007" w:history="1">
             <w:r>
               <w:rPr>
                 <w:rStyle w:val="Hipervnculo"/>
@@ -497,7 +497,7 @@
               <w:rPr>
                 <w:noProof/>
               </w:rPr>
-              <w:instrText xml:space="preserve"> PAGEREF _Toc240931743 \h </w:instrText>
+              <w:instrText xml:space="preserve"> PAGEREF _Toc240932007 \h </w:instrText>
             </w:r>
             <w:r>
               <w:rPr>
@@ -539,7 +539,7 @@
               <w14:ligatures w14:val="standardContextual"/>
             </w:rPr>
           </w:pPr>
-          <w:hyperlink w:anchor="_Toc240931744" w:history="1">
+          <w:hyperlink w:anchor="_Toc240932008" w:history="1">
             <w:r>
               <w:rPr>
                 <w:rStyle w:val="Hipervnculo"/>
@@ -563,7 +563,7 @@
               <w:rPr>
                 <w:noProof/>
               </w:rPr>
-              <w:instrText xml:space="preserve"> PAGEREF _Toc240931744 \h </w:instrText>
+              <w:instrText xml:space="preserve"> PAGEREF _Toc240932008 \h </w:instrText>
             </w:r>
             <w:r>
               <w:rPr>
@@ -605,7 +605,7 @@
               <w14:ligatures w14:val="standardContextual"/>
             </w:rPr>
           </w:pPr>
-          <w:hyperlink w:anchor="_Toc240931745" w:history="1">
+          <w:hyperlink w:anchor="_Toc240932009" w:history="1">
             <w:r>
               <w:rPr>
                 <w:rStyle w:val="Hipervnculo"/>
@@ -629,7 +629,7 @@
               <w:rPr>
                 <w:noProof/>
               </w:rPr>
-              <w:instrText xml:space="preserve"> PAGEREF _Toc240931745 \h </w:instrText>
+              <w:instrText xml:space="preserve"> PAGEREF _Toc240932009 \h </w:instrText>
             </w:r>
             <w:r>
               <w:rPr>
@@ -671,7 +671,7 @@
               <w14:ligatures w14:val="standardContextual"/>
             </w:rPr>
           </w:pPr>
-          <w:hyperlink w:anchor="_Toc240931746" w:history="1">
+          <w:hyperlink w:anchor="_Toc240932010" w:history="1">
             <w:r>
               <w:rPr>
                 <w:rStyle w:val="Hipervnculo"/>
@@ -695,7 +695,7 @@
               <w:rPr>
                 <w:noProof/>
               </w:rPr>
-              <w:instrText xml:space="preserve"> PAGEREF _Toc240931746 \h </w:instrText>
+              <w:instrText xml:space="preserve"> PAGEREF _Toc240932010 \h </w:instrText>
             </w:r>
             <w:r>
               <w:rPr>
@@ -737,7 +737,7 @@
               <w14:ligatures w14:val="standardContextual"/>
             </w:rPr>
           </w:pPr>
-          <w:hyperlink w:anchor="_Toc240931747" w:history="1">
+          <w:hyperlink w:anchor="_Toc240932011" w:history="1">
             <w:r>
               <w:rPr>
                 <w:rStyle w:val="Hipervnculo"/>
@@ -761,7 +761,7 @@
               <w:rPr>
                 <w:noProof/>
               </w:rPr>
-              <w:instrText xml:space="preserve"> PAGEREF _Toc240931747 \h </w:instrText>
+              <w:instrText xml:space="preserve"> PAGEREF _Toc240932011 \h </w:instrText>
             </w:r>
             <w:r>
               <w:rPr>
@@ -803,7 +803,7 @@
               <w14:ligatures w14:val="standardContextual"/>
             </w:rPr>
           </w:pPr>
-          <w:hyperlink w:anchor="_Toc240931748" w:history="1">
+          <w:hyperlink w:anchor="_Toc240932012" w:history="1">
             <w:r>
               <w:rPr>
                 <w:rStyle w:val="Hipervnculo"/>
@@ -827,7 +827,7 @@
               <w:rPr>
                 <w:noProof/>
               </w:rPr>
-              <w:instrText xml:space="preserve"> PAGEREF _Toc240931748 \h </w:instrText>
+              <w:instrText xml:space="preserve"> PAGEREF _Toc240932012 \h </w:instrText>
             </w:r>
             <w:r>
               <w:rPr>
@@ -869,7 +869,7 @@
               <w14:ligatures w14:val="standardContextual"/>
             </w:rPr>
           </w:pPr>
-          <w:hyperlink w:anchor="_Toc240931749" w:history="1">
+          <w:hyperlink w:anchor="_Toc240932013" w:history="1">
             <w:r>
               <w:rPr>
                 <w:rStyle w:val="Hipervnculo"/>
@@ -893,7 +893,7 @@
               <w:rPr>
                 <w:noProof/>
               </w:rPr>
-              <w:instrText xml:space="preserve"> PAGEREF _Toc240931749 \h </w:instrText>
+              <w:instrText xml:space="preserve"> PAGEREF _Toc240932013 \h </w:instrText>
             </w:r>
             <w:r>
               <w:rPr>
@@ -935,7 +935,7 @@
               <w14:ligatures w14:val="standardContextual"/>
             </w:rPr>
           </w:pPr>
-          <w:hyperlink w:anchor="_Toc240931750" w:history="1">
+          <w:hyperlink w:anchor="_Toc240932014" w:history="1">
             <w:r>
               <w:rPr>
                 <w:rStyle w:val="Hipervnculo"/>
@@ -959,7 +959,7 @@
               <w:rPr>
                 <w:noProof/>
               </w:rPr>
-              <w:instrText xml:space="preserve"> PAGEREF _Toc240931750 \h </w:instrText>
+              <w:instrText xml:space="preserve"> PAGEREF _Toc240932014 \h </w:instrText>
             </w:r>
             <w:r>
               <w:rPr>
@@ -1001,7 +1001,7 @@
               <w14:ligatures w14:val="standardContextual"/>
             </w:rPr>
           </w:pPr>
-          <w:hyperlink w:anchor="_Toc240931751" w:history="1">
+          <w:hyperlink w:anchor="_Toc240932015" w:history="1">
             <w:r>
               <w:rPr>
                 <w:rStyle w:val="Hipervnculo"/>
@@ -1025,7 +1025,7 @@
               <w:rPr>
                 <w:noProof/>
               </w:rPr>
-              <w:instrText xml:space="preserve"> PAGEREF _Toc240931751 \h </w:instrText>
+              <w:instrText xml:space="preserve"> PAGEREF _Toc240932015 \h </w:instrText>
             </w:r>
             <w:r>
               <w:rPr>
@@ -1067,7 +1067,7 @@
               <w14:ligatures w14:val="standardContextual"/>
             </w:rPr>
           </w:pPr>
-          <w:hyperlink w:anchor="_Toc240931752" w:history="1">
+          <w:hyperlink w:anchor="_Toc240932016" w:history="1">
             <w:r>
               <w:rPr>
                 <w:rStyle w:val="Hipervnculo"/>
@@ -1091,7 +1091,7 @@
               <w:rPr>
                 <w:noProof/>
               </w:rPr>
-              <w:instrText xml:space="preserve"> PAGEREF _Toc240931752 \h </w:instrText>
+              <w:instrText xml:space="preserve"> PAGEREF _Toc240932016 \h </w:instrText>
             </w:r>
             <w:r>
               <w:rPr>
@@ -1133,7 +1133,7 @@
               <w14:ligatures w14:val="standardContextual"/>
             </w:rPr>
           </w:pPr>
-          <w:hyperlink w:anchor="_Toc240931753" w:history="1">
+          <w:hyperlink w:anchor="_Toc240932017" w:history="1">
             <w:r>
               <w:rPr>
                 <w:rStyle w:val="Hipervnculo"/>
@@ -1157,7 +1157,7 @@
               <w:rPr>
                 <w:noProof/>
               </w:rPr>
-              <w:instrText xml:space="preserve"> PAGEREF _Toc240931753 \h </w:instrText>
+              <w:instrText xml:space="preserve"> PAGEREF _Toc240932017 \h </w:instrText>
             </w:r>
             <w:r>
               <w:rPr>
@@ -1199,7 +1199,7 @@
               <w14:ligatures w14:val="standardContextual"/>
             </w:rPr>
           </w:pPr>
-          <w:hyperlink w:anchor="_Toc240931754" w:history="1">
+          <w:hyperlink w:anchor="_Toc240932018" w:history="1">
             <w:r>
               <w:rPr>
                 <w:rStyle w:val="Hipervnculo"/>
@@ -1223,7 +1223,7 @@
               <w:rPr>
                 <w:noProof/>
               </w:rPr>
-              <w:instrText xml:space="preserve"> PAGEREF _Toc240931754 \h </w:instrText>
+              <w:instrText xml:space="preserve"> PAGEREF _Toc240932018 \h </w:instrText>
             </w:r>
             <w:r>
               <w:rPr>
@@ -1265,7 +1265,7 @@
               <w14:ligatures w14:val="standardContextual"/>
             </w:rPr>
           </w:pPr>
-          <w:hyperlink w:anchor="_Toc240931755" w:history="1">
+          <w:hyperlink w:anchor="_Toc240932019" w:history="1">
             <w:r>
               <w:rPr>
                 <w:rStyle w:val="Hipervnculo"/>
@@ -1289,7 +1289,7 @@
               <w:rPr>
                 <w:noProof/>
               </w:rPr>
-              <w:instrText xml:space="preserve"> PAGEREF _Toc240931755 \h </w:instrText>
+              <w:instrText xml:space="preserve"> PAGEREF _Toc240932019 \h </w:instrText>
             </w:r>
             <w:r>
               <w:rPr>
@@ -1328,7 +1328,7 @@
         <w:pStyle w:val="Ttulo1"/>
         <w:pageBreakBefore/>
       </w:pPr>
-      <w:bookmarkStart w:id="0" w:name="_Toc240931738"/>
+      <w:bookmarkStart w:id="0" w:name="_Toc240932002"/>
       <w:r>
         <w:lastRenderedPageBreak/>
         <w:t>1. Qué es PMS SIMARP</w:t>
@@ -1525,7 +1525,7 @@
         <w:pStyle w:val="Ttulo1"/>
         <w:pageBreakBefore/>
       </w:pPr>
-      <w:bookmarkStart w:id="1" w:name="_Toc240931739"/>
+      <w:bookmarkStart w:id="1" w:name="_Toc240932003"/>
       <w:r>
         <w:lastRenderedPageBreak/>
         <w:t>2. Primeros pasos</w:t>
@@ -1635,7 +1635,7 @@
         <w:spacing w:after="70" w:line="280" w:lineRule="auto"/>
       </w:pPr>
       <w:r>
-        <w:t xml:space="preserve">Abra el menú de su usuario y elija </w:t>
+        <w:t xml:space="preserve">En la parte inferior del menú lateral, bajo su nombre, pulse </w:t>
       </w:r>
       <w:r>
         <w:rPr>
@@ -1658,7 +1658,27 @@
         <w:spacing w:after="70" w:line="280" w:lineRule="auto"/>
       </w:pPr>
       <w:r>
-        <w:t>Cambie su nombre, o escriba su contraseña actual y la nueva.</w:t>
+        <w:t xml:space="preserve">Cambie su nombre y pulse </w:t>
+      </w:r>
+      <w:r>
+        <w:rPr>
+          <w:b/>
+          <w:bCs/>
+        </w:rPr>
+        <w:t>Guardar nombre</w:t>
+      </w:r>
+      <w:r>
+        <w:t xml:space="preserve">, o escriba su contraseña actual y la nueva (mínimo 10 caracteres, dos veces) y pulse </w:t>
+      </w:r>
+      <w:r>
+        <w:rPr>
+          <w:b/>
+          <w:bCs/>
+        </w:rPr>
+        <w:t>Cambiar contraseña</w:t>
+      </w:r>
+      <w:r>
+        <w:t>.</w:t>
       </w:r>
     </w:p>
     <w:p>
@@ -1798,7 +1818,7 @@
         <w:pStyle w:val="Ttulo1"/>
         <w:pageBreakBefore/>
       </w:pPr>
-      <w:bookmarkStart w:id="2" w:name="_Toc240931740"/>
+      <w:bookmarkStart w:id="2" w:name="_Toc240932004"/>
       <w:r>
         <w:lastRenderedPageBreak/>
         <w:t>3. Roles y permisos</w:t>
@@ -1828,7 +1848,7 @@
           <w:left w:w="10" w:type="dxa"/>
           <w:right w:w="10" w:type="dxa"/>
         </w:tblCellMar>
-        <w:tblLook w:val="0000" w:firstRow="0" w:lastRow="0" w:firstColumn="0" w:lastColumn="0" w:noHBand="0" w:noVBand="0"/>
+        <w:tblLook w:val="04A0" w:firstRow="1" w:lastRow="0" w:firstColumn="1" w:lastColumn="0" w:noHBand="0" w:noVBand="1"/>
       </w:tblPr>
       <w:tblGrid>
         <w:gridCol w:w="2200"/>
@@ -2196,7 +2216,7 @@
               <w:spacing w:line="260" w:lineRule="auto"/>
             </w:pPr>
             <w:r>
-              <w:t>Además: crear usuarios, cambiar roles, suspender accesos, restablecer contraseñas y cambiar la configuración de la instalación.</w:t>
+              <w:t>Además: crear cuentas, cambiar roles, deshabilitar accesos y cambiar la configuración de la instalación.</w:t>
             </w:r>
           </w:p>
         </w:tc>
@@ -2233,7 +2253,7 @@
         <w:pStyle w:val="Ttulo1"/>
         <w:pageBreakBefore/>
       </w:pPr>
-      <w:bookmarkStart w:id="3" w:name="_Toc240931741"/>
+      <w:bookmarkStart w:id="3" w:name="_Toc240932005"/>
       <w:r>
         <w:lastRenderedPageBreak/>
         <w:t>4. Dashboard de mantenimiento</w:t>
@@ -2263,7 +2283,7 @@
           <w:left w:w="10" w:type="dxa"/>
           <w:right w:w="10" w:type="dxa"/>
         </w:tblCellMar>
-        <w:tblLook w:val="0000" w:firstRow="0" w:lastRow="0" w:firstColumn="0" w:lastColumn="0" w:noHBand="0" w:noVBand="0"/>
+        <w:tblLook w:val="04A0" w:firstRow="1" w:lastRow="0" w:firstColumn="1" w:lastColumn="0" w:noHBand="0" w:noVBand="1"/>
       </w:tblPr>
       <w:tblGrid>
         <w:gridCol w:w="1900"/>
@@ -3063,7 +3083,7 @@
         <w:pStyle w:val="Ttulo1"/>
         <w:pageBreakBefore/>
       </w:pPr>
-      <w:bookmarkStart w:id="4" w:name="_Toc240931742"/>
+      <w:bookmarkStart w:id="4" w:name="_Toc240932006"/>
       <w:r>
         <w:lastRenderedPageBreak/>
         <w:t>5. Activos</w:t>
@@ -3111,7 +3131,7 @@
           <w:left w:w="10" w:type="dxa"/>
           <w:right w:w="10" w:type="dxa"/>
         </w:tblCellMar>
-        <w:tblLook w:val="0000" w:firstRow="0" w:lastRow="0" w:firstColumn="0" w:lastColumn="0" w:noHBand="0" w:noVBand="0"/>
+        <w:tblLook w:val="04A0" w:firstRow="1" w:lastRow="0" w:firstColumn="1" w:lastColumn="0" w:noHBand="0" w:noVBand="1"/>
       </w:tblPr>
       <w:tblGrid>
         <w:gridCol w:w="2800"/>
@@ -3958,7 +3978,7 @@
         <w:pStyle w:val="Ttulo1"/>
         <w:pageBreakBefore/>
       </w:pPr>
-      <w:bookmarkStart w:id="5" w:name="_Toc240931743"/>
+      <w:bookmarkStart w:id="5" w:name="_Toc240932007"/>
       <w:r>
         <w:lastRenderedPageBreak/>
         <w:t>6. Órdenes de trabajo</w:t>
@@ -3996,7 +4016,7 @@
           <w:left w:w="10" w:type="dxa"/>
           <w:right w:w="10" w:type="dxa"/>
         </w:tblCellMar>
-        <w:tblLook w:val="0000" w:firstRow="0" w:lastRow="0" w:firstColumn="0" w:lastColumn="0" w:noHBand="0" w:noVBand="0"/>
+        <w:tblLook w:val="04A0" w:firstRow="1" w:lastRow="0" w:firstColumn="1" w:lastColumn="0" w:noHBand="0" w:noVBand="1"/>
       </w:tblPr>
       <w:tblGrid>
         <w:gridCol w:w="2200"/>
@@ -4698,7 +4718,7 @@
         <w:pStyle w:val="Ttulo1"/>
         <w:pageBreakBefore/>
       </w:pPr>
-      <w:bookmarkStart w:id="6" w:name="_Toc240931744"/>
+      <w:bookmarkStart w:id="6" w:name="_Toc240932008"/>
       <w:r>
         <w:lastRenderedPageBreak/>
         <w:t>7. Ejecutar una rutina preventiva</w:t>
@@ -5099,7 +5119,7 @@
         <w:pStyle w:val="Ttulo1"/>
         <w:pageBreakBefore/>
       </w:pPr>
-      <w:bookmarkStart w:id="7" w:name="_Toc240931745"/>
+      <w:bookmarkStart w:id="7" w:name="_Toc240932009"/>
       <w:r>
         <w:lastRenderedPageBreak/>
         <w:t>8. Aprobación del trabajo</w:t>
@@ -5177,7 +5197,7 @@
         <w:pStyle w:val="Ttulo1"/>
         <w:pageBreakBefore/>
       </w:pPr>
-      <w:bookmarkStart w:id="8" w:name="_Toc240931746"/>
+      <w:bookmarkStart w:id="8" w:name="_Toc240932010"/>
       <w:r>
         <w:lastRenderedPageBreak/>
         <w:t>9. Plan preventivo</w:t>
@@ -5225,7 +5245,7 @@
           <w:left w:w="10" w:type="dxa"/>
           <w:right w:w="10" w:type="dxa"/>
         </w:tblCellMar>
-        <w:tblLook w:val="0000" w:firstRow="0" w:lastRow="0" w:firstColumn="0" w:lastColumn="0" w:noHBand="0" w:noVBand="0"/>
+        <w:tblLook w:val="04A0" w:firstRow="1" w:lastRow="0" w:firstColumn="1" w:lastColumn="0" w:noHBand="0" w:noVBand="1"/>
       </w:tblPr>
       <w:tblGrid>
         <w:gridCol w:w="2600"/>
@@ -5610,7 +5630,7 @@
         <w:pStyle w:val="Ttulo1"/>
         <w:pageBreakBefore/>
       </w:pPr>
-      <w:bookmarkStart w:id="9" w:name="_Toc240931747"/>
+      <w:bookmarkStart w:id="9" w:name="_Toc240932011"/>
       <w:r>
         <w:lastRenderedPageBreak/>
         <w:t>10. Horómetros</w:t>
@@ -5697,7 +5717,7 @@
         <w:pStyle w:val="Ttulo1"/>
         <w:pageBreakBefore/>
       </w:pPr>
-      <w:bookmarkStart w:id="10" w:name="_Toc240931748"/>
+      <w:bookmarkStart w:id="10" w:name="_Toc240932012"/>
       <w:r>
         <w:lastRenderedPageBreak/>
         <w:t>11. Priorización asistida por IA</w:t>
@@ -5745,7 +5765,7 @@
           <w:left w:w="10" w:type="dxa"/>
           <w:right w:w="10" w:type="dxa"/>
         </w:tblCellMar>
-        <w:tblLook w:val="0000" w:firstRow="0" w:lastRow="0" w:firstColumn="0" w:lastColumn="0" w:noHBand="0" w:noVBand="0"/>
+        <w:tblLook w:val="04A0" w:firstRow="1" w:lastRow="0" w:firstColumn="1" w:lastColumn="0" w:noHBand="0" w:noVBand="1"/>
       </w:tblPr>
       <w:tblGrid>
         <w:gridCol w:w="700"/>
@@ -6442,7 +6462,7 @@
         <w:pStyle w:val="Ttulo1"/>
         <w:pageBreakBefore/>
       </w:pPr>
-      <w:bookmarkStart w:id="11" w:name="_Toc240931749"/>
+      <w:bookmarkStart w:id="11" w:name="_Toc240932013"/>
       <w:r>
         <w:lastRenderedPageBreak/>
         <w:t>12. Análisis de causa raíz</w:t>
@@ -6560,7 +6580,7 @@
           <w:noProof/>
         </w:rPr>
         <w:drawing>
-          <wp:inline distT="0" distB="0" distL="0" distR="0" wp14:anchorId="02B0C58E" wp14:editId="52979D72">
+          <wp:inline distT="0" distB="0" distL="0" distR="0" wp14:anchorId="529E20FC" wp14:editId="17644029">
             <wp:extent cx="5524500" cy="3238500"/>
             <wp:effectExtent l="0" t="0" r="0" b="0"/>
             <wp:docPr id="1" name="Imagen 1"/>
@@ -6620,7 +6640,7 @@
         <w:pStyle w:val="Ttulo1"/>
         <w:pageBreakBefore/>
       </w:pPr>
-      <w:bookmarkStart w:id="12" w:name="_Toc240931750"/>
+      <w:bookmarkStart w:id="12" w:name="_Toc240932014"/>
       <w:r>
         <w:lastRenderedPageBreak/>
         <w:t>13. Reportes</w:t>
@@ -6719,7 +6739,7 @@
         <w:pStyle w:val="Ttulo1"/>
         <w:pageBreakBefore/>
       </w:pPr>
-      <w:bookmarkStart w:id="13" w:name="_Toc240931751"/>
+      <w:bookmarkStart w:id="13" w:name="_Toc240932015"/>
       <w:r>
         <w:lastRenderedPageBreak/>
         <w:t>14. Importar desde Excel</w:t>
@@ -6831,7 +6851,7 @@
           <w:left w:w="10" w:type="dxa"/>
           <w:right w:w="10" w:type="dxa"/>
         </w:tblCellMar>
-        <w:tblLook w:val="0000" w:firstRow="0" w:lastRow="0" w:firstColumn="0" w:lastColumn="0" w:noHBand="0" w:noVBand="0"/>
+        <w:tblLook w:val="04A0" w:firstRow="1" w:lastRow="0" w:firstColumn="1" w:lastColumn="0" w:noHBand="0" w:noVBand="1"/>
       </w:tblPr>
       <w:tblGrid>
         <w:gridCol w:w="3300"/>
@@ -7535,7 +7555,7 @@
         <w:pStyle w:val="Ttulo1"/>
         <w:pageBreakBefore/>
       </w:pPr>
-      <w:bookmarkStart w:id="14" w:name="_Toc240931752"/>
+      <w:bookmarkStart w:id="14" w:name="_Toc240932016"/>
       <w:r>
         <w:lastRenderedPageBreak/>
         <w:t>15. Administración de la instalación</w:t>
@@ -7585,7 +7605,7 @@
         <w:t>Crear cuenta:</w:t>
       </w:r>
       <w:r>
-        <w:t xml:space="preserve"> nombre, correo y rol. El sistema genera una contraseña temporal que el usuario cambia en su primer ingreso.</w:t>
+        <w:t xml:space="preserve"> nombre, correo, contraseña inicial (mínimo 10 caracteres) y rol. Entregue la contraseña en persona y pida al usuario que la cambie en su primer ingreso.</w:t>
       </w:r>
     </w:p>
     <w:p>
@@ -7602,30 +7622,20 @@
           <w:b/>
           <w:bCs/>
         </w:rPr>
-        <w:t>Cambiar rol</w:t>
-      </w:r>
-      <w:r>
-        <w:t xml:space="preserve">, </w:t>
+        <w:t>Cambiar el rol</w:t>
+      </w:r>
+      <w:r>
+        <w:t xml:space="preserve"> desde el selector de cada cuenta, o </w:t>
       </w:r>
       <w:r>
         <w:rPr>
           <w:b/>
           <w:bCs/>
         </w:rPr>
-        <w:t>suspender o reactivar el acceso</w:t>
-      </w:r>
-      <w:r>
-        <w:t xml:space="preserve"> y </w:t>
-      </w:r>
-      <w:r>
-        <w:rPr>
-          <w:b/>
-          <w:bCs/>
-        </w:rPr>
-        <w:t>restablecer la contraseña</w:t>
-      </w:r>
-      <w:r>
-        <w:t>.</w:t>
+        <w:t>Deshabilitar</w:t>
+      </w:r>
+      <w:r>
+        <w:t xml:space="preserve"> el acceso. Las cuentas no se borran: el historial de órdenes queda ligado a quien las ejecutó.</w:t>
       </w:r>
     </w:p>
     <w:p>
@@ -7638,6 +7648,19 @@
         <w:spacing w:after="60" w:line="280" w:lineRule="auto"/>
       </w:pPr>
       <w:r>
+        <w:t>Si un usuario olvida su contraseña, el administrador de la plataforma la restablece.</w:t>
+      </w:r>
+    </w:p>
+    <w:p>
+      <w:pPr>
+        <w:pStyle w:val="Prrafodelista"/>
+        <w:numPr>
+          <w:ilvl w:val="0"/>
+          <w:numId w:val="2"/>
+        </w:numPr>
+        <w:spacing w:after="60" w:line="280" w:lineRule="auto"/>
+      </w:pPr>
+      <w:r>
         <w:t>El sistema no permite dejar la instalación sin ningún administrador.</w:t>
       </w:r>
     </w:p>
@@ -7654,7 +7677,7 @@
         <w:spacing w:after="120" w:line="290" w:lineRule="auto"/>
       </w:pPr>
       <w:r>
-        <w:t>Nombre de la instalación, moneda y formato regional (fechas y números).</w:t>
+        <w:t>Nombre de la instalación (aparece en el reporte mensual), moneda, formato regional (fechas y números) y notas. La pantalla muestra una vista previa de cómo se verán montos y fechas.</w:t>
       </w:r>
     </w:p>
     <w:p>
@@ -7672,6 +7695,27 @@
           <w:bCs/>
           <w:color w:val="8A5A00"/>
         </w:rPr>
+        <w:t xml:space="preserve">Moneda.  </w:t>
+      </w:r>
+      <w:r>
+        <w:t>Cambiar la moneda cambia el formato de los montos, no los convierte: un costo de 1.500.000 sigue siendo 1.500.000 con el nuevo símbolo.</w:t>
+      </w:r>
+    </w:p>
+    <w:p>
+      <w:pPr>
+        <w:pBdr>
+          <w:left w:val="single" w:sz="18" w:space="8" w:color="E0A030"/>
+        </w:pBdr>
+        <w:shd w:val="clear" w:color="auto" w:fill="FFF4E0"/>
+        <w:spacing w:before="120" w:after="160" w:line="280" w:lineRule="auto"/>
+        <w:ind w:left="120" w:right="120"/>
+      </w:pPr>
+      <w:r>
+        <w:rPr>
+          <w:b/>
+          <w:bCs/>
+          <w:color w:val="8A5A00"/>
+        </w:rPr>
         <w:t xml:space="preserve">Nuevas instalaciones.  </w:t>
       </w:r>
       <w:r>
@@ -7683,7 +7727,7 @@
         <w:pStyle w:val="Ttulo1"/>
         <w:pageBreakBefore/>
       </w:pPr>
-      <w:bookmarkStart w:id="15" w:name="_Toc240931753"/>
+      <w:bookmarkStart w:id="15" w:name="_Toc240932017"/>
       <w:r>
         <w:lastRenderedPageBreak/>
         <w:t>16. Trazabilidad e historial</w:t>
@@ -7723,7 +7767,7 @@
           <w:left w:w="10" w:type="dxa"/>
           <w:right w:w="10" w:type="dxa"/>
         </w:tblCellMar>
-        <w:tblLook w:val="0000" w:firstRow="0" w:lastRow="0" w:firstColumn="0" w:lastColumn="0" w:noHBand="0" w:noVBand="0"/>
+        <w:tblLook w:val="04A0" w:firstRow="1" w:lastRow="0" w:firstColumn="1" w:lastColumn="0" w:noHBand="0" w:noVBand="1"/>
       </w:tblPr>
       <w:tblGrid>
         <w:gridCol w:w="3300"/>
@@ -8183,7 +8227,7 @@
         <w:pStyle w:val="Ttulo1"/>
         <w:pageBreakBefore/>
       </w:pPr>
-      <w:bookmarkStart w:id="16" w:name="_Toc240931754"/>
+      <w:bookmarkStart w:id="16" w:name="_Toc240932018"/>
       <w:r>
         <w:lastRenderedPageBreak/>
         <w:t>17. Preguntas frecuentes</w:t>
@@ -8311,7 +8355,7 @@
         <w:pStyle w:val="Ttulo1"/>
         <w:pageBreakBefore/>
       </w:pPr>
-      <w:bookmarkStart w:id="17" w:name="_Toc240931755"/>
+      <w:bookmarkStart w:id="17" w:name="_Toc240932019"/>
       <w:r>
         <w:lastRenderedPageBreak/>
         <w:t>18. Glosario</w:t>
@@ -8333,7 +8377,7 @@
           <w:left w:w="10" w:type="dxa"/>
           <w:right w:w="10" w:type="dxa"/>
         </w:tblCellMar>
-        <w:tblLook w:val="0000" w:firstRow="0" w:lastRow="0" w:firstColumn="0" w:lastColumn="0" w:noHBand="0" w:noVBand="0"/>
+        <w:tblLook w:val="04A0" w:firstRow="1" w:lastRow="0" w:firstColumn="1" w:lastColumn="0" w:noHBand="0" w:noVBand="1"/>
       </w:tblPr>
       <w:tblGrid>
         <w:gridCol w:w="2300"/>
@@ -9593,10 +9637,10 @@
 <file path=word/numbering.xml><?xml version="1.0" encoding="utf-8"?>
 <w:numbering xmlns:wpc="http://schemas.microsoft.com/office/word/2010/wordprocessingCanvas" xmlns:cx="http://schemas.microsoft.com/office/drawing/2014/chartex" xmlns:cx1="http://schemas.microsoft.com/office/drawing/2015/9/8/chartex" xmlns:cx2="http://schemas.microsoft.com/office/drawing/2015/10/21/chartex" xmlns:cx3="http://schemas.microsoft.com/office/drawing/2016/5/9/chartex" xmlns:cx4="http://schemas.microsoft.com/office/drawing/2016/5/10/chartex" xmlns:cx5="http://schemas.microsoft.com/office/drawing/2016/5/11/chartex" xmlns:cx6="http://schemas.microsoft.com/office/drawing/2016/5/12/chartex" xmlns:cx7="http://schemas.microsoft.com/office/drawing/2016/5/13/chartex" xmlns:cx8="http://schemas.microsoft.com/office/drawing/2016/5/14/chartex" xmlns:mc="http://schemas.openxmlformats.org/markup-compatibility/2006" xmlns:aink="http://schemas.microsoft.com/office/drawing/2016/ink" xmlns:am3d="http://schemas.microsoft.com/office/drawing/2017/model3d" xmlns:o="urn:schemas-microsoft-com:office:office" xmlns:oel="http://schemas.microsoft.com/office/2019/extlst" xmlns:r="http://schemas.openxmlformats.org/officeDocument/2006/relationships" xmlns:m="http://schemas.openxmlformats.org/officeDocument/2006/math" xmlns:v="urn:schemas-microsoft-com:vml" xmlns:wp14="http://schemas.microsoft.com/office/word/2010/wordprocessingDrawing" xmlns:wp="http://schemas.openxmlformats.org/drawingml/2006/wordprocessingDrawing" xmlns:w10="urn:schemas-microsoft-com:office:word" xmlns:w="http://schemas.openxmlformats.org/wordprocessingml/2006/main" xmlns:w14="http://schemas.microsoft.com/office/word/2010/wordml" xmlns:w15="http://schemas.microsoft.com/office/word/2012/wordml" xmlns:w16cex="http://schemas.microsoft.com/office/word/2018/wordml/cex" xmlns:w16cid="http://schemas.microsoft.com/office/word/2016/wordml/cid" xmlns:w16="http://schemas.microsoft.com/office/word/2018/wordml" xmlns:w16du="http://schemas.microsoft.com/office/word/2023/wordml/word16du" xmlns:w16sdtdh="http://schemas.microsoft.com/office/word/2020/wordml/sdtdatahash" xmlns:w16sdtfl="http://schemas.microsoft.com/office/word/2024/wordml/sdtformatlock" xmlns:w16se="http://schemas.microsoft.com/office/word/2015/wordml/symex" xmlns:wpg="http://schemas.microsoft.com/office/word/2010/wordprocessingGroup" xmlns:wpi="http://schemas.microsoft.com/office/word/2010/wordprocessingInk" xmlns:wne="http://schemas.microsoft.com/office/word/2006/wordml" xmlns:wps="http://schemas.microsoft.com/office/word/2010/wordprocessingShape" mc:Ignorable="w14 w15 w16se w16cid w16 w16cex w16sdtdh w16sdtfl w16du wp14">
   <w:abstractNum w:abstractNumId="0" w15:restartNumberingAfterBreak="0">
-    <w:nsid w:val="0BEE4940"/>
+    <w:nsid w:val="00351B14"/>
     <w:multiLevelType w:val="hybridMultilevel"/>
-    <w:tmpl w:val="AAD05D46"/>
-    <w:lvl w:ilvl="0" w:tplc="E1DC6EE4">
+    <w:tmpl w:val="21F2CC80"/>
+    <w:lvl w:ilvl="0" w:tplc="D26AE39C">
       <w:start w:val="1"/>
       <w:numFmt w:val="decimal"/>
       <w:lvlText w:val="%1."/>
@@ -9605,196 +9649,106 @@
         <w:ind w:left="460" w:hanging="320"/>
       </w:pPr>
     </w:lvl>
-    <w:lvl w:ilvl="1" w:tplc="7C4C0B32">
+    <w:lvl w:ilvl="1" w:tplc="7E004540">
       <w:numFmt w:val="decimal"/>
       <w:lvlText w:val=""/>
       <w:lvlJc w:val="left"/>
     </w:lvl>
-    <w:lvl w:ilvl="2" w:tplc="D1820812">
+    <w:lvl w:ilvl="2" w:tplc="381E6156">
       <w:numFmt w:val="decimal"/>
       <w:lvlText w:val=""/>
       <w:lvlJc w:val="left"/>
     </w:lvl>
-    <w:lvl w:ilvl="3" w:tplc="DCA05F18">
+    <w:lvl w:ilvl="3" w:tplc="888CEE6A">
       <w:numFmt w:val="decimal"/>
       <w:lvlText w:val=""/>
       <w:lvlJc w:val="left"/>
     </w:lvl>
-    <w:lvl w:ilvl="4" w:tplc="72F219AA">
+    <w:lvl w:ilvl="4" w:tplc="1A3275BE">
       <w:numFmt w:val="decimal"/>
       <w:lvlText w:val=""/>
       <w:lvlJc w:val="left"/>
     </w:lvl>
-    <w:lvl w:ilvl="5" w:tplc="F978FE7E">
+    <w:lvl w:ilvl="5" w:tplc="5D8E9682">
       <w:numFmt w:val="decimal"/>
       <w:lvlText w:val=""/>
       <w:lvlJc w:val="left"/>
     </w:lvl>
-    <w:lvl w:ilvl="6" w:tplc="AD4CBCCC">
+    <w:lvl w:ilvl="6" w:tplc="6B2008E4">
       <w:numFmt w:val="decimal"/>
       <w:lvlText w:val=""/>
       <w:lvlJc w:val="left"/>
     </w:lvl>
-    <w:lvl w:ilvl="7" w:tplc="859AE3CE">
+    <w:lvl w:ilvl="7" w:tplc="612EB5D0">
       <w:numFmt w:val="decimal"/>
       <w:lvlText w:val=""/>
       <w:lvlJc w:val="left"/>
     </w:lvl>
-    <w:lvl w:ilvl="8" w:tplc="D90AD262">
+    <w:lvl w:ilvl="8" w:tplc="79A4F6B8">
       <w:numFmt w:val="decimal"/>
       <w:lvlText w:val=""/>
       <w:lvlJc w:val="left"/>
     </w:lvl>
   </w:abstractNum>
   <w:abstractNum w:abstractNumId="1" w15:restartNumberingAfterBreak="0">
-    <w:nsid w:val="391D4E5D"/>
+    <w:nsid w:val="130A1153"/>
     <w:multiLevelType w:val="hybridMultilevel"/>
-    <w:tmpl w:val="FC9A576C"/>
-    <w:lvl w:ilvl="0" w:tplc="31CEF67A">
+    <w:tmpl w:val="A77CAECE"/>
+    <w:lvl w:ilvl="0" w:tplc="93884FF6">
       <w:start w:val="1"/>
-      <w:numFmt w:val="bullet"/>
-      <w:lvlText w:val="•"/>
+      <w:numFmt w:val="decimal"/>
+      <w:lvlText w:val="%1."/>
       <w:lvlJc w:val="left"/>
       <w:pPr>
-        <w:ind w:left="460" w:hanging="280"/>
+        <w:ind w:left="460" w:hanging="320"/>
       </w:pPr>
     </w:lvl>
-    <w:lvl w:ilvl="1" w:tplc="6E0E9746">
-      <w:start w:val="1"/>
-      <w:numFmt w:val="bullet"/>
-      <w:lvlText w:val="–"/>
-      <w:lvlJc w:val="left"/>
-      <w:pPr>
-        <w:ind w:left="900" w:hanging="280"/>
-      </w:pPr>
-    </w:lvl>
-    <w:lvl w:ilvl="2" w:tplc="DA50A84E">
+    <w:lvl w:ilvl="1" w:tplc="E986571E">
       <w:numFmt w:val="decimal"/>
       <w:lvlText w:val=""/>
       <w:lvlJc w:val="left"/>
     </w:lvl>
-    <w:lvl w:ilvl="3" w:tplc="671AA8AE">
+    <w:lvl w:ilvl="2" w:tplc="A6163E4C">
       <w:numFmt w:val="decimal"/>
       <w:lvlText w:val=""/>
       <w:lvlJc w:val="left"/>
     </w:lvl>
-    <w:lvl w:ilvl="4" w:tplc="A57E4028">
+    <w:lvl w:ilvl="3" w:tplc="3DBCBEFC">
       <w:numFmt w:val="decimal"/>
       <w:lvlText w:val=""/>
       <w:lvlJc w:val="left"/>
     </w:lvl>
-    <w:lvl w:ilvl="5" w:tplc="AFAE1720">
+    <w:lvl w:ilvl="4" w:tplc="5BE27CA4">
       <w:numFmt w:val="decimal"/>
       <w:lvlText w:val=""/>
       <w:lvlJc w:val="left"/>
     </w:lvl>
-    <w:lvl w:ilvl="6" w:tplc="A6EC308C">
+    <w:lvl w:ilvl="5" w:tplc="22686498">
       <w:numFmt w:val="decimal"/>
       <w:lvlText w:val=""/>
       <w:lvlJc w:val="left"/>
     </w:lvl>
-    <w:lvl w:ilvl="7" w:tplc="CC4637EA">
+    <w:lvl w:ilvl="6" w:tplc="7400B1CE">
       <w:numFmt w:val="decimal"/>
       <w:lvlText w:val=""/>
       <w:lvlJc w:val="left"/>
     </w:lvl>
-    <w:lvl w:ilvl="8" w:tplc="6FE0888C">
+    <w:lvl w:ilvl="7" w:tplc="AA8EB8F4">
+      <w:numFmt w:val="decimal"/>
+      <w:lvlText w:val=""/>
+      <w:lvlJc w:val="left"/>
+    </w:lvl>
+    <w:lvl w:ilvl="8" w:tplc="12769434">
       <w:numFmt w:val="decimal"/>
       <w:lvlText w:val=""/>
       <w:lvlJc w:val="left"/>
     </w:lvl>
   </w:abstractNum>
   <w:abstractNum w:abstractNumId="2" w15:restartNumberingAfterBreak="0">
-    <w:nsid w:val="60597727"/>
+    <w:nsid w:val="142579F4"/>
     <w:multiLevelType w:val="hybridMultilevel"/>
-    <w:tmpl w:val="DB804C70"/>
-    <w:lvl w:ilvl="0" w:tplc="F6B89A32">
-      <w:start w:val="1"/>
-      <w:numFmt w:val="bullet"/>
-      <w:lvlText w:val="●"/>
-      <w:lvlJc w:val="left"/>
-      <w:pPr>
-        <w:ind w:left="720" w:hanging="360"/>
-      </w:pPr>
-    </w:lvl>
-    <w:lvl w:ilvl="1" w:tplc="F1B2DBC8">
-      <w:start w:val="1"/>
-      <w:numFmt w:val="bullet"/>
-      <w:lvlText w:val="○"/>
-      <w:lvlJc w:val="left"/>
-      <w:pPr>
-        <w:ind w:left="1440" w:hanging="360"/>
-      </w:pPr>
-    </w:lvl>
-    <w:lvl w:ilvl="2" w:tplc="19AC62DE">
-      <w:start w:val="1"/>
-      <w:numFmt w:val="bullet"/>
-      <w:lvlText w:val="■"/>
-      <w:lvlJc w:val="left"/>
-      <w:pPr>
-        <w:ind w:left="2160" w:hanging="360"/>
-      </w:pPr>
-    </w:lvl>
-    <w:lvl w:ilvl="3" w:tplc="37401B50">
-      <w:start w:val="1"/>
-      <w:numFmt w:val="bullet"/>
-      <w:lvlText w:val="●"/>
-      <w:lvlJc w:val="left"/>
-      <w:pPr>
-        <w:ind w:left="2880" w:hanging="360"/>
-      </w:pPr>
-    </w:lvl>
-    <w:lvl w:ilvl="4" w:tplc="456243EA">
-      <w:start w:val="1"/>
-      <w:numFmt w:val="bullet"/>
-      <w:lvlText w:val="○"/>
-      <w:lvlJc w:val="left"/>
-      <w:pPr>
-        <w:ind w:left="3600" w:hanging="360"/>
-      </w:pPr>
-    </w:lvl>
-    <w:lvl w:ilvl="5" w:tplc="B42453FC">
-      <w:start w:val="1"/>
-      <w:numFmt w:val="bullet"/>
-      <w:lvlText w:val="■"/>
-      <w:lvlJc w:val="left"/>
-      <w:pPr>
-        <w:ind w:left="4320" w:hanging="360"/>
-      </w:pPr>
-    </w:lvl>
-    <w:lvl w:ilvl="6" w:tplc="6F268150">
-      <w:start w:val="1"/>
-      <w:numFmt w:val="bullet"/>
-      <w:lvlText w:val="●"/>
-      <w:lvlJc w:val="left"/>
-      <w:pPr>
-        <w:ind w:left="5040" w:hanging="360"/>
-      </w:pPr>
-    </w:lvl>
-    <w:lvl w:ilvl="7" w:tplc="3E6E56EC">
-      <w:start w:val="1"/>
-      <w:numFmt w:val="bullet"/>
-      <w:lvlText w:val="●"/>
-      <w:lvlJc w:val="left"/>
-      <w:pPr>
-        <w:ind w:left="5760" w:hanging="360"/>
-      </w:pPr>
-    </w:lvl>
-    <w:lvl w:ilvl="8" w:tplc="077CA0E6">
-      <w:start w:val="1"/>
-      <w:numFmt w:val="bullet"/>
-      <w:lvlText w:val="●"/>
-      <w:lvlJc w:val="left"/>
-      <w:pPr>
-        <w:ind w:left="6480" w:hanging="360"/>
-      </w:pPr>
-    </w:lvl>
-  </w:abstractNum>
-  <w:abstractNum w:abstractNumId="3" w15:restartNumberingAfterBreak="0">
-    <w:nsid w:val="699E164B"/>
-    <w:multiLevelType w:val="hybridMultilevel"/>
-    <w:tmpl w:val="F8E64D00"/>
-    <w:lvl w:ilvl="0" w:tplc="6A523C74">
+    <w:tmpl w:val="90B4D308"/>
+    <w:lvl w:ilvl="0" w:tplc="62B67114">
       <w:start w:val="1"/>
       <w:numFmt w:val="decimal"/>
       <w:lvlText w:val="%1."/>
@@ -9803,52 +9757,138 @@
         <w:ind w:left="460" w:hanging="320"/>
       </w:pPr>
     </w:lvl>
-    <w:lvl w:ilvl="1" w:tplc="9DD80786">
+    <w:lvl w:ilvl="1" w:tplc="A6AA6022">
       <w:numFmt w:val="decimal"/>
       <w:lvlText w:val=""/>
       <w:lvlJc w:val="left"/>
     </w:lvl>
-    <w:lvl w:ilvl="2" w:tplc="0CB4A2CC">
+    <w:lvl w:ilvl="2" w:tplc="774622AA">
       <w:numFmt w:val="decimal"/>
       <w:lvlText w:val=""/>
       <w:lvlJc w:val="left"/>
     </w:lvl>
-    <w:lvl w:ilvl="3" w:tplc="09205C1A">
+    <w:lvl w:ilvl="3" w:tplc="5B623E84">
       <w:numFmt w:val="decimal"/>
       <w:lvlText w:val=""/>
       <w:lvlJc w:val="left"/>
     </w:lvl>
-    <w:lvl w:ilvl="4" w:tplc="EEC6BF04">
+    <w:lvl w:ilvl="4" w:tplc="AF7EF25C">
       <w:numFmt w:val="decimal"/>
       <w:lvlText w:val=""/>
       <w:lvlJc w:val="left"/>
     </w:lvl>
-    <w:lvl w:ilvl="5" w:tplc="90246312">
+    <w:lvl w:ilvl="5" w:tplc="63F08454">
       <w:numFmt w:val="decimal"/>
       <w:lvlText w:val=""/>
       <w:lvlJc w:val="left"/>
     </w:lvl>
-    <w:lvl w:ilvl="6" w:tplc="3D125F46">
+    <w:lvl w:ilvl="6" w:tplc="F6D4DE0C">
       <w:numFmt w:val="decimal"/>
       <w:lvlText w:val=""/>
       <w:lvlJc w:val="left"/>
     </w:lvl>
-    <w:lvl w:ilvl="7" w:tplc="582AC748">
+    <w:lvl w:ilvl="7" w:tplc="2098DE8C">
       <w:numFmt w:val="decimal"/>
       <w:lvlText w:val=""/>
       <w:lvlJc w:val="left"/>
     </w:lvl>
-    <w:lvl w:ilvl="8" w:tplc="9424AD80">
+    <w:lvl w:ilvl="8" w:tplc="5E6CD690">
       <w:numFmt w:val="decimal"/>
       <w:lvlText w:val=""/>
       <w:lvlJc w:val="left"/>
     </w:lvl>
   </w:abstractNum>
+  <w:abstractNum w:abstractNumId="3" w15:restartNumberingAfterBreak="0">
+    <w:nsid w:val="19F4672D"/>
+    <w:multiLevelType w:val="hybridMultilevel"/>
+    <w:tmpl w:val="4A16B048"/>
+    <w:lvl w:ilvl="0" w:tplc="2BD01CCE">
+      <w:start w:val="1"/>
+      <w:numFmt w:val="bullet"/>
+      <w:lvlText w:val="●"/>
+      <w:lvlJc w:val="left"/>
+      <w:pPr>
+        <w:ind w:left="720" w:hanging="360"/>
+      </w:pPr>
+    </w:lvl>
+    <w:lvl w:ilvl="1" w:tplc="5B36953A">
+      <w:start w:val="1"/>
+      <w:numFmt w:val="bullet"/>
+      <w:lvlText w:val="○"/>
+      <w:lvlJc w:val="left"/>
+      <w:pPr>
+        <w:ind w:left="1440" w:hanging="360"/>
+      </w:pPr>
+    </w:lvl>
+    <w:lvl w:ilvl="2" w:tplc="63CC065E">
+      <w:start w:val="1"/>
+      <w:numFmt w:val="bullet"/>
+      <w:lvlText w:val="■"/>
+      <w:lvlJc w:val="left"/>
+      <w:pPr>
+        <w:ind w:left="2160" w:hanging="360"/>
+      </w:pPr>
+    </w:lvl>
+    <w:lvl w:ilvl="3" w:tplc="AD30A83A">
+      <w:start w:val="1"/>
+      <w:numFmt w:val="bullet"/>
+      <w:lvlText w:val="●"/>
+      <w:lvlJc w:val="left"/>
+      <w:pPr>
+        <w:ind w:left="2880" w:hanging="360"/>
+      </w:pPr>
+    </w:lvl>
+    <w:lvl w:ilvl="4" w:tplc="22427F18">
+      <w:start w:val="1"/>
+      <w:numFmt w:val="bullet"/>
+      <w:lvlText w:val="○"/>
+      <w:lvlJc w:val="left"/>
+      <w:pPr>
+        <w:ind w:left="3600" w:hanging="360"/>
+      </w:pPr>
+    </w:lvl>
+    <w:lvl w:ilvl="5" w:tplc="57FA7112">
+      <w:start w:val="1"/>
+      <w:numFmt w:val="bullet"/>
+      <w:lvlText w:val="■"/>
+      <w:lvlJc w:val="left"/>
+      <w:pPr>
+        <w:ind w:left="4320" w:hanging="360"/>
+      </w:pPr>
+    </w:lvl>
+    <w:lvl w:ilvl="6" w:tplc="218E9BE0">
+      <w:start w:val="1"/>
+      <w:numFmt w:val="bullet"/>
+      <w:lvlText w:val="●"/>
+      <w:lvlJc w:val="left"/>
+      <w:pPr>
+        <w:ind w:left="5040" w:hanging="360"/>
+      </w:pPr>
+    </w:lvl>
+    <w:lvl w:ilvl="7" w:tplc="5396047A">
+      <w:start w:val="1"/>
+      <w:numFmt w:val="bullet"/>
+      <w:lvlText w:val="●"/>
+      <w:lvlJc w:val="left"/>
+      <w:pPr>
+        <w:ind w:left="5760" w:hanging="360"/>
+      </w:pPr>
+    </w:lvl>
+    <w:lvl w:ilvl="8" w:tplc="0EA4F39E">
+      <w:start w:val="1"/>
+      <w:numFmt w:val="bullet"/>
+      <w:lvlText w:val="●"/>
+      <w:lvlJc w:val="left"/>
+      <w:pPr>
+        <w:ind w:left="6480" w:hanging="360"/>
+      </w:pPr>
+    </w:lvl>
+  </w:abstractNum>
   <w:abstractNum w:abstractNumId="4" w15:restartNumberingAfterBreak="0">
-    <w:nsid w:val="6E5D42B4"/>
+    <w:nsid w:val="218A60EB"/>
     <w:multiLevelType w:val="hybridMultilevel"/>
-    <w:tmpl w:val="6226B758"/>
-    <w:lvl w:ilvl="0" w:tplc="3FE81A7C">
+    <w:tmpl w:val="9F5612D2"/>
+    <w:lvl w:ilvl="0" w:tplc="40DCB584">
       <w:start w:val="1"/>
       <w:numFmt w:val="decimal"/>
       <w:lvlText w:val="%1."/>
@@ -9857,52 +9897,52 @@
         <w:ind w:left="460" w:hanging="320"/>
       </w:pPr>
     </w:lvl>
-    <w:lvl w:ilvl="1" w:tplc="6D90CDFE">
+    <w:lvl w:ilvl="1" w:tplc="0DBC5F44">
       <w:numFmt w:val="decimal"/>
       <w:lvlText w:val=""/>
       <w:lvlJc w:val="left"/>
     </w:lvl>
-    <w:lvl w:ilvl="2" w:tplc="1D247898">
+    <w:lvl w:ilvl="2" w:tplc="50648BFA">
       <w:numFmt w:val="decimal"/>
       <w:lvlText w:val=""/>
       <w:lvlJc w:val="left"/>
     </w:lvl>
-    <w:lvl w:ilvl="3" w:tplc="E7403FC8">
+    <w:lvl w:ilvl="3" w:tplc="98625964">
       <w:numFmt w:val="decimal"/>
       <w:lvlText w:val=""/>
       <w:lvlJc w:val="left"/>
     </w:lvl>
-    <w:lvl w:ilvl="4" w:tplc="3C364BF0">
+    <w:lvl w:ilvl="4" w:tplc="AFDE5876">
       <w:numFmt w:val="decimal"/>
       <w:lvlText w:val=""/>
       <w:lvlJc w:val="left"/>
     </w:lvl>
-    <w:lvl w:ilvl="5" w:tplc="8CDC47F4">
+    <w:lvl w:ilvl="5" w:tplc="37866CB8">
       <w:numFmt w:val="decimal"/>
       <w:lvlText w:val=""/>
       <w:lvlJc w:val="left"/>
     </w:lvl>
-    <w:lvl w:ilvl="6" w:tplc="A86261D2">
+    <w:lvl w:ilvl="6" w:tplc="2966A212">
       <w:numFmt w:val="decimal"/>
       <w:lvlText w:val=""/>
       <w:lvlJc w:val="left"/>
     </w:lvl>
-    <w:lvl w:ilvl="7" w:tplc="16D65C40">
+    <w:lvl w:ilvl="7" w:tplc="20AE3E6C">
       <w:numFmt w:val="decimal"/>
       <w:lvlText w:val=""/>
       <w:lvlJc w:val="left"/>
     </w:lvl>
-    <w:lvl w:ilvl="8" w:tplc="8DA470EC">
+    <w:lvl w:ilvl="8" w:tplc="42FE687E">
       <w:numFmt w:val="decimal"/>
       <w:lvlText w:val=""/>
       <w:lvlJc w:val="left"/>
     </w:lvl>
   </w:abstractNum>
   <w:abstractNum w:abstractNumId="5" w15:restartNumberingAfterBreak="0">
-    <w:nsid w:val="73D744AB"/>
+    <w:nsid w:val="2E790F10"/>
     <w:multiLevelType w:val="hybridMultilevel"/>
-    <w:tmpl w:val="10CEF5E2"/>
-    <w:lvl w:ilvl="0" w:tplc="773C9CD4">
+    <w:tmpl w:val="3BE4F5FC"/>
+    <w:lvl w:ilvl="0" w:tplc="76180418">
       <w:start w:val="1"/>
       <w:numFmt w:val="decimal"/>
       <w:lvlText w:val="%1."/>
@@ -9911,106 +9951,110 @@
         <w:ind w:left="460" w:hanging="320"/>
       </w:pPr>
     </w:lvl>
-    <w:lvl w:ilvl="1" w:tplc="E3C488BC">
+    <w:lvl w:ilvl="1" w:tplc="8B886D76">
       <w:numFmt w:val="decimal"/>
       <w:lvlText w:val=""/>
       <w:lvlJc w:val="left"/>
     </w:lvl>
-    <w:lvl w:ilvl="2" w:tplc="19F633AA">
+    <w:lvl w:ilvl="2" w:tplc="B3289606">
       <w:numFmt w:val="decimal"/>
       <w:lvlText w:val=""/>
       <w:lvlJc w:val="left"/>
     </w:lvl>
-    <w:lvl w:ilvl="3" w:tplc="62F2457A">
+    <w:lvl w:ilvl="3" w:tplc="FA6CAEF4">
       <w:numFmt w:val="decimal"/>
       <w:lvlText w:val=""/>
       <w:lvlJc w:val="left"/>
     </w:lvl>
-    <w:lvl w:ilvl="4" w:tplc="EC227400">
+    <w:lvl w:ilvl="4" w:tplc="3BEC5770">
       <w:numFmt w:val="decimal"/>
       <w:lvlText w:val=""/>
       <w:lvlJc w:val="left"/>
     </w:lvl>
-    <w:lvl w:ilvl="5" w:tplc="AEA46A42">
+    <w:lvl w:ilvl="5" w:tplc="ED100654">
       <w:numFmt w:val="decimal"/>
       <w:lvlText w:val=""/>
       <w:lvlJc w:val="left"/>
     </w:lvl>
-    <w:lvl w:ilvl="6" w:tplc="F9AA7996">
+    <w:lvl w:ilvl="6" w:tplc="2C46EADE">
       <w:numFmt w:val="decimal"/>
       <w:lvlText w:val=""/>
       <w:lvlJc w:val="left"/>
     </w:lvl>
-    <w:lvl w:ilvl="7" w:tplc="DFD0C53E">
+    <w:lvl w:ilvl="7" w:tplc="0AD012D2">
       <w:numFmt w:val="decimal"/>
       <w:lvlText w:val=""/>
       <w:lvlJc w:val="left"/>
     </w:lvl>
-    <w:lvl w:ilvl="8" w:tplc="50C61D48">
+    <w:lvl w:ilvl="8" w:tplc="43C0738E">
       <w:numFmt w:val="decimal"/>
       <w:lvlText w:val=""/>
       <w:lvlJc w:val="left"/>
     </w:lvl>
   </w:abstractNum>
   <w:abstractNum w:abstractNumId="6" w15:restartNumberingAfterBreak="0">
-    <w:nsid w:val="75174180"/>
+    <w:nsid w:val="3B671172"/>
     <w:multiLevelType w:val="hybridMultilevel"/>
-    <w:tmpl w:val="36387A08"/>
-    <w:lvl w:ilvl="0" w:tplc="2424E070">
+    <w:tmpl w:val="10141B78"/>
+    <w:lvl w:ilvl="0" w:tplc="4342AC82">
       <w:start w:val="1"/>
-      <w:numFmt w:val="decimal"/>
-      <w:lvlText w:val="%1."/>
+      <w:numFmt w:val="bullet"/>
+      <w:lvlText w:val="•"/>
       <w:lvlJc w:val="left"/>
       <w:pPr>
-        <w:ind w:left="460" w:hanging="320"/>
+        <w:ind w:left="460" w:hanging="280"/>
       </w:pPr>
     </w:lvl>
-    <w:lvl w:ilvl="1" w:tplc="AE3E1A5A">
+    <w:lvl w:ilvl="1" w:tplc="73F85752">
+      <w:start w:val="1"/>
+      <w:numFmt w:val="bullet"/>
+      <w:lvlText w:val="–"/>
+      <w:lvlJc w:val="left"/>
+      <w:pPr>
+        <w:ind w:left="900" w:hanging="280"/>
+      </w:pPr>
+    </w:lvl>
+    <w:lvl w:ilvl="2" w:tplc="64324824">
       <w:numFmt w:val="decimal"/>
       <w:lvlText w:val=""/>
       <w:lvlJc w:val="left"/>
     </w:lvl>
-    <w:lvl w:ilvl="2" w:tplc="714E44DE">
+    <w:lvl w:ilvl="3" w:tplc="FF8AE872">
       <w:numFmt w:val="decimal"/>
       <w:lvlText w:val=""/>
       <w:lvlJc w:val="left"/>
     </w:lvl>
-    <w:lvl w:ilvl="3" w:tplc="8D683960">
+    <w:lvl w:ilvl="4" w:tplc="1AA0C9A8">
       <w:numFmt w:val="decimal"/>
       <w:lvlText w:val=""/>
       <w:lvlJc w:val="left"/>
     </w:lvl>
-    <w:lvl w:ilvl="4" w:tplc="A6069DA6">
+    <w:lvl w:ilvl="5" w:tplc="D0B2F248">
       <w:numFmt w:val="decimal"/>
       <w:lvlText w:val=""/>
       <w:lvlJc w:val="left"/>
     </w:lvl>
-    <w:lvl w:ilvl="5" w:tplc="74F2EC36">
+    <w:lvl w:ilvl="6" w:tplc="4252D4E4">
       <w:numFmt w:val="decimal"/>
       <w:lvlText w:val=""/>
       <w:lvlJc w:val="left"/>
     </w:lvl>
-    <w:lvl w:ilvl="6" w:tplc="6DE8FCA0">
+    <w:lvl w:ilvl="7" w:tplc="B34AC3BA">
       <w:numFmt w:val="decimal"/>
       <w:lvlText w:val=""/>
       <w:lvlJc w:val="left"/>
     </w:lvl>
-    <w:lvl w:ilvl="7" w:tplc="18D29806">
-      <w:numFmt w:val="decimal"/>
-      <w:lvlText w:val=""/>
-      <w:lvlJc w:val="left"/>
-    </w:lvl>
-    <w:lvl w:ilvl="8" w:tplc="84424A52">
+    <w:lvl w:ilvl="8" w:tplc="38B4C05E">
       <w:numFmt w:val="decimal"/>
       <w:lvlText w:val=""/>
       <w:lvlJc w:val="left"/>
     </w:lvl>
   </w:abstractNum>
   <w:abstractNum w:abstractNumId="7" w15:restartNumberingAfterBreak="0">
-    <w:nsid w:val="764F7628"/>
+    <w:nsid w:val="48355848"/>
     <w:multiLevelType w:val="hybridMultilevel"/>
-    <w:tmpl w:val="6C72CF2E"/>
-    <w:lvl w:ilvl="0" w:tplc="95EE4954">
+    <w:tmpl w:val="F1A28CA8"/>
+    <w:lvl w:ilvl="0" w:tplc="75CEE13C">
       <w:start w:val="1"/>
       <w:numFmt w:val="decimal"/>
       <w:lvlText w:val="%1."/>
@@ -10019,52 +10063,52 @@
         <w:ind w:left="460" w:hanging="320"/>
       </w:pPr>
     </w:lvl>
-    <w:lvl w:ilvl="1" w:tplc="74F43D34">
+    <w:lvl w:ilvl="1" w:tplc="5C96502E">
       <w:numFmt w:val="decimal"/>
       <w:lvlText w:val=""/>
       <w:lvlJc w:val="left"/>
     </w:lvl>
-    <w:lvl w:ilvl="2" w:tplc="7354E6A8">
+    <w:lvl w:ilvl="2" w:tplc="7DE8C300">
       <w:numFmt w:val="decimal"/>
       <w:lvlText w:val=""/>
       <w:lvlJc w:val="left"/>
     </w:lvl>
-    <w:lvl w:ilvl="3" w:tplc="6080A4C0">
+    <w:lvl w:ilvl="3" w:tplc="8BBAF8FC">
       <w:numFmt w:val="decimal"/>
       <w:lvlText w:val=""/>
       <w:lvlJc w:val="left"/>
     </w:lvl>
-    <w:lvl w:ilvl="4" w:tplc="CA48ACFA">
+    <w:lvl w:ilvl="4" w:tplc="622223B6">
       <w:numFmt w:val="decimal"/>
       <w:lvlText w:val=""/>
       <w:lvlJc w:val="left"/>
     </w:lvl>
-    <w:lvl w:ilvl="5" w:tplc="8F901476">
+    <w:lvl w:ilvl="5" w:tplc="55D2C204">
       <w:numFmt w:val="decimal"/>
       <w:lvlText w:val=""/>
       <w:lvlJc w:val="left"/>
     </w:lvl>
-    <w:lvl w:ilvl="6" w:tplc="47E6BBF2">
+    <w:lvl w:ilvl="6" w:tplc="A2FAF270">
       <w:numFmt w:val="decimal"/>
       <w:lvlText w:val=""/>
       <w:lvlJc w:val="left"/>
     </w:lvl>
-    <w:lvl w:ilvl="7" w:tplc="DCBE2248">
+    <w:lvl w:ilvl="7" w:tplc="4E92C754">
       <w:numFmt w:val="decimal"/>
       <w:lvlText w:val=""/>
       <w:lvlJc w:val="left"/>
     </w:lvl>
-    <w:lvl w:ilvl="8" w:tplc="960004AC">
+    <w:lvl w:ilvl="8" w:tplc="5FEE914C">
       <w:numFmt w:val="decimal"/>
       <w:lvlText w:val=""/>
       <w:lvlJc w:val="left"/>
     </w:lvl>
   </w:abstractNum>
   <w:abstractNum w:abstractNumId="8" w15:restartNumberingAfterBreak="0">
-    <w:nsid w:val="7CF92D14"/>
+    <w:nsid w:val="4BA40AE5"/>
     <w:multiLevelType w:val="hybridMultilevel"/>
-    <w:tmpl w:val="4B72DAB8"/>
-    <w:lvl w:ilvl="0" w:tplc="4CA6F23A">
+    <w:tmpl w:val="3260D35A"/>
+    <w:lvl w:ilvl="0" w:tplc="9D58DB02">
       <w:start w:val="1"/>
       <w:numFmt w:val="decimal"/>
       <w:lvlText w:val="%1."/>
@@ -10073,52 +10117,52 @@
         <w:ind w:left="460" w:hanging="320"/>
       </w:pPr>
     </w:lvl>
-    <w:lvl w:ilvl="1" w:tplc="1B760370">
+    <w:lvl w:ilvl="1" w:tplc="A01246EA">
       <w:numFmt w:val="decimal"/>
       <w:lvlText w:val=""/>
       <w:lvlJc w:val="left"/>
     </w:lvl>
-    <w:lvl w:ilvl="2" w:tplc="4C4ED3EA">
+    <w:lvl w:ilvl="2" w:tplc="D30AD22A">
       <w:numFmt w:val="decimal"/>
       <w:lvlText w:val=""/>
       <w:lvlJc w:val="left"/>
     </w:lvl>
-    <w:lvl w:ilvl="3" w:tplc="33E432F0">
+    <w:lvl w:ilvl="3" w:tplc="56103E2E">
       <w:numFmt w:val="decimal"/>
       <w:lvlText w:val=""/>
       <w:lvlJc w:val="left"/>
     </w:lvl>
-    <w:lvl w:ilvl="4" w:tplc="975E7524">
+    <w:lvl w:ilvl="4" w:tplc="E6BA1FA8">
       <w:numFmt w:val="decimal"/>
       <w:lvlText w:val=""/>
       <w:lvlJc w:val="left"/>
     </w:lvl>
-    <w:lvl w:ilvl="5" w:tplc="42505032">
+    <w:lvl w:ilvl="5" w:tplc="CDC45554">
       <w:numFmt w:val="decimal"/>
       <w:lvlText w:val=""/>
       <w:lvlJc w:val="left"/>
     </w:lvl>
-    <w:lvl w:ilvl="6" w:tplc="2384ED36">
+    <w:lvl w:ilvl="6" w:tplc="10A6F88E">
       <w:numFmt w:val="decimal"/>
       <w:lvlText w:val=""/>
       <w:lvlJc w:val="left"/>
     </w:lvl>
-    <w:lvl w:ilvl="7" w:tplc="EE166A44">
+    <w:lvl w:ilvl="7" w:tplc="07D6E0DE">
       <w:numFmt w:val="decimal"/>
       <w:lvlText w:val=""/>
       <w:lvlJc w:val="left"/>
     </w:lvl>
-    <w:lvl w:ilvl="8" w:tplc="46B28E8E">
+    <w:lvl w:ilvl="8" w:tplc="5020631A">
       <w:numFmt w:val="decimal"/>
       <w:lvlText w:val=""/>
       <w:lvlJc w:val="left"/>
     </w:lvl>
   </w:abstractNum>
   <w:abstractNum w:abstractNumId="9" w15:restartNumberingAfterBreak="0">
-    <w:nsid w:val="7E2A5728"/>
+    <w:nsid w:val="7A597E78"/>
     <w:multiLevelType w:val="hybridMultilevel"/>
-    <w:tmpl w:val="A9A47918"/>
-    <w:lvl w:ilvl="0" w:tplc="145462CE">
+    <w:tmpl w:val="12B4EEEC"/>
+    <w:lvl w:ilvl="0" w:tplc="74D69BB2">
       <w:start w:val="1"/>
       <w:numFmt w:val="decimal"/>
       <w:lvlText w:val="%1."/>
@@ -10127,102 +10171,102 @@
         <w:ind w:left="460" w:hanging="320"/>
       </w:pPr>
     </w:lvl>
-    <w:lvl w:ilvl="1" w:tplc="F29C06A0">
+    <w:lvl w:ilvl="1" w:tplc="9F7861E8">
       <w:numFmt w:val="decimal"/>
       <w:lvlText w:val=""/>
       <w:lvlJc w:val="left"/>
     </w:lvl>
-    <w:lvl w:ilvl="2" w:tplc="73BC51C4">
+    <w:lvl w:ilvl="2" w:tplc="9F505CAE">
       <w:numFmt w:val="decimal"/>
       <w:lvlText w:val=""/>
       <w:lvlJc w:val="left"/>
     </w:lvl>
-    <w:lvl w:ilvl="3" w:tplc="520E7E22">
+    <w:lvl w:ilvl="3" w:tplc="F0127ADE">
       <w:numFmt w:val="decimal"/>
       <w:lvlText w:val=""/>
       <w:lvlJc w:val="left"/>
     </w:lvl>
-    <w:lvl w:ilvl="4" w:tplc="4E826506">
+    <w:lvl w:ilvl="4" w:tplc="31D06092">
       <w:numFmt w:val="decimal"/>
       <w:lvlText w:val=""/>
       <w:lvlJc w:val="left"/>
     </w:lvl>
-    <w:lvl w:ilvl="5" w:tplc="078024A4">
+    <w:lvl w:ilvl="5" w:tplc="31CE2F6C">
       <w:numFmt w:val="decimal"/>
       <w:lvlText w:val=""/>
       <w:lvlJc w:val="left"/>
     </w:lvl>
-    <w:lvl w:ilvl="6" w:tplc="EB4C6DA4">
+    <w:lvl w:ilvl="6" w:tplc="BB26154C">
       <w:numFmt w:val="decimal"/>
       <w:lvlText w:val=""/>
       <w:lvlJc w:val="left"/>
     </w:lvl>
-    <w:lvl w:ilvl="7" w:tplc="BE8C9C92">
+    <w:lvl w:ilvl="7" w:tplc="740A451A">
       <w:numFmt w:val="decimal"/>
       <w:lvlText w:val=""/>
       <w:lvlJc w:val="left"/>
     </w:lvl>
-    <w:lvl w:ilvl="8" w:tplc="3DBEF978">
+    <w:lvl w:ilvl="8" w:tplc="6D4A06CE">
       <w:numFmt w:val="decimal"/>
       <w:lvlText w:val=""/>
       <w:lvlJc w:val="left"/>
     </w:lvl>
   </w:abstractNum>
-  <w:num w:numId="1" w16cid:durableId="1690788267">
+  <w:num w:numId="1" w16cid:durableId="1712877002">
+    <w:abstractNumId w:val="3"/>
+    <w:lvlOverride w:ilvl="0">
+      <w:startOverride w:val="1"/>
+    </w:lvlOverride>
+  </w:num>
+  <w:num w:numId="2" w16cid:durableId="1646009527">
+    <w:abstractNumId w:val="6"/>
+    <w:lvlOverride w:ilvl="0">
+      <w:startOverride w:val="1"/>
+    </w:lvlOverride>
+  </w:num>
+  <w:num w:numId="3" w16cid:durableId="506287033">
+    <w:abstractNumId w:val="0"/>
+    <w:lvlOverride w:ilvl="0">
+      <w:startOverride w:val="1"/>
+    </w:lvlOverride>
+  </w:num>
+  <w:num w:numId="4" w16cid:durableId="338625903">
+    <w:abstractNumId w:val="1"/>
+    <w:lvlOverride w:ilvl="0">
+      <w:startOverride w:val="1"/>
+    </w:lvlOverride>
+  </w:num>
+  <w:num w:numId="5" w16cid:durableId="1935287302">
+    <w:abstractNumId w:val="8"/>
+    <w:lvlOverride w:ilvl="0">
+      <w:startOverride w:val="1"/>
+    </w:lvlOverride>
+  </w:num>
+  <w:num w:numId="6" w16cid:durableId="1543052151">
+    <w:abstractNumId w:val="9"/>
+    <w:lvlOverride w:ilvl="0">
+      <w:startOverride w:val="1"/>
+    </w:lvlOverride>
+  </w:num>
+  <w:num w:numId="7" w16cid:durableId="153230216">
+    <w:abstractNumId w:val="5"/>
+    <w:lvlOverride w:ilvl="0">
+      <w:startOverride w:val="1"/>
+    </w:lvlOverride>
+  </w:num>
+  <w:num w:numId="8" w16cid:durableId="1088507020">
+    <w:abstractNumId w:val="7"/>
+    <w:lvlOverride w:ilvl="0">
+      <w:startOverride w:val="1"/>
+    </w:lvlOverride>
+  </w:num>
+  <w:num w:numId="9" w16cid:durableId="1699238009">
     <w:abstractNumId w:val="2"/>
     <w:lvlOverride w:ilvl="0">
       <w:startOverride w:val="1"/>
     </w:lvlOverride>
   </w:num>
-  <w:num w:numId="2" w16cid:durableId="1880048432">
-    <w:abstractNumId w:val="1"/>
-    <w:lvlOverride w:ilvl="0">
-      <w:startOverride w:val="1"/>
-    </w:lvlOverride>
-  </w:num>
-  <w:num w:numId="3" w16cid:durableId="945387054">
-    <w:abstractNumId w:val="7"/>
-    <w:lvlOverride w:ilvl="0">
-      <w:startOverride w:val="1"/>
-    </w:lvlOverride>
-  </w:num>
-  <w:num w:numId="4" w16cid:durableId="1897929704">
-    <w:abstractNumId w:val="9"/>
-    <w:lvlOverride w:ilvl="0">
-      <w:startOverride w:val="1"/>
-    </w:lvlOverride>
-  </w:num>
-  <w:num w:numId="5" w16cid:durableId="1476532459">
-    <w:abstractNumId w:val="8"/>
-    <w:lvlOverride w:ilvl="0">
-      <w:startOverride w:val="1"/>
-    </w:lvlOverride>
-  </w:num>
-  <w:num w:numId="6" w16cid:durableId="1679193346">
-    <w:abstractNumId w:val="6"/>
-    <w:lvlOverride w:ilvl="0">
-      <w:startOverride w:val="1"/>
-    </w:lvlOverride>
-  </w:num>
-  <w:num w:numId="7" w16cid:durableId="5980523">
-    <w:abstractNumId w:val="5"/>
-    <w:lvlOverride w:ilvl="0">
-      <w:startOverride w:val="1"/>
-    </w:lvlOverride>
-  </w:num>
-  <w:num w:numId="8" w16cid:durableId="1586111931">
-    <w:abstractNumId w:val="0"/>
-    <w:lvlOverride w:ilvl="0">
-      <w:startOverride w:val="1"/>
-    </w:lvlOverride>
-  </w:num>
-  <w:num w:numId="9" w16cid:durableId="735510935">
-    <w:abstractNumId w:val="3"/>
-    <w:lvlOverride w:ilvl="0">
-      <w:startOverride w:val="1"/>
-    </w:lvlOverride>
-  </w:num>
-  <w:num w:numId="10" w16cid:durableId="1370378867">
+  <w:num w:numId="10" w16cid:durableId="705564786">
     <w:abstractNumId w:val="4"/>
     <w:lvlOverride w:ilvl="0">
       <w:startOverride w:val="1"/>
@@ -10843,7 +10887,7 @@
     <w:autoRedefine/>
     <w:uiPriority w:val="39"/>
     <w:unhideWhenUsed/>
-    <w:rsid w:val="007217D6"/>
+    <w:rsid w:val="00C85822"/>
     <w:pPr>
       <w:spacing w:after="100"/>
     </w:pPr>

</xml_diff>

<commit_message>
Nombres de rol propios de cada instalacion
- settings.role_labels (migracion 0007): cada instalacion nombra sus cinco niveles.
- Los permisos siguen en la clave interna; solo cambia la etiqueta.
- Configuracion: panel para editarlos, sin nombres repetidos, con auditoria.
- Demo GLP y minera parten con Jefe de Mantenimiento; manual actualizado.

Co-Authored-By: Claude Opus 5 <noreply@anthropic.com>
</commit_message>
<xml_diff>
--- a/docs/gasco/Manual_de_uso_PMS_SIMARP.docx
+++ b/docs/gasco/Manual_de_uso_PMS_SIMARP.docx
@@ -115,7 +115,7 @@
     <w:sdt>
       <w:sdtPr>
         <w:alias w:val="Contenido"/>
-        <w:id w:val="1654945620"/>
+        <w:id w:val="1777201287"/>
       </w:sdtPr>
       <w:sdtEndPr/>
       <w:sdtContent>
@@ -143,7 +143,7 @@
           <w:r>
             <w:fldChar w:fldCharType="separate"/>
           </w:r>
-          <w:hyperlink w:anchor="_Toc240932002" w:history="1">
+          <w:hyperlink w:anchor="_Toc240932412" w:history="1">
             <w:r>
               <w:rPr>
                 <w:rStyle w:val="Hipervnculo"/>
@@ -167,7 +167,7 @@
               <w:rPr>
                 <w:noProof/>
               </w:rPr>
-              <w:instrText xml:space="preserve"> PAGEREF _Toc240932002 \h </w:instrText>
+              <w:instrText xml:space="preserve"> PAGEREF _Toc240932412 \h </w:instrText>
             </w:r>
             <w:r>
               <w:rPr>
@@ -209,7 +209,7 @@
               <w14:ligatures w14:val="standardContextual"/>
             </w:rPr>
           </w:pPr>
-          <w:hyperlink w:anchor="_Toc240932003" w:history="1">
+          <w:hyperlink w:anchor="_Toc240932413" w:history="1">
             <w:r>
               <w:rPr>
                 <w:rStyle w:val="Hipervnculo"/>
@@ -233,7 +233,7 @@
               <w:rPr>
                 <w:noProof/>
               </w:rPr>
-              <w:instrText xml:space="preserve"> PAGEREF _Toc240932003 \h </w:instrText>
+              <w:instrText xml:space="preserve"> PAGEREF _Toc240932413 \h </w:instrText>
             </w:r>
             <w:r>
               <w:rPr>
@@ -275,7 +275,7 @@
               <w14:ligatures w14:val="standardContextual"/>
             </w:rPr>
           </w:pPr>
-          <w:hyperlink w:anchor="_Toc240932004" w:history="1">
+          <w:hyperlink w:anchor="_Toc240932414" w:history="1">
             <w:r>
               <w:rPr>
                 <w:rStyle w:val="Hipervnculo"/>
@@ -299,7 +299,7 @@
               <w:rPr>
                 <w:noProof/>
               </w:rPr>
-              <w:instrText xml:space="preserve"> PAGEREF _Toc240932004 \h </w:instrText>
+              <w:instrText xml:space="preserve"> PAGEREF _Toc240932414 \h </w:instrText>
             </w:r>
             <w:r>
               <w:rPr>
@@ -341,7 +341,7 @@
               <w14:ligatures w14:val="standardContextual"/>
             </w:rPr>
           </w:pPr>
-          <w:hyperlink w:anchor="_Toc240932005" w:history="1">
+          <w:hyperlink w:anchor="_Toc240932415" w:history="1">
             <w:r>
               <w:rPr>
                 <w:rStyle w:val="Hipervnculo"/>
@@ -365,7 +365,7 @@
               <w:rPr>
                 <w:noProof/>
               </w:rPr>
-              <w:instrText xml:space="preserve"> PAGEREF _Toc240932005 \h </w:instrText>
+              <w:instrText xml:space="preserve"> PAGEREF _Toc240932415 \h </w:instrText>
             </w:r>
             <w:r>
               <w:rPr>
@@ -407,7 +407,7 @@
               <w14:ligatures w14:val="standardContextual"/>
             </w:rPr>
           </w:pPr>
-          <w:hyperlink w:anchor="_Toc240932006" w:history="1">
+          <w:hyperlink w:anchor="_Toc240932416" w:history="1">
             <w:r>
               <w:rPr>
                 <w:rStyle w:val="Hipervnculo"/>
@@ -431,7 +431,7 @@
               <w:rPr>
                 <w:noProof/>
               </w:rPr>
-              <w:instrText xml:space="preserve"> PAGEREF _Toc240932006 \h </w:instrText>
+              <w:instrText xml:space="preserve"> PAGEREF _Toc240932416 \h </w:instrText>
             </w:r>
             <w:r>
               <w:rPr>
@@ -473,7 +473,7 @@
               <w14:ligatures w14:val="standardContextual"/>
             </w:rPr>
           </w:pPr>
-          <w:hyperlink w:anchor="_Toc240932007" w:history="1">
+          <w:hyperlink w:anchor="_Toc240932417" w:history="1">
             <w:r>
               <w:rPr>
                 <w:rStyle w:val="Hipervnculo"/>
@@ -497,7 +497,7 @@
               <w:rPr>
                 <w:noProof/>
               </w:rPr>
-              <w:instrText xml:space="preserve"> PAGEREF _Toc240932007 \h </w:instrText>
+              <w:instrText xml:space="preserve"> PAGEREF _Toc240932417 \h </w:instrText>
             </w:r>
             <w:r>
               <w:rPr>
@@ -539,7 +539,7 @@
               <w14:ligatures w14:val="standardContextual"/>
             </w:rPr>
           </w:pPr>
-          <w:hyperlink w:anchor="_Toc240932008" w:history="1">
+          <w:hyperlink w:anchor="_Toc240932418" w:history="1">
             <w:r>
               <w:rPr>
                 <w:rStyle w:val="Hipervnculo"/>
@@ -563,7 +563,7 @@
               <w:rPr>
                 <w:noProof/>
               </w:rPr>
-              <w:instrText xml:space="preserve"> PAGEREF _Toc240932008 \h </w:instrText>
+              <w:instrText xml:space="preserve"> PAGEREF _Toc240932418 \h </w:instrText>
             </w:r>
             <w:r>
               <w:rPr>
@@ -605,7 +605,7 @@
               <w14:ligatures w14:val="standardContextual"/>
             </w:rPr>
           </w:pPr>
-          <w:hyperlink w:anchor="_Toc240932009" w:history="1">
+          <w:hyperlink w:anchor="_Toc240932419" w:history="1">
             <w:r>
               <w:rPr>
                 <w:rStyle w:val="Hipervnculo"/>
@@ -629,7 +629,7 @@
               <w:rPr>
                 <w:noProof/>
               </w:rPr>
-              <w:instrText xml:space="preserve"> PAGEREF _Toc240932009 \h </w:instrText>
+              <w:instrText xml:space="preserve"> PAGEREF _Toc240932419 \h </w:instrText>
             </w:r>
             <w:r>
               <w:rPr>
@@ -671,7 +671,7 @@
               <w14:ligatures w14:val="standardContextual"/>
             </w:rPr>
           </w:pPr>
-          <w:hyperlink w:anchor="_Toc240932010" w:history="1">
+          <w:hyperlink w:anchor="_Toc240932420" w:history="1">
             <w:r>
               <w:rPr>
                 <w:rStyle w:val="Hipervnculo"/>
@@ -695,7 +695,7 @@
               <w:rPr>
                 <w:noProof/>
               </w:rPr>
-              <w:instrText xml:space="preserve"> PAGEREF _Toc240932010 \h </w:instrText>
+              <w:instrText xml:space="preserve"> PAGEREF _Toc240932420 \h </w:instrText>
             </w:r>
             <w:r>
               <w:rPr>
@@ -737,7 +737,7 @@
               <w14:ligatures w14:val="standardContextual"/>
             </w:rPr>
           </w:pPr>
-          <w:hyperlink w:anchor="_Toc240932011" w:history="1">
+          <w:hyperlink w:anchor="_Toc240932421" w:history="1">
             <w:r>
               <w:rPr>
                 <w:rStyle w:val="Hipervnculo"/>
@@ -761,7 +761,7 @@
               <w:rPr>
                 <w:noProof/>
               </w:rPr>
-              <w:instrText xml:space="preserve"> PAGEREF _Toc240932011 \h </w:instrText>
+              <w:instrText xml:space="preserve"> PAGEREF _Toc240932421 \h </w:instrText>
             </w:r>
             <w:r>
               <w:rPr>
@@ -803,7 +803,7 @@
               <w14:ligatures w14:val="standardContextual"/>
             </w:rPr>
           </w:pPr>
-          <w:hyperlink w:anchor="_Toc240932012" w:history="1">
+          <w:hyperlink w:anchor="_Toc240932422" w:history="1">
             <w:r>
               <w:rPr>
                 <w:rStyle w:val="Hipervnculo"/>
@@ -827,7 +827,7 @@
               <w:rPr>
                 <w:noProof/>
               </w:rPr>
-              <w:instrText xml:space="preserve"> PAGEREF _Toc240932012 \h </w:instrText>
+              <w:instrText xml:space="preserve"> PAGEREF _Toc240932422 \h </w:instrText>
             </w:r>
             <w:r>
               <w:rPr>
@@ -869,7 +869,7 @@
               <w14:ligatures w14:val="standardContextual"/>
             </w:rPr>
           </w:pPr>
-          <w:hyperlink w:anchor="_Toc240932013" w:history="1">
+          <w:hyperlink w:anchor="_Toc240932423" w:history="1">
             <w:r>
               <w:rPr>
                 <w:rStyle w:val="Hipervnculo"/>
@@ -893,7 +893,7 @@
               <w:rPr>
                 <w:noProof/>
               </w:rPr>
-              <w:instrText xml:space="preserve"> PAGEREF _Toc240932013 \h </w:instrText>
+              <w:instrText xml:space="preserve"> PAGEREF _Toc240932423 \h </w:instrText>
             </w:r>
             <w:r>
               <w:rPr>
@@ -935,7 +935,7 @@
               <w14:ligatures w14:val="standardContextual"/>
             </w:rPr>
           </w:pPr>
-          <w:hyperlink w:anchor="_Toc240932014" w:history="1">
+          <w:hyperlink w:anchor="_Toc240932424" w:history="1">
             <w:r>
               <w:rPr>
                 <w:rStyle w:val="Hipervnculo"/>
@@ -959,7 +959,7 @@
               <w:rPr>
                 <w:noProof/>
               </w:rPr>
-              <w:instrText xml:space="preserve"> PAGEREF _Toc240932014 \h </w:instrText>
+              <w:instrText xml:space="preserve"> PAGEREF _Toc240932424 \h </w:instrText>
             </w:r>
             <w:r>
               <w:rPr>
@@ -1001,7 +1001,7 @@
               <w14:ligatures w14:val="standardContextual"/>
             </w:rPr>
           </w:pPr>
-          <w:hyperlink w:anchor="_Toc240932015" w:history="1">
+          <w:hyperlink w:anchor="_Toc240932425" w:history="1">
             <w:r>
               <w:rPr>
                 <w:rStyle w:val="Hipervnculo"/>
@@ -1025,7 +1025,7 @@
               <w:rPr>
                 <w:noProof/>
               </w:rPr>
-              <w:instrText xml:space="preserve"> PAGEREF _Toc240932015 \h </w:instrText>
+              <w:instrText xml:space="preserve"> PAGEREF _Toc240932425 \h </w:instrText>
             </w:r>
             <w:r>
               <w:rPr>
@@ -1067,7 +1067,7 @@
               <w14:ligatures w14:val="standardContextual"/>
             </w:rPr>
           </w:pPr>
-          <w:hyperlink w:anchor="_Toc240932016" w:history="1">
+          <w:hyperlink w:anchor="_Toc240932426" w:history="1">
             <w:r>
               <w:rPr>
                 <w:rStyle w:val="Hipervnculo"/>
@@ -1091,7 +1091,7 @@
               <w:rPr>
                 <w:noProof/>
               </w:rPr>
-              <w:instrText xml:space="preserve"> PAGEREF _Toc240932016 \h </w:instrText>
+              <w:instrText xml:space="preserve"> PAGEREF _Toc240932426 \h </w:instrText>
             </w:r>
             <w:r>
               <w:rPr>
@@ -1133,7 +1133,7 @@
               <w14:ligatures w14:val="standardContextual"/>
             </w:rPr>
           </w:pPr>
-          <w:hyperlink w:anchor="_Toc240932017" w:history="1">
+          <w:hyperlink w:anchor="_Toc240932427" w:history="1">
             <w:r>
               <w:rPr>
                 <w:rStyle w:val="Hipervnculo"/>
@@ -1157,7 +1157,7 @@
               <w:rPr>
                 <w:noProof/>
               </w:rPr>
-              <w:instrText xml:space="preserve"> PAGEREF _Toc240932017 \h </w:instrText>
+              <w:instrText xml:space="preserve"> PAGEREF _Toc240932427 \h </w:instrText>
             </w:r>
             <w:r>
               <w:rPr>
@@ -1199,7 +1199,7 @@
               <w14:ligatures w14:val="standardContextual"/>
             </w:rPr>
           </w:pPr>
-          <w:hyperlink w:anchor="_Toc240932018" w:history="1">
+          <w:hyperlink w:anchor="_Toc240932428" w:history="1">
             <w:r>
               <w:rPr>
                 <w:rStyle w:val="Hipervnculo"/>
@@ -1223,7 +1223,7 @@
               <w:rPr>
                 <w:noProof/>
               </w:rPr>
-              <w:instrText xml:space="preserve"> PAGEREF _Toc240932018 \h </w:instrText>
+              <w:instrText xml:space="preserve"> PAGEREF _Toc240932428 \h </w:instrText>
             </w:r>
             <w:r>
               <w:rPr>
@@ -1265,7 +1265,7 @@
               <w14:ligatures w14:val="standardContextual"/>
             </w:rPr>
           </w:pPr>
-          <w:hyperlink w:anchor="_Toc240932019" w:history="1">
+          <w:hyperlink w:anchor="_Toc240932429" w:history="1">
             <w:r>
               <w:rPr>
                 <w:rStyle w:val="Hipervnculo"/>
@@ -1289,7 +1289,7 @@
               <w:rPr>
                 <w:noProof/>
               </w:rPr>
-              <w:instrText xml:space="preserve"> PAGEREF _Toc240932019 \h </w:instrText>
+              <w:instrText xml:space="preserve"> PAGEREF _Toc240932429 \h </w:instrText>
             </w:r>
             <w:r>
               <w:rPr>
@@ -1328,7 +1328,7 @@
         <w:pStyle w:val="Ttulo1"/>
         <w:pageBreakBefore/>
       </w:pPr>
-      <w:bookmarkStart w:id="0" w:name="_Toc240932002"/>
+      <w:bookmarkStart w:id="0" w:name="_Toc240932412"/>
       <w:r>
         <w:lastRenderedPageBreak/>
         <w:t>1. Qué es PMS SIMARP</w:t>
@@ -1525,7 +1525,7 @@
         <w:pStyle w:val="Ttulo1"/>
         <w:pageBreakBefore/>
       </w:pPr>
-      <w:bookmarkStart w:id="1" w:name="_Toc240932003"/>
+      <w:bookmarkStart w:id="1" w:name="_Toc240932413"/>
       <w:r>
         <w:lastRenderedPageBreak/>
         <w:t>2. Primeros pasos</w:t>
@@ -1818,7 +1818,7 @@
         <w:pStyle w:val="Ttulo1"/>
         <w:pageBreakBefore/>
       </w:pPr>
-      <w:bookmarkStart w:id="2" w:name="_Toc240932004"/>
+      <w:bookmarkStart w:id="2" w:name="_Toc240932414"/>
       <w:r>
         <w:lastRenderedPageBreak/>
         <w:t>3. Roles y permisos</w:t>
@@ -2017,7 +2017,7 @@
               <w:spacing w:line="260" w:lineRule="auto"/>
             </w:pPr>
             <w:r>
-              <w:t>Técnico</w:t>
+              <w:t>Técnico de Mantenimiento</w:t>
             </w:r>
           </w:p>
         </w:tc>
@@ -2133,7 +2133,7 @@
               <w:spacing w:line="260" w:lineRule="auto"/>
             </w:pPr>
             <w:r>
-              <w:t>Jefe de Máquinas</w:t>
+              <w:t>Jefe de Mantenimiento</w:t>
             </w:r>
           </w:p>
         </w:tc>
@@ -2158,7 +2158,7 @@
               <w:spacing w:line="260" w:lineRule="auto"/>
             </w:pPr>
             <w:r>
-              <w:t>Además: aprobar o rechazar el trabajo ejecutado (segunda firma). Es el rol del jefe de mantenimiento.</w:t>
+              <w:t>Además: aprobar o rechazar el trabajo ejecutado (segunda firma).</w:t>
             </w:r>
           </w:p>
         </w:tc>
@@ -2242,10 +2242,31 @@
           <w:bCs/>
           <w:color w:val="8A5A00"/>
         </w:rPr>
+        <w:t xml:space="preserve">Nombres de los roles.  </w:t>
+      </w:r>
+      <w:r>
+        <w:t>Los nombres de esta tabla son los de la Planta GLP Metropolitana. Cada instalación puede llamar a sus roles como los llama su organización, desde Configuración (ver 15.2). Solo cambia el nombre: lo que puede hacer cada nivel es el mismo en todas las instalaciones.</w:t>
+      </w:r>
+    </w:p>
+    <w:p>
+      <w:pPr>
+        <w:pBdr>
+          <w:left w:val="single" w:sz="18" w:space="8" w:color="E0A030"/>
+        </w:pBdr>
+        <w:shd w:val="clear" w:color="auto" w:fill="FFF4E0"/>
+        <w:spacing w:before="120" w:after="160" w:line="280" w:lineRule="auto"/>
+        <w:ind w:left="120" w:right="120"/>
+      </w:pPr>
+      <w:r>
+        <w:rPr>
+          <w:b/>
+          <w:bCs/>
+          <w:color w:val="8A5A00"/>
+        </w:rPr>
         <w:t xml:space="preserve">Segunda firma.  </w:t>
       </w:r>
       <w:r>
-        <w:t>En equipos críticos y sistemas de seguridad, quien ejecutó el trabajo no puede aprobarlo. Lo tiene que aprobar otra persona con rol Jefe de Máquinas o superior.</w:t>
+        <w:t>En equipos críticos y sistemas de seguridad, quien ejecutó el trabajo no puede aprobarlo. Lo tiene que aprobar otra persona con rol Jefe de Mantenimiento o superior.</w:t>
       </w:r>
     </w:p>
     <w:p>
@@ -2253,7 +2274,7 @@
         <w:pStyle w:val="Ttulo1"/>
         <w:pageBreakBefore/>
       </w:pPr>
-      <w:bookmarkStart w:id="3" w:name="_Toc240932005"/>
+      <w:bookmarkStart w:id="3" w:name="_Toc240932415"/>
       <w:r>
         <w:lastRenderedPageBreak/>
         <w:t>4. Dashboard de mantenimiento</w:t>
@@ -3083,7 +3104,7 @@
         <w:pStyle w:val="Ttulo1"/>
         <w:pageBreakBefore/>
       </w:pPr>
-      <w:bookmarkStart w:id="4" w:name="_Toc240932006"/>
+      <w:bookmarkStart w:id="4" w:name="_Toc240932416"/>
       <w:r>
         <w:lastRenderedPageBreak/>
         <w:t>5. Activos</w:t>
@@ -3978,7 +3999,7 @@
         <w:pStyle w:val="Ttulo1"/>
         <w:pageBreakBefore/>
       </w:pPr>
-      <w:bookmarkStart w:id="5" w:name="_Toc240932007"/>
+      <w:bookmarkStart w:id="5" w:name="_Toc240932417"/>
       <w:r>
         <w:lastRenderedPageBreak/>
         <w:t>6. Órdenes de trabajo</w:t>
@@ -4718,7 +4739,7 @@
         <w:pStyle w:val="Ttulo1"/>
         <w:pageBreakBefore/>
       </w:pPr>
-      <w:bookmarkStart w:id="6" w:name="_Toc240932008"/>
+      <w:bookmarkStart w:id="6" w:name="_Toc240932418"/>
       <w:r>
         <w:lastRenderedPageBreak/>
         <w:t>7. Ejecutar una rutina preventiva</w:t>
@@ -5119,7 +5140,7 @@
         <w:pStyle w:val="Ttulo1"/>
         <w:pageBreakBefore/>
       </w:pPr>
-      <w:bookmarkStart w:id="7" w:name="_Toc240932009"/>
+      <w:bookmarkStart w:id="7" w:name="_Toc240932419"/>
       <w:r>
         <w:lastRenderedPageBreak/>
         <w:t>8. Aprobación del trabajo</w:t>
@@ -5141,7 +5162,7 @@
         <w:t>Aprobación</w:t>
       </w:r>
       <w:r>
-        <w:t xml:space="preserve"> de la orden permite que un Jefe de Máquinas, o un rol superior, apruebe o rechace el trabajo cerrado.</w:t>
+        <w:t xml:space="preserve"> de la orden permite que un Jefe de Mantenimiento, o un rol superior, apruebe o rechace el trabajo cerrado.</w:t>
       </w:r>
     </w:p>
     <w:p>
@@ -5197,7 +5218,7 @@
         <w:pStyle w:val="Ttulo1"/>
         <w:pageBreakBefore/>
       </w:pPr>
-      <w:bookmarkStart w:id="8" w:name="_Toc240932010"/>
+      <w:bookmarkStart w:id="8" w:name="_Toc240932420"/>
       <w:r>
         <w:lastRenderedPageBreak/>
         <w:t>9. Plan preventivo</w:t>
@@ -5630,7 +5651,7 @@
         <w:pStyle w:val="Ttulo1"/>
         <w:pageBreakBefore/>
       </w:pPr>
-      <w:bookmarkStart w:id="9" w:name="_Toc240932011"/>
+      <w:bookmarkStart w:id="9" w:name="_Toc240932421"/>
       <w:r>
         <w:lastRenderedPageBreak/>
         <w:t>10. Horómetros</w:t>
@@ -5717,7 +5738,7 @@
         <w:pStyle w:val="Ttulo1"/>
         <w:pageBreakBefore/>
       </w:pPr>
-      <w:bookmarkStart w:id="10" w:name="_Toc240932012"/>
+      <w:bookmarkStart w:id="10" w:name="_Toc240932422"/>
       <w:r>
         <w:lastRenderedPageBreak/>
         <w:t>11. Priorización asistida por IA</w:t>
@@ -6462,7 +6483,7 @@
         <w:pStyle w:val="Ttulo1"/>
         <w:pageBreakBefore/>
       </w:pPr>
-      <w:bookmarkStart w:id="11" w:name="_Toc240932013"/>
+      <w:bookmarkStart w:id="11" w:name="_Toc240932423"/>
       <w:r>
         <w:lastRenderedPageBreak/>
         <w:t>12. Análisis de causa raíz</w:t>
@@ -6580,7 +6601,7 @@
           <w:noProof/>
         </w:rPr>
         <w:drawing>
-          <wp:inline distT="0" distB="0" distL="0" distR="0" wp14:anchorId="529E20FC" wp14:editId="17644029">
+          <wp:inline distT="0" distB="0" distL="0" distR="0" wp14:anchorId="66D8BDF0" wp14:editId="23FB924E">
             <wp:extent cx="5524500" cy="3238500"/>
             <wp:effectExtent l="0" t="0" r="0" b="0"/>
             <wp:docPr id="1" name="Imagen 1"/>
@@ -6640,7 +6661,7 @@
         <w:pStyle w:val="Ttulo1"/>
         <w:pageBreakBefore/>
       </w:pPr>
-      <w:bookmarkStart w:id="12" w:name="_Toc240932014"/>
+      <w:bookmarkStart w:id="12" w:name="_Toc240932424"/>
       <w:r>
         <w:lastRenderedPageBreak/>
         <w:t>13. Reportes</w:t>
@@ -6739,7 +6760,7 @@
         <w:pStyle w:val="Ttulo1"/>
         <w:pageBreakBefore/>
       </w:pPr>
-      <w:bookmarkStart w:id="13" w:name="_Toc240932015"/>
+      <w:bookmarkStart w:id="13" w:name="_Toc240932425"/>
       <w:r>
         <w:lastRenderedPageBreak/>
         <w:t>14. Importar desde Excel</w:t>
@@ -7555,7 +7576,7 @@
         <w:pStyle w:val="Ttulo1"/>
         <w:pageBreakBefore/>
       </w:pPr>
-      <w:bookmarkStart w:id="14" w:name="_Toc240932016"/>
+      <w:bookmarkStart w:id="14" w:name="_Toc240932426"/>
       <w:r>
         <w:lastRenderedPageBreak/>
         <w:t>15. Administración de la instalación</w:t>
@@ -7682,6 +7703,32 @@
     </w:p>
     <w:p>
       <w:pPr>
+        <w:pStyle w:val="Ttulo3"/>
+      </w:pPr>
+      <w:r>
+        <w:t>Nombres de los roles</w:t>
+      </w:r>
+    </w:p>
+    <w:p>
+      <w:pPr>
+        <w:spacing w:after="120" w:line="290" w:lineRule="auto"/>
+      </w:pPr>
+      <w:r>
+        <w:t xml:space="preserve">En el panel </w:t>
+      </w:r>
+      <w:r>
+        <w:rPr>
+          <w:b/>
+          <w:bCs/>
+        </w:rPr>
+        <w:t>Nombres de los roles</w:t>
+      </w:r>
+      <w:r>
+        <w:t xml:space="preserve"> se cambia cómo se llama cada nivel de permiso en la instalación. Por ejemplo, «Técnico» puede pasar a llamarse «Mecánico». Un campo vacío vuelve al nombre por defecto, y dos roles no pueden llamarse igual. El cambio queda en el historial.</w:t>
+      </w:r>
+    </w:p>
+    <w:p>
+      <w:pPr>
         <w:pBdr>
           <w:left w:val="single" w:sz="18" w:space="8" w:color="E0A030"/>
         </w:pBdr>
@@ -7727,7 +7774,7 @@
         <w:pStyle w:val="Ttulo1"/>
         <w:pageBreakBefore/>
       </w:pPr>
-      <w:bookmarkStart w:id="15" w:name="_Toc240932017"/>
+      <w:bookmarkStart w:id="15" w:name="_Toc240932427"/>
       <w:r>
         <w:lastRenderedPageBreak/>
         <w:t>16. Trazabilidad e historial</w:t>
@@ -8227,7 +8274,7 @@
         <w:pStyle w:val="Ttulo1"/>
         <w:pageBreakBefore/>
       </w:pPr>
-      <w:bookmarkStart w:id="16" w:name="_Toc240932018"/>
+      <w:bookmarkStart w:id="16" w:name="_Toc240932428"/>
       <w:r>
         <w:lastRenderedPageBreak/>
         <w:t>17. Preguntas frecuentes</w:t>
@@ -8355,7 +8402,7 @@
         <w:pStyle w:val="Ttulo1"/>
         <w:pageBreakBefore/>
       </w:pPr>
-      <w:bookmarkStart w:id="17" w:name="_Toc240932019"/>
+      <w:bookmarkStart w:id="17" w:name="_Toc240932429"/>
       <w:r>
         <w:lastRenderedPageBreak/>
         <w:t>18. Glosario</w:t>
@@ -9637,10 +9684,10 @@
 <file path=word/numbering.xml><?xml version="1.0" encoding="utf-8"?>
 <w:numbering xmlns:wpc="http://schemas.microsoft.com/office/word/2010/wordprocessingCanvas" xmlns:cx="http://schemas.microsoft.com/office/drawing/2014/chartex" xmlns:cx1="http://schemas.microsoft.com/office/drawing/2015/9/8/chartex" xmlns:cx2="http://schemas.microsoft.com/office/drawing/2015/10/21/chartex" xmlns:cx3="http://schemas.microsoft.com/office/drawing/2016/5/9/chartex" xmlns:cx4="http://schemas.microsoft.com/office/drawing/2016/5/10/chartex" xmlns:cx5="http://schemas.microsoft.com/office/drawing/2016/5/11/chartex" xmlns:cx6="http://schemas.microsoft.com/office/drawing/2016/5/12/chartex" xmlns:cx7="http://schemas.microsoft.com/office/drawing/2016/5/13/chartex" xmlns:cx8="http://schemas.microsoft.com/office/drawing/2016/5/14/chartex" xmlns:mc="http://schemas.openxmlformats.org/markup-compatibility/2006" xmlns:aink="http://schemas.microsoft.com/office/drawing/2016/ink" xmlns:am3d="http://schemas.microsoft.com/office/drawing/2017/model3d" xmlns:o="urn:schemas-microsoft-com:office:office" xmlns:oel="http://schemas.microsoft.com/office/2019/extlst" xmlns:r="http://schemas.openxmlformats.org/officeDocument/2006/relationships" xmlns:m="http://schemas.openxmlformats.org/officeDocument/2006/math" xmlns:v="urn:schemas-microsoft-com:vml" xmlns:wp14="http://schemas.microsoft.com/office/word/2010/wordprocessingDrawing" xmlns:wp="http://schemas.openxmlformats.org/drawingml/2006/wordprocessingDrawing" xmlns:w10="urn:schemas-microsoft-com:office:word" xmlns:w="http://schemas.openxmlformats.org/wordprocessingml/2006/main" xmlns:w14="http://schemas.microsoft.com/office/word/2010/wordml" xmlns:w15="http://schemas.microsoft.com/office/word/2012/wordml" xmlns:w16cex="http://schemas.microsoft.com/office/word/2018/wordml/cex" xmlns:w16cid="http://schemas.microsoft.com/office/word/2016/wordml/cid" xmlns:w16="http://schemas.microsoft.com/office/word/2018/wordml" xmlns:w16du="http://schemas.microsoft.com/office/word/2023/wordml/word16du" xmlns:w16sdtdh="http://schemas.microsoft.com/office/word/2020/wordml/sdtdatahash" xmlns:w16sdtfl="http://schemas.microsoft.com/office/word/2024/wordml/sdtformatlock" xmlns:w16se="http://schemas.microsoft.com/office/word/2015/wordml/symex" xmlns:wpg="http://schemas.microsoft.com/office/word/2010/wordprocessingGroup" xmlns:wpi="http://schemas.microsoft.com/office/word/2010/wordprocessingInk" xmlns:wne="http://schemas.microsoft.com/office/word/2006/wordml" xmlns:wps="http://schemas.microsoft.com/office/word/2010/wordprocessingShape" mc:Ignorable="w14 w15 w16se w16cid w16 w16cex w16sdtdh w16sdtfl w16du wp14">
   <w:abstractNum w:abstractNumId="0" w15:restartNumberingAfterBreak="0">
-    <w:nsid w:val="00351B14"/>
+    <w:nsid w:val="112D16F9"/>
     <w:multiLevelType w:val="hybridMultilevel"/>
-    <w:tmpl w:val="21F2CC80"/>
-    <w:lvl w:ilvl="0" w:tplc="D26AE39C">
+    <w:tmpl w:val="FF6EE242"/>
+    <w:lvl w:ilvl="0" w:tplc="795E68D0">
       <w:start w:val="1"/>
       <w:numFmt w:val="decimal"/>
       <w:lvlText w:val="%1."/>
@@ -9649,52 +9696,52 @@
         <w:ind w:left="460" w:hanging="320"/>
       </w:pPr>
     </w:lvl>
-    <w:lvl w:ilvl="1" w:tplc="7E004540">
+    <w:lvl w:ilvl="1" w:tplc="92D0A996">
       <w:numFmt w:val="decimal"/>
       <w:lvlText w:val=""/>
       <w:lvlJc w:val="left"/>
     </w:lvl>
-    <w:lvl w:ilvl="2" w:tplc="381E6156">
+    <w:lvl w:ilvl="2" w:tplc="494A1BB6">
       <w:numFmt w:val="decimal"/>
       <w:lvlText w:val=""/>
       <w:lvlJc w:val="left"/>
     </w:lvl>
-    <w:lvl w:ilvl="3" w:tplc="888CEE6A">
+    <w:lvl w:ilvl="3" w:tplc="6B4E1F70">
       <w:numFmt w:val="decimal"/>
       <w:lvlText w:val=""/>
       <w:lvlJc w:val="left"/>
     </w:lvl>
-    <w:lvl w:ilvl="4" w:tplc="1A3275BE">
+    <w:lvl w:ilvl="4" w:tplc="9260CFC6">
       <w:numFmt w:val="decimal"/>
       <w:lvlText w:val=""/>
       <w:lvlJc w:val="left"/>
     </w:lvl>
-    <w:lvl w:ilvl="5" w:tplc="5D8E9682">
+    <w:lvl w:ilvl="5" w:tplc="5558AB7A">
       <w:numFmt w:val="decimal"/>
       <w:lvlText w:val=""/>
       <w:lvlJc w:val="left"/>
     </w:lvl>
-    <w:lvl w:ilvl="6" w:tplc="6B2008E4">
+    <w:lvl w:ilvl="6" w:tplc="17124DF4">
       <w:numFmt w:val="decimal"/>
       <w:lvlText w:val=""/>
       <w:lvlJc w:val="left"/>
     </w:lvl>
-    <w:lvl w:ilvl="7" w:tplc="612EB5D0">
+    <w:lvl w:ilvl="7" w:tplc="22266ECE">
       <w:numFmt w:val="decimal"/>
       <w:lvlText w:val=""/>
       <w:lvlJc w:val="left"/>
     </w:lvl>
-    <w:lvl w:ilvl="8" w:tplc="79A4F6B8">
+    <w:lvl w:ilvl="8" w:tplc="5E9E3E12">
       <w:numFmt w:val="decimal"/>
       <w:lvlText w:val=""/>
       <w:lvlJc w:val="left"/>
     </w:lvl>
   </w:abstractNum>
   <w:abstractNum w:abstractNumId="1" w15:restartNumberingAfterBreak="0">
-    <w:nsid w:val="130A1153"/>
+    <w:nsid w:val="1CEB2A20"/>
     <w:multiLevelType w:val="hybridMultilevel"/>
-    <w:tmpl w:val="A77CAECE"/>
-    <w:lvl w:ilvl="0" w:tplc="93884FF6">
+    <w:tmpl w:val="9718FED6"/>
+    <w:lvl w:ilvl="0" w:tplc="1CEE286A">
       <w:start w:val="1"/>
       <w:numFmt w:val="decimal"/>
       <w:lvlText w:val="%1."/>
@@ -9703,52 +9750,52 @@
         <w:ind w:left="460" w:hanging="320"/>
       </w:pPr>
     </w:lvl>
-    <w:lvl w:ilvl="1" w:tplc="E986571E">
+    <w:lvl w:ilvl="1" w:tplc="B4547D04">
       <w:numFmt w:val="decimal"/>
       <w:lvlText w:val=""/>
       <w:lvlJc w:val="left"/>
     </w:lvl>
-    <w:lvl w:ilvl="2" w:tplc="A6163E4C">
+    <w:lvl w:ilvl="2" w:tplc="8D7AFFDA">
       <w:numFmt w:val="decimal"/>
       <w:lvlText w:val=""/>
       <w:lvlJc w:val="left"/>
     </w:lvl>
-    <w:lvl w:ilvl="3" w:tplc="3DBCBEFC">
+    <w:lvl w:ilvl="3" w:tplc="0D92E8DA">
       <w:numFmt w:val="decimal"/>
       <w:lvlText w:val=""/>
       <w:lvlJc w:val="left"/>
     </w:lvl>
-    <w:lvl w:ilvl="4" w:tplc="5BE27CA4">
+    <w:lvl w:ilvl="4" w:tplc="AD262672">
       <w:numFmt w:val="decimal"/>
       <w:lvlText w:val=""/>
       <w:lvlJc w:val="left"/>
     </w:lvl>
-    <w:lvl w:ilvl="5" w:tplc="22686498">
+    <w:lvl w:ilvl="5" w:tplc="32EE4666">
       <w:numFmt w:val="decimal"/>
       <w:lvlText w:val=""/>
       <w:lvlJc w:val="left"/>
     </w:lvl>
-    <w:lvl w:ilvl="6" w:tplc="7400B1CE">
+    <w:lvl w:ilvl="6" w:tplc="251602F0">
       <w:numFmt w:val="decimal"/>
       <w:lvlText w:val=""/>
       <w:lvlJc w:val="left"/>
     </w:lvl>
-    <w:lvl w:ilvl="7" w:tplc="AA8EB8F4">
+    <w:lvl w:ilvl="7" w:tplc="1F5C91C4">
       <w:numFmt w:val="decimal"/>
       <w:lvlText w:val=""/>
       <w:lvlJc w:val="left"/>
     </w:lvl>
-    <w:lvl w:ilvl="8" w:tplc="12769434">
+    <w:lvl w:ilvl="8" w:tplc="8E026080">
       <w:numFmt w:val="decimal"/>
       <w:lvlText w:val=""/>
       <w:lvlJc w:val="left"/>
     </w:lvl>
   </w:abstractNum>
   <w:abstractNum w:abstractNumId="2" w15:restartNumberingAfterBreak="0">
-    <w:nsid w:val="142579F4"/>
+    <w:nsid w:val="1EC22CEF"/>
     <w:multiLevelType w:val="hybridMultilevel"/>
-    <w:tmpl w:val="90B4D308"/>
-    <w:lvl w:ilvl="0" w:tplc="62B67114">
+    <w:tmpl w:val="1AFA48E2"/>
+    <w:lvl w:ilvl="0" w:tplc="971A6966">
       <w:start w:val="1"/>
       <w:numFmt w:val="decimal"/>
       <w:lvlText w:val="%1."/>
@@ -9757,52 +9804,52 @@
         <w:ind w:left="460" w:hanging="320"/>
       </w:pPr>
     </w:lvl>
-    <w:lvl w:ilvl="1" w:tplc="A6AA6022">
+    <w:lvl w:ilvl="1" w:tplc="ECEEF25E">
       <w:numFmt w:val="decimal"/>
       <w:lvlText w:val=""/>
       <w:lvlJc w:val="left"/>
     </w:lvl>
-    <w:lvl w:ilvl="2" w:tplc="774622AA">
+    <w:lvl w:ilvl="2" w:tplc="B5B09B4C">
       <w:numFmt w:val="decimal"/>
       <w:lvlText w:val=""/>
       <w:lvlJc w:val="left"/>
     </w:lvl>
-    <w:lvl w:ilvl="3" w:tplc="5B623E84">
+    <w:lvl w:ilvl="3" w:tplc="2D2431BC">
       <w:numFmt w:val="decimal"/>
       <w:lvlText w:val=""/>
       <w:lvlJc w:val="left"/>
     </w:lvl>
-    <w:lvl w:ilvl="4" w:tplc="AF7EF25C">
+    <w:lvl w:ilvl="4" w:tplc="5E346F52">
       <w:numFmt w:val="decimal"/>
       <w:lvlText w:val=""/>
       <w:lvlJc w:val="left"/>
     </w:lvl>
-    <w:lvl w:ilvl="5" w:tplc="63F08454">
+    <w:lvl w:ilvl="5" w:tplc="068200DC">
       <w:numFmt w:val="decimal"/>
       <w:lvlText w:val=""/>
       <w:lvlJc w:val="left"/>
     </w:lvl>
-    <w:lvl w:ilvl="6" w:tplc="F6D4DE0C">
+    <w:lvl w:ilvl="6" w:tplc="345ABD0A">
       <w:numFmt w:val="decimal"/>
       <w:lvlText w:val=""/>
       <w:lvlJc w:val="left"/>
     </w:lvl>
-    <w:lvl w:ilvl="7" w:tplc="2098DE8C">
+    <w:lvl w:ilvl="7" w:tplc="CAFCD4EE">
       <w:numFmt w:val="decimal"/>
       <w:lvlText w:val=""/>
       <w:lvlJc w:val="left"/>
     </w:lvl>
-    <w:lvl w:ilvl="8" w:tplc="5E6CD690">
+    <w:lvl w:ilvl="8" w:tplc="3CC49358">
       <w:numFmt w:val="decimal"/>
       <w:lvlText w:val=""/>
       <w:lvlJc w:val="left"/>
     </w:lvl>
   </w:abstractNum>
   <w:abstractNum w:abstractNumId="3" w15:restartNumberingAfterBreak="0">
-    <w:nsid w:val="19F4672D"/>
+    <w:nsid w:val="21CB10AD"/>
     <w:multiLevelType w:val="hybridMultilevel"/>
-    <w:tmpl w:val="4A16B048"/>
-    <w:lvl w:ilvl="0" w:tplc="2BD01CCE">
+    <w:tmpl w:val="79C62228"/>
+    <w:lvl w:ilvl="0" w:tplc="B442BEEE">
       <w:start w:val="1"/>
       <w:numFmt w:val="bullet"/>
       <w:lvlText w:val="●"/>
@@ -9811,7 +9858,7 @@
         <w:ind w:left="720" w:hanging="360"/>
       </w:pPr>
     </w:lvl>
-    <w:lvl w:ilvl="1" w:tplc="5B36953A">
+    <w:lvl w:ilvl="1" w:tplc="6406D444">
       <w:start w:val="1"/>
       <w:numFmt w:val="bullet"/>
       <w:lvlText w:val="○"/>
@@ -9820,7 +9867,7 @@
         <w:ind w:left="1440" w:hanging="360"/>
       </w:pPr>
     </w:lvl>
-    <w:lvl w:ilvl="2" w:tplc="63CC065E">
+    <w:lvl w:ilvl="2" w:tplc="C92635FA">
       <w:start w:val="1"/>
       <w:numFmt w:val="bullet"/>
       <w:lvlText w:val="■"/>
@@ -9829,7 +9876,7 @@
         <w:ind w:left="2160" w:hanging="360"/>
       </w:pPr>
     </w:lvl>
-    <w:lvl w:ilvl="3" w:tplc="AD30A83A">
+    <w:lvl w:ilvl="3" w:tplc="FF26FD4A">
       <w:start w:val="1"/>
       <w:numFmt w:val="bullet"/>
       <w:lvlText w:val="●"/>
@@ -9838,7 +9885,7 @@
         <w:ind w:left="2880" w:hanging="360"/>
       </w:pPr>
     </w:lvl>
-    <w:lvl w:ilvl="4" w:tplc="22427F18">
+    <w:lvl w:ilvl="4" w:tplc="9D2AE9D6">
       <w:start w:val="1"/>
       <w:numFmt w:val="bullet"/>
       <w:lvlText w:val="○"/>
@@ -9847,7 +9894,7 @@
         <w:ind w:left="3600" w:hanging="360"/>
       </w:pPr>
     </w:lvl>
-    <w:lvl w:ilvl="5" w:tplc="57FA7112">
+    <w:lvl w:ilvl="5" w:tplc="39305696">
       <w:start w:val="1"/>
       <w:numFmt w:val="bullet"/>
       <w:lvlText w:val="■"/>
@@ -9856,7 +9903,7 @@
         <w:ind w:left="4320" w:hanging="360"/>
       </w:pPr>
     </w:lvl>
-    <w:lvl w:ilvl="6" w:tplc="218E9BE0">
+    <w:lvl w:ilvl="6" w:tplc="2894F862">
       <w:start w:val="1"/>
       <w:numFmt w:val="bullet"/>
       <w:lvlText w:val="●"/>
@@ -9865,7 +9912,7 @@
         <w:ind w:left="5040" w:hanging="360"/>
       </w:pPr>
     </w:lvl>
-    <w:lvl w:ilvl="7" w:tplc="5396047A">
+    <w:lvl w:ilvl="7" w:tplc="79E8179C">
       <w:start w:val="1"/>
       <w:numFmt w:val="bullet"/>
       <w:lvlText w:val="●"/>
@@ -9874,7 +9921,7 @@
         <w:ind w:left="5760" w:hanging="360"/>
       </w:pPr>
     </w:lvl>
-    <w:lvl w:ilvl="8" w:tplc="0EA4F39E">
+    <w:lvl w:ilvl="8" w:tplc="01D6D2FE">
       <w:start w:val="1"/>
       <w:numFmt w:val="bullet"/>
       <w:lvlText w:val="●"/>
@@ -9885,64 +9932,68 @@
     </w:lvl>
   </w:abstractNum>
   <w:abstractNum w:abstractNumId="4" w15:restartNumberingAfterBreak="0">
-    <w:nsid w:val="218A60EB"/>
+    <w:nsid w:val="24935EC4"/>
     <w:multiLevelType w:val="hybridMultilevel"/>
-    <w:tmpl w:val="9F5612D2"/>
-    <w:lvl w:ilvl="0" w:tplc="40DCB584">
+    <w:tmpl w:val="99A848BA"/>
+    <w:lvl w:ilvl="0" w:tplc="7E48295A">
       <w:start w:val="1"/>
-      <w:numFmt w:val="decimal"/>
-      <w:lvlText w:val="%1."/>
+      <w:numFmt w:val="bullet"/>
+      <w:lvlText w:val="•"/>
       <w:lvlJc w:val="left"/>
       <w:pPr>
-        <w:ind w:left="460" w:hanging="320"/>
+        <w:ind w:left="460" w:hanging="280"/>
       </w:pPr>
     </w:lvl>
-    <w:lvl w:ilvl="1" w:tplc="0DBC5F44">
+    <w:lvl w:ilvl="1" w:tplc="C040FAE8">
+      <w:start w:val="1"/>
+      <w:numFmt w:val="bullet"/>
+      <w:lvlText w:val="–"/>
+      <w:lvlJc w:val="left"/>
+      <w:pPr>
+        <w:ind w:left="900" w:hanging="280"/>
+      </w:pPr>
+    </w:lvl>
+    <w:lvl w:ilvl="2" w:tplc="57F83BAC">
       <w:numFmt w:val="decimal"/>
       <w:lvlText w:val=""/>
       <w:lvlJc w:val="left"/>
     </w:lvl>
-    <w:lvl w:ilvl="2" w:tplc="50648BFA">
+    <w:lvl w:ilvl="3" w:tplc="8C8C451E">
       <w:numFmt w:val="decimal"/>
       <w:lvlText w:val=""/>
       <w:lvlJc w:val="left"/>
     </w:lvl>
-    <w:lvl w:ilvl="3" w:tplc="98625964">
+    <w:lvl w:ilvl="4" w:tplc="EC60CB82">
       <w:numFmt w:val="decimal"/>
       <w:lvlText w:val=""/>
       <w:lvlJc w:val="left"/>
     </w:lvl>
-    <w:lvl w:ilvl="4" w:tplc="AFDE5876">
+    <w:lvl w:ilvl="5" w:tplc="F5382746">
       <w:numFmt w:val="decimal"/>
       <w:lvlText w:val=""/>
       <w:lvlJc w:val="left"/>
     </w:lvl>
-    <w:lvl w:ilvl="5" w:tplc="37866CB8">
+    <w:lvl w:ilvl="6" w:tplc="1AE893F8">
       <w:numFmt w:val="decimal"/>
       <w:lvlText w:val=""/>
       <w:lvlJc w:val="left"/>
     </w:lvl>
-    <w:lvl w:ilvl="6" w:tplc="2966A212">
+    <w:lvl w:ilvl="7" w:tplc="2598945E">
       <w:numFmt w:val="decimal"/>
       <w:lvlText w:val=""/>
       <w:lvlJc w:val="left"/>
     </w:lvl>
-    <w:lvl w:ilvl="7" w:tplc="20AE3E6C">
-      <w:numFmt w:val="decimal"/>
-      <w:lvlText w:val=""/>
-      <w:lvlJc w:val="left"/>
-    </w:lvl>
-    <w:lvl w:ilvl="8" w:tplc="42FE687E">
+    <w:lvl w:ilvl="8" w:tplc="7466FA6E">
       <w:numFmt w:val="decimal"/>
       <w:lvlText w:val=""/>
       <w:lvlJc w:val="left"/>
     </w:lvl>
   </w:abstractNum>
   <w:abstractNum w:abstractNumId="5" w15:restartNumberingAfterBreak="0">
-    <w:nsid w:val="2E790F10"/>
+    <w:nsid w:val="3C652011"/>
     <w:multiLevelType w:val="hybridMultilevel"/>
-    <w:tmpl w:val="3BE4F5FC"/>
-    <w:lvl w:ilvl="0" w:tplc="76180418">
+    <w:tmpl w:val="EC389E94"/>
+    <w:lvl w:ilvl="0" w:tplc="010ED312">
       <w:start w:val="1"/>
       <w:numFmt w:val="decimal"/>
       <w:lvlText w:val="%1."/>
@@ -9951,110 +10002,106 @@
         <w:ind w:left="460" w:hanging="320"/>
       </w:pPr>
     </w:lvl>
-    <w:lvl w:ilvl="1" w:tplc="8B886D76">
+    <w:lvl w:ilvl="1" w:tplc="E0BE52FE">
       <w:numFmt w:val="decimal"/>
       <w:lvlText w:val=""/>
       <w:lvlJc w:val="left"/>
     </w:lvl>
-    <w:lvl w:ilvl="2" w:tplc="B3289606">
+    <w:lvl w:ilvl="2" w:tplc="62BAFF64">
       <w:numFmt w:val="decimal"/>
       <w:lvlText w:val=""/>
       <w:lvlJc w:val="left"/>
     </w:lvl>
-    <w:lvl w:ilvl="3" w:tplc="FA6CAEF4">
+    <w:lvl w:ilvl="3" w:tplc="506488AA">
       <w:numFmt w:val="decimal"/>
       <w:lvlText w:val=""/>
       <w:lvlJc w:val="left"/>
     </w:lvl>
-    <w:lvl w:ilvl="4" w:tplc="3BEC5770">
+    <w:lvl w:ilvl="4" w:tplc="588452EA">
       <w:numFmt w:val="decimal"/>
       <w:lvlText w:val=""/>
       <w:lvlJc w:val="left"/>
     </w:lvl>
-    <w:lvl w:ilvl="5" w:tplc="ED100654">
+    <w:lvl w:ilvl="5" w:tplc="3C32CA28">
       <w:numFmt w:val="decimal"/>
       <w:lvlText w:val=""/>
       <w:lvlJc w:val="left"/>
     </w:lvl>
-    <w:lvl w:ilvl="6" w:tplc="2C46EADE">
+    <w:lvl w:ilvl="6" w:tplc="F39075CE">
       <w:numFmt w:val="decimal"/>
       <w:lvlText w:val=""/>
       <w:lvlJc w:val="left"/>
     </w:lvl>
-    <w:lvl w:ilvl="7" w:tplc="0AD012D2">
+    <w:lvl w:ilvl="7" w:tplc="BD74C274">
       <w:numFmt w:val="decimal"/>
       <w:lvlText w:val=""/>
       <w:lvlJc w:val="left"/>
     </w:lvl>
-    <w:lvl w:ilvl="8" w:tplc="43C0738E">
+    <w:lvl w:ilvl="8" w:tplc="684ED9CC">
       <w:numFmt w:val="decimal"/>
       <w:lvlText w:val=""/>
       <w:lvlJc w:val="left"/>
     </w:lvl>
   </w:abstractNum>
   <w:abstractNum w:abstractNumId="6" w15:restartNumberingAfterBreak="0">
-    <w:nsid w:val="3B671172"/>
+    <w:nsid w:val="48E123C0"/>
     <w:multiLevelType w:val="hybridMultilevel"/>
-    <w:tmpl w:val="10141B78"/>
-    <w:lvl w:ilvl="0" w:tplc="4342AC82">
+    <w:tmpl w:val="5A5C1094"/>
+    <w:lvl w:ilvl="0" w:tplc="62105D50">
       <w:start w:val="1"/>
-      <w:numFmt w:val="bullet"/>
-      <w:lvlText w:val="•"/>
+      <w:numFmt w:val="decimal"/>
+      <w:lvlText w:val="%1."/>
       <w:lvlJc w:val="left"/>
       <w:pPr>
-        <w:ind w:left="460" w:hanging="280"/>
+        <w:ind w:left="460" w:hanging="320"/>
       </w:pPr>
     </w:lvl>
-    <w:lvl w:ilvl="1" w:tplc="73F85752">
-      <w:start w:val="1"/>
-      <w:numFmt w:val="bullet"/>
-      <w:lvlText w:val="–"/>
-      <w:lvlJc w:val="left"/>
-      <w:pPr>
-        <w:ind w:left="900" w:hanging="280"/>
-      </w:pPr>
-    </w:lvl>
-    <w:lvl w:ilvl="2" w:tplc="64324824">
+    <w:lvl w:ilvl="1" w:tplc="55A0737E">
       <w:numFmt w:val="decimal"/>
       <w:lvlText w:val=""/>
       <w:lvlJc w:val="left"/>
     </w:lvl>
-    <w:lvl w:ilvl="3" w:tplc="FF8AE872">
+    <w:lvl w:ilvl="2" w:tplc="2DE2B196">
       <w:numFmt w:val="decimal"/>
       <w:lvlText w:val=""/>
       <w:lvlJc w:val="left"/>
     </w:lvl>
-    <w:lvl w:ilvl="4" w:tplc="1AA0C9A8">
+    <w:lvl w:ilvl="3" w:tplc="3D90395C">
       <w:numFmt w:val="decimal"/>
       <w:lvlText w:val=""/>
       <w:lvlJc w:val="left"/>
     </w:lvl>
-    <w:lvl w:ilvl="5" w:tplc="D0B2F248">
+    <w:lvl w:ilvl="4" w:tplc="081EEB58">
       <w:numFmt w:val="decimal"/>
       <w:lvlText w:val=""/>
       <w:lvlJc w:val="left"/>
     </w:lvl>
-    <w:lvl w:ilvl="6" w:tplc="4252D4E4">
+    <w:lvl w:ilvl="5" w:tplc="0DFE2AD4">
       <w:numFmt w:val="decimal"/>
       <w:lvlText w:val=""/>
       <w:lvlJc w:val="left"/>
     </w:lvl>
-    <w:lvl w:ilvl="7" w:tplc="B34AC3BA">
+    <w:lvl w:ilvl="6" w:tplc="4C1AF420">
       <w:numFmt w:val="decimal"/>
       <w:lvlText w:val=""/>
       <w:lvlJc w:val="left"/>
     </w:lvl>
-    <w:lvl w:ilvl="8" w:tplc="38B4C05E">
+    <w:lvl w:ilvl="7" w:tplc="38B62F68">
+      <w:numFmt w:val="decimal"/>
+      <w:lvlText w:val=""/>
+      <w:lvlJc w:val="left"/>
+    </w:lvl>
+    <w:lvl w:ilvl="8" w:tplc="09E4E572">
       <w:numFmt w:val="decimal"/>
       <w:lvlText w:val=""/>
       <w:lvlJc w:val="left"/>
     </w:lvl>
   </w:abstractNum>
   <w:abstractNum w:abstractNumId="7" w15:restartNumberingAfterBreak="0">
-    <w:nsid w:val="48355848"/>
+    <w:nsid w:val="67B023D2"/>
     <w:multiLevelType w:val="hybridMultilevel"/>
-    <w:tmpl w:val="F1A28CA8"/>
-    <w:lvl w:ilvl="0" w:tplc="75CEE13C">
+    <w:tmpl w:val="D7EC1DB6"/>
+    <w:lvl w:ilvl="0" w:tplc="3CFC0B4A">
       <w:start w:val="1"/>
       <w:numFmt w:val="decimal"/>
       <w:lvlText w:val="%1."/>
@@ -10063,52 +10110,52 @@
         <w:ind w:left="460" w:hanging="320"/>
       </w:pPr>
     </w:lvl>
-    <w:lvl w:ilvl="1" w:tplc="5C96502E">
+    <w:lvl w:ilvl="1" w:tplc="90628FFC">
       <w:numFmt w:val="decimal"/>
       <w:lvlText w:val=""/>
       <w:lvlJc w:val="left"/>
     </w:lvl>
-    <w:lvl w:ilvl="2" w:tplc="7DE8C300">
+    <w:lvl w:ilvl="2" w:tplc="4BFEE496">
       <w:numFmt w:val="decimal"/>
       <w:lvlText w:val=""/>
       <w:lvlJc w:val="left"/>
     </w:lvl>
-    <w:lvl w:ilvl="3" w:tplc="8BBAF8FC">
+    <w:lvl w:ilvl="3" w:tplc="CB7CF878">
       <w:numFmt w:val="decimal"/>
       <w:lvlText w:val=""/>
       <w:lvlJc w:val="left"/>
     </w:lvl>
-    <w:lvl w:ilvl="4" w:tplc="622223B6">
+    <w:lvl w:ilvl="4" w:tplc="CC18695E">
       <w:numFmt w:val="decimal"/>
       <w:lvlText w:val=""/>
       <w:lvlJc w:val="left"/>
     </w:lvl>
-    <w:lvl w:ilvl="5" w:tplc="55D2C204">
+    <w:lvl w:ilvl="5" w:tplc="9BB0570A">
       <w:numFmt w:val="decimal"/>
       <w:lvlText w:val=""/>
       <w:lvlJc w:val="left"/>
     </w:lvl>
-    <w:lvl w:ilvl="6" w:tplc="A2FAF270">
+    <w:lvl w:ilvl="6" w:tplc="7C36B2CA">
       <w:numFmt w:val="decimal"/>
       <w:lvlText w:val=""/>
       <w:lvlJc w:val="left"/>
     </w:lvl>
-    <w:lvl w:ilvl="7" w:tplc="4E92C754">
+    <w:lvl w:ilvl="7" w:tplc="8AC2CB64">
       <w:numFmt w:val="decimal"/>
       <w:lvlText w:val=""/>
       <w:lvlJc w:val="left"/>
     </w:lvl>
-    <w:lvl w:ilvl="8" w:tplc="5FEE914C">
+    <w:lvl w:ilvl="8" w:tplc="3CD08496">
       <w:numFmt w:val="decimal"/>
       <w:lvlText w:val=""/>
       <w:lvlJc w:val="left"/>
     </w:lvl>
   </w:abstractNum>
   <w:abstractNum w:abstractNumId="8" w15:restartNumberingAfterBreak="0">
-    <w:nsid w:val="4BA40AE5"/>
+    <w:nsid w:val="73B70137"/>
     <w:multiLevelType w:val="hybridMultilevel"/>
-    <w:tmpl w:val="3260D35A"/>
-    <w:lvl w:ilvl="0" w:tplc="9D58DB02">
+    <w:tmpl w:val="833C1216"/>
+    <w:lvl w:ilvl="0" w:tplc="1C286C4A">
       <w:start w:val="1"/>
       <w:numFmt w:val="decimal"/>
       <w:lvlText w:val="%1."/>
@@ -10117,52 +10164,52 @@
         <w:ind w:left="460" w:hanging="320"/>
       </w:pPr>
     </w:lvl>
-    <w:lvl w:ilvl="1" w:tplc="A01246EA">
+    <w:lvl w:ilvl="1" w:tplc="C89804FA">
       <w:numFmt w:val="decimal"/>
       <w:lvlText w:val=""/>
       <w:lvlJc w:val="left"/>
     </w:lvl>
-    <w:lvl w:ilvl="2" w:tplc="D30AD22A">
+    <w:lvl w:ilvl="2" w:tplc="3690B824">
       <w:numFmt w:val="decimal"/>
       <w:lvlText w:val=""/>
       <w:lvlJc w:val="left"/>
     </w:lvl>
-    <w:lvl w:ilvl="3" w:tplc="56103E2E">
+    <w:lvl w:ilvl="3" w:tplc="E1701718">
       <w:numFmt w:val="decimal"/>
       <w:lvlText w:val=""/>
       <w:lvlJc w:val="left"/>
     </w:lvl>
-    <w:lvl w:ilvl="4" w:tplc="E6BA1FA8">
+    <w:lvl w:ilvl="4" w:tplc="56DA470C">
       <w:numFmt w:val="decimal"/>
       <w:lvlText w:val=""/>
       <w:lvlJc w:val="left"/>
     </w:lvl>
-    <w:lvl w:ilvl="5" w:tplc="CDC45554">
+    <w:lvl w:ilvl="5" w:tplc="FA124A1A">
       <w:numFmt w:val="decimal"/>
       <w:lvlText w:val=""/>
       <w:lvlJc w:val="left"/>
     </w:lvl>
-    <w:lvl w:ilvl="6" w:tplc="10A6F88E">
+    <w:lvl w:ilvl="6" w:tplc="59C8CD7A">
       <w:numFmt w:val="decimal"/>
       <w:lvlText w:val=""/>
       <w:lvlJc w:val="left"/>
     </w:lvl>
-    <w:lvl w:ilvl="7" w:tplc="07D6E0DE">
+    <w:lvl w:ilvl="7" w:tplc="38EC00C0">
       <w:numFmt w:val="decimal"/>
       <w:lvlText w:val=""/>
       <w:lvlJc w:val="left"/>
     </w:lvl>
-    <w:lvl w:ilvl="8" w:tplc="5020631A">
+    <w:lvl w:ilvl="8" w:tplc="072EB87E">
       <w:numFmt w:val="decimal"/>
       <w:lvlText w:val=""/>
       <w:lvlJc w:val="left"/>
     </w:lvl>
   </w:abstractNum>
   <w:abstractNum w:abstractNumId="9" w15:restartNumberingAfterBreak="0">
-    <w:nsid w:val="7A597E78"/>
+    <w:nsid w:val="7F8C670E"/>
     <w:multiLevelType w:val="hybridMultilevel"/>
-    <w:tmpl w:val="12B4EEEC"/>
-    <w:lvl w:ilvl="0" w:tplc="74D69BB2">
+    <w:tmpl w:val="C862D1B0"/>
+    <w:lvl w:ilvl="0" w:tplc="DE3099A0">
       <w:start w:val="1"/>
       <w:numFmt w:val="decimal"/>
       <w:lvlText w:val="%1."/>
@@ -10171,103 +10218,103 @@
         <w:ind w:left="460" w:hanging="320"/>
       </w:pPr>
     </w:lvl>
-    <w:lvl w:ilvl="1" w:tplc="9F7861E8">
+    <w:lvl w:ilvl="1" w:tplc="26FA8B9A">
       <w:numFmt w:val="decimal"/>
       <w:lvlText w:val=""/>
       <w:lvlJc w:val="left"/>
     </w:lvl>
-    <w:lvl w:ilvl="2" w:tplc="9F505CAE">
+    <w:lvl w:ilvl="2" w:tplc="1C3808F2">
       <w:numFmt w:val="decimal"/>
       <w:lvlText w:val=""/>
       <w:lvlJc w:val="left"/>
     </w:lvl>
-    <w:lvl w:ilvl="3" w:tplc="F0127ADE">
+    <w:lvl w:ilvl="3" w:tplc="824ADA92">
       <w:numFmt w:val="decimal"/>
       <w:lvlText w:val=""/>
       <w:lvlJc w:val="left"/>
     </w:lvl>
-    <w:lvl w:ilvl="4" w:tplc="31D06092">
+    <w:lvl w:ilvl="4" w:tplc="C76614DA">
       <w:numFmt w:val="decimal"/>
       <w:lvlText w:val=""/>
       <w:lvlJc w:val="left"/>
     </w:lvl>
-    <w:lvl w:ilvl="5" w:tplc="31CE2F6C">
+    <w:lvl w:ilvl="5" w:tplc="683A04C8">
       <w:numFmt w:val="decimal"/>
       <w:lvlText w:val=""/>
       <w:lvlJc w:val="left"/>
     </w:lvl>
-    <w:lvl w:ilvl="6" w:tplc="BB26154C">
+    <w:lvl w:ilvl="6" w:tplc="EC68FAE6">
       <w:numFmt w:val="decimal"/>
       <w:lvlText w:val=""/>
       <w:lvlJc w:val="left"/>
     </w:lvl>
-    <w:lvl w:ilvl="7" w:tplc="740A451A">
+    <w:lvl w:ilvl="7" w:tplc="01822F34">
       <w:numFmt w:val="decimal"/>
       <w:lvlText w:val=""/>
       <w:lvlJc w:val="left"/>
     </w:lvl>
-    <w:lvl w:ilvl="8" w:tplc="6D4A06CE">
+    <w:lvl w:ilvl="8" w:tplc="68CAA0D8">
       <w:numFmt w:val="decimal"/>
       <w:lvlText w:val=""/>
       <w:lvlJc w:val="left"/>
     </w:lvl>
   </w:abstractNum>
-  <w:num w:numId="1" w16cid:durableId="1712877002">
+  <w:num w:numId="1" w16cid:durableId="1781297818">
     <w:abstractNumId w:val="3"/>
     <w:lvlOverride w:ilvl="0">
       <w:startOverride w:val="1"/>
     </w:lvlOverride>
   </w:num>
-  <w:num w:numId="2" w16cid:durableId="1646009527">
+  <w:num w:numId="2" w16cid:durableId="398136667">
+    <w:abstractNumId w:val="4"/>
+    <w:lvlOverride w:ilvl="0">
+      <w:startOverride w:val="1"/>
+    </w:lvlOverride>
+  </w:num>
+  <w:num w:numId="3" w16cid:durableId="1678532624">
+    <w:abstractNumId w:val="5"/>
+    <w:lvlOverride w:ilvl="0">
+      <w:startOverride w:val="1"/>
+    </w:lvlOverride>
+  </w:num>
+  <w:num w:numId="4" w16cid:durableId="1760172529">
+    <w:abstractNumId w:val="9"/>
+    <w:lvlOverride w:ilvl="0">
+      <w:startOverride w:val="1"/>
+    </w:lvlOverride>
+  </w:num>
+  <w:num w:numId="5" w16cid:durableId="328678693">
+    <w:abstractNumId w:val="7"/>
+    <w:lvlOverride w:ilvl="0">
+      <w:startOverride w:val="1"/>
+    </w:lvlOverride>
+  </w:num>
+  <w:num w:numId="6" w16cid:durableId="704331121">
     <w:abstractNumId w:val="6"/>
     <w:lvlOverride w:ilvl="0">
       <w:startOverride w:val="1"/>
     </w:lvlOverride>
   </w:num>
-  <w:num w:numId="3" w16cid:durableId="506287033">
+  <w:num w:numId="7" w16cid:durableId="543450951">
+    <w:abstractNumId w:val="2"/>
+    <w:lvlOverride w:ilvl="0">
+      <w:startOverride w:val="1"/>
+    </w:lvlOverride>
+  </w:num>
+  <w:num w:numId="8" w16cid:durableId="958952198">
     <w:abstractNumId w:val="0"/>
     <w:lvlOverride w:ilvl="0">
       <w:startOverride w:val="1"/>
     </w:lvlOverride>
   </w:num>
-  <w:num w:numId="4" w16cid:durableId="338625903">
+  <w:num w:numId="9" w16cid:durableId="1478761266">
     <w:abstractNumId w:val="1"/>
     <w:lvlOverride w:ilvl="0">
       <w:startOverride w:val="1"/>
     </w:lvlOverride>
   </w:num>
-  <w:num w:numId="5" w16cid:durableId="1935287302">
+  <w:num w:numId="10" w16cid:durableId="1213733007">
     <w:abstractNumId w:val="8"/>
-    <w:lvlOverride w:ilvl="0">
-      <w:startOverride w:val="1"/>
-    </w:lvlOverride>
-  </w:num>
-  <w:num w:numId="6" w16cid:durableId="1543052151">
-    <w:abstractNumId w:val="9"/>
-    <w:lvlOverride w:ilvl="0">
-      <w:startOverride w:val="1"/>
-    </w:lvlOverride>
-  </w:num>
-  <w:num w:numId="7" w16cid:durableId="153230216">
-    <w:abstractNumId w:val="5"/>
-    <w:lvlOverride w:ilvl="0">
-      <w:startOverride w:val="1"/>
-    </w:lvlOverride>
-  </w:num>
-  <w:num w:numId="8" w16cid:durableId="1088507020">
-    <w:abstractNumId w:val="7"/>
-    <w:lvlOverride w:ilvl="0">
-      <w:startOverride w:val="1"/>
-    </w:lvlOverride>
-  </w:num>
-  <w:num w:numId="9" w16cid:durableId="1699238009">
-    <w:abstractNumId w:val="2"/>
-    <w:lvlOverride w:ilvl="0">
-      <w:startOverride w:val="1"/>
-    </w:lvlOverride>
-  </w:num>
-  <w:num w:numId="10" w16cid:durableId="705564786">
-    <w:abstractNumId w:val="4"/>
     <w:lvlOverride w:ilvl="0">
       <w:startOverride w:val="1"/>
     </w:lvlOverride>
@@ -10887,7 +10934,7 @@
     <w:autoRedefine/>
     <w:uiPriority w:val="39"/>
     <w:unhideWhenUsed/>
-    <w:rsid w:val="00C85822"/>
+    <w:rsid w:val="006D413F"/>
     <w:pPr>
       <w:spacing w:after="100"/>
     </w:pPr>

</xml_diff>

<commit_message>
Manual: botones de IA, tiempo de espera y aviso de cuota
Co-Authored-By: Claude Opus 5 <noreply@anthropic.com>
</commit_message>
<xml_diff>
--- a/docs/gasco/Manual_de_uso_PMS_SIMARP.docx
+++ b/docs/gasco/Manual_de_uso_PMS_SIMARP.docx
@@ -115,7 +115,7 @@
     <w:sdt>
       <w:sdtPr>
         <w:alias w:val="Contenido"/>
-        <w:id w:val="1777201287"/>
+        <w:id w:val="-400134232"/>
       </w:sdtPr>
       <w:sdtEndPr/>
       <w:sdtContent>
@@ -143,7 +143,7 @@
           <w:r>
             <w:fldChar w:fldCharType="separate"/>
           </w:r>
-          <w:hyperlink w:anchor="_Toc240932412" w:history="1">
+          <w:hyperlink w:anchor="_Toc240935196" w:history="1">
             <w:r>
               <w:rPr>
                 <w:rStyle w:val="Hipervnculo"/>
@@ -167,7 +167,7 @@
               <w:rPr>
                 <w:noProof/>
               </w:rPr>
-              <w:instrText xml:space="preserve"> PAGEREF _Toc240932412 \h </w:instrText>
+              <w:instrText xml:space="preserve"> PAGEREF _Toc240935196 \h </w:instrText>
             </w:r>
             <w:r>
               <w:rPr>
@@ -209,7 +209,7 @@
               <w14:ligatures w14:val="standardContextual"/>
             </w:rPr>
           </w:pPr>
-          <w:hyperlink w:anchor="_Toc240932413" w:history="1">
+          <w:hyperlink w:anchor="_Toc240935197" w:history="1">
             <w:r>
               <w:rPr>
                 <w:rStyle w:val="Hipervnculo"/>
@@ -233,7 +233,7 @@
               <w:rPr>
                 <w:noProof/>
               </w:rPr>
-              <w:instrText xml:space="preserve"> PAGEREF _Toc240932413 \h </w:instrText>
+              <w:instrText xml:space="preserve"> PAGEREF _Toc240935197 \h </w:instrText>
             </w:r>
             <w:r>
               <w:rPr>
@@ -275,7 +275,7 @@
               <w14:ligatures w14:val="standardContextual"/>
             </w:rPr>
           </w:pPr>
-          <w:hyperlink w:anchor="_Toc240932414" w:history="1">
+          <w:hyperlink w:anchor="_Toc240935198" w:history="1">
             <w:r>
               <w:rPr>
                 <w:rStyle w:val="Hipervnculo"/>
@@ -299,7 +299,7 @@
               <w:rPr>
                 <w:noProof/>
               </w:rPr>
-              <w:instrText xml:space="preserve"> PAGEREF _Toc240932414 \h </w:instrText>
+              <w:instrText xml:space="preserve"> PAGEREF _Toc240935198 \h </w:instrText>
             </w:r>
             <w:r>
               <w:rPr>
@@ -341,7 +341,7 @@
               <w14:ligatures w14:val="standardContextual"/>
             </w:rPr>
           </w:pPr>
-          <w:hyperlink w:anchor="_Toc240932415" w:history="1">
+          <w:hyperlink w:anchor="_Toc240935199" w:history="1">
             <w:r>
               <w:rPr>
                 <w:rStyle w:val="Hipervnculo"/>
@@ -365,7 +365,7 @@
               <w:rPr>
                 <w:noProof/>
               </w:rPr>
-              <w:instrText xml:space="preserve"> PAGEREF _Toc240932415 \h </w:instrText>
+              <w:instrText xml:space="preserve"> PAGEREF _Toc240935199 \h </w:instrText>
             </w:r>
             <w:r>
               <w:rPr>
@@ -407,7 +407,7 @@
               <w14:ligatures w14:val="standardContextual"/>
             </w:rPr>
           </w:pPr>
-          <w:hyperlink w:anchor="_Toc240932416" w:history="1">
+          <w:hyperlink w:anchor="_Toc240935200" w:history="1">
             <w:r>
               <w:rPr>
                 <w:rStyle w:val="Hipervnculo"/>
@@ -431,7 +431,7 @@
               <w:rPr>
                 <w:noProof/>
               </w:rPr>
-              <w:instrText xml:space="preserve"> PAGEREF _Toc240932416 \h </w:instrText>
+              <w:instrText xml:space="preserve"> PAGEREF _Toc240935200 \h </w:instrText>
             </w:r>
             <w:r>
               <w:rPr>
@@ -473,7 +473,7 @@
               <w14:ligatures w14:val="standardContextual"/>
             </w:rPr>
           </w:pPr>
-          <w:hyperlink w:anchor="_Toc240932417" w:history="1">
+          <w:hyperlink w:anchor="_Toc240935201" w:history="1">
             <w:r>
               <w:rPr>
                 <w:rStyle w:val="Hipervnculo"/>
@@ -497,7 +497,7 @@
               <w:rPr>
                 <w:noProof/>
               </w:rPr>
-              <w:instrText xml:space="preserve"> PAGEREF _Toc240932417 \h </w:instrText>
+              <w:instrText xml:space="preserve"> PAGEREF _Toc240935201 \h </w:instrText>
             </w:r>
             <w:r>
               <w:rPr>
@@ -539,7 +539,7 @@
               <w14:ligatures w14:val="standardContextual"/>
             </w:rPr>
           </w:pPr>
-          <w:hyperlink w:anchor="_Toc240932418" w:history="1">
+          <w:hyperlink w:anchor="_Toc240935202" w:history="1">
             <w:r>
               <w:rPr>
                 <w:rStyle w:val="Hipervnculo"/>
@@ -563,7 +563,7 @@
               <w:rPr>
                 <w:noProof/>
               </w:rPr>
-              <w:instrText xml:space="preserve"> PAGEREF _Toc240932418 \h </w:instrText>
+              <w:instrText xml:space="preserve"> PAGEREF _Toc240935202 \h </w:instrText>
             </w:r>
             <w:r>
               <w:rPr>
@@ -605,7 +605,7 @@
               <w14:ligatures w14:val="standardContextual"/>
             </w:rPr>
           </w:pPr>
-          <w:hyperlink w:anchor="_Toc240932419" w:history="1">
+          <w:hyperlink w:anchor="_Toc240935203" w:history="1">
             <w:r>
               <w:rPr>
                 <w:rStyle w:val="Hipervnculo"/>
@@ -629,7 +629,7 @@
               <w:rPr>
                 <w:noProof/>
               </w:rPr>
-              <w:instrText xml:space="preserve"> PAGEREF _Toc240932419 \h </w:instrText>
+              <w:instrText xml:space="preserve"> PAGEREF _Toc240935203 \h </w:instrText>
             </w:r>
             <w:r>
               <w:rPr>
@@ -671,7 +671,7 @@
               <w14:ligatures w14:val="standardContextual"/>
             </w:rPr>
           </w:pPr>
-          <w:hyperlink w:anchor="_Toc240932420" w:history="1">
+          <w:hyperlink w:anchor="_Toc240935204" w:history="1">
             <w:r>
               <w:rPr>
                 <w:rStyle w:val="Hipervnculo"/>
@@ -695,7 +695,7 @@
               <w:rPr>
                 <w:noProof/>
               </w:rPr>
-              <w:instrText xml:space="preserve"> PAGEREF _Toc240932420 \h </w:instrText>
+              <w:instrText xml:space="preserve"> PAGEREF _Toc240935204 \h </w:instrText>
             </w:r>
             <w:r>
               <w:rPr>
@@ -737,7 +737,7 @@
               <w14:ligatures w14:val="standardContextual"/>
             </w:rPr>
           </w:pPr>
-          <w:hyperlink w:anchor="_Toc240932421" w:history="1">
+          <w:hyperlink w:anchor="_Toc240935205" w:history="1">
             <w:r>
               <w:rPr>
                 <w:rStyle w:val="Hipervnculo"/>
@@ -761,7 +761,7 @@
               <w:rPr>
                 <w:noProof/>
               </w:rPr>
-              <w:instrText xml:space="preserve"> PAGEREF _Toc240932421 \h </w:instrText>
+              <w:instrText xml:space="preserve"> PAGEREF _Toc240935205 \h </w:instrText>
             </w:r>
             <w:r>
               <w:rPr>
@@ -803,7 +803,7 @@
               <w14:ligatures w14:val="standardContextual"/>
             </w:rPr>
           </w:pPr>
-          <w:hyperlink w:anchor="_Toc240932422" w:history="1">
+          <w:hyperlink w:anchor="_Toc240935206" w:history="1">
             <w:r>
               <w:rPr>
                 <w:rStyle w:val="Hipervnculo"/>
@@ -827,7 +827,7 @@
               <w:rPr>
                 <w:noProof/>
               </w:rPr>
-              <w:instrText xml:space="preserve"> PAGEREF _Toc240932422 \h </w:instrText>
+              <w:instrText xml:space="preserve"> PAGEREF _Toc240935206 \h </w:instrText>
             </w:r>
             <w:r>
               <w:rPr>
@@ -869,7 +869,7 @@
               <w14:ligatures w14:val="standardContextual"/>
             </w:rPr>
           </w:pPr>
-          <w:hyperlink w:anchor="_Toc240932423" w:history="1">
+          <w:hyperlink w:anchor="_Toc240935207" w:history="1">
             <w:r>
               <w:rPr>
                 <w:rStyle w:val="Hipervnculo"/>
@@ -893,7 +893,7 @@
               <w:rPr>
                 <w:noProof/>
               </w:rPr>
-              <w:instrText xml:space="preserve"> PAGEREF _Toc240932423 \h </w:instrText>
+              <w:instrText xml:space="preserve"> PAGEREF _Toc240935207 \h </w:instrText>
             </w:r>
             <w:r>
               <w:rPr>
@@ -935,7 +935,7 @@
               <w14:ligatures w14:val="standardContextual"/>
             </w:rPr>
           </w:pPr>
-          <w:hyperlink w:anchor="_Toc240932424" w:history="1">
+          <w:hyperlink w:anchor="_Toc240935208" w:history="1">
             <w:r>
               <w:rPr>
                 <w:rStyle w:val="Hipervnculo"/>
@@ -959,7 +959,7 @@
               <w:rPr>
                 <w:noProof/>
               </w:rPr>
-              <w:instrText xml:space="preserve"> PAGEREF _Toc240932424 \h </w:instrText>
+              <w:instrText xml:space="preserve"> PAGEREF _Toc240935208 \h </w:instrText>
             </w:r>
             <w:r>
               <w:rPr>
@@ -1001,7 +1001,7 @@
               <w14:ligatures w14:val="standardContextual"/>
             </w:rPr>
           </w:pPr>
-          <w:hyperlink w:anchor="_Toc240932425" w:history="1">
+          <w:hyperlink w:anchor="_Toc240935209" w:history="1">
             <w:r>
               <w:rPr>
                 <w:rStyle w:val="Hipervnculo"/>
@@ -1025,7 +1025,7 @@
               <w:rPr>
                 <w:noProof/>
               </w:rPr>
-              <w:instrText xml:space="preserve"> PAGEREF _Toc240932425 \h </w:instrText>
+              <w:instrText xml:space="preserve"> PAGEREF _Toc240935209 \h </w:instrText>
             </w:r>
             <w:r>
               <w:rPr>
@@ -1067,7 +1067,7 @@
               <w14:ligatures w14:val="standardContextual"/>
             </w:rPr>
           </w:pPr>
-          <w:hyperlink w:anchor="_Toc240932426" w:history="1">
+          <w:hyperlink w:anchor="_Toc240935210" w:history="1">
             <w:r>
               <w:rPr>
                 <w:rStyle w:val="Hipervnculo"/>
@@ -1091,7 +1091,7 @@
               <w:rPr>
                 <w:noProof/>
               </w:rPr>
-              <w:instrText xml:space="preserve"> PAGEREF _Toc240932426 \h </w:instrText>
+              <w:instrText xml:space="preserve"> PAGEREF _Toc240935210 \h </w:instrText>
             </w:r>
             <w:r>
               <w:rPr>
@@ -1133,7 +1133,7 @@
               <w14:ligatures w14:val="standardContextual"/>
             </w:rPr>
           </w:pPr>
-          <w:hyperlink w:anchor="_Toc240932427" w:history="1">
+          <w:hyperlink w:anchor="_Toc240935211" w:history="1">
             <w:r>
               <w:rPr>
                 <w:rStyle w:val="Hipervnculo"/>
@@ -1157,7 +1157,7 @@
               <w:rPr>
                 <w:noProof/>
               </w:rPr>
-              <w:instrText xml:space="preserve"> PAGEREF _Toc240932427 \h </w:instrText>
+              <w:instrText xml:space="preserve"> PAGEREF _Toc240935211 \h </w:instrText>
             </w:r>
             <w:r>
               <w:rPr>
@@ -1199,7 +1199,7 @@
               <w14:ligatures w14:val="standardContextual"/>
             </w:rPr>
           </w:pPr>
-          <w:hyperlink w:anchor="_Toc240932428" w:history="1">
+          <w:hyperlink w:anchor="_Toc240935212" w:history="1">
             <w:r>
               <w:rPr>
                 <w:rStyle w:val="Hipervnculo"/>
@@ -1223,7 +1223,7 @@
               <w:rPr>
                 <w:noProof/>
               </w:rPr>
-              <w:instrText xml:space="preserve"> PAGEREF _Toc240932428 \h </w:instrText>
+              <w:instrText xml:space="preserve"> PAGEREF _Toc240935212 \h </w:instrText>
             </w:r>
             <w:r>
               <w:rPr>
@@ -1265,7 +1265,7 @@
               <w14:ligatures w14:val="standardContextual"/>
             </w:rPr>
           </w:pPr>
-          <w:hyperlink w:anchor="_Toc240932429" w:history="1">
+          <w:hyperlink w:anchor="_Toc240935213" w:history="1">
             <w:r>
               <w:rPr>
                 <w:rStyle w:val="Hipervnculo"/>
@@ -1289,7 +1289,7 @@
               <w:rPr>
                 <w:noProof/>
               </w:rPr>
-              <w:instrText xml:space="preserve"> PAGEREF _Toc240932429 \h </w:instrText>
+              <w:instrText xml:space="preserve"> PAGEREF _Toc240935213 \h </w:instrText>
             </w:r>
             <w:r>
               <w:rPr>
@@ -1328,7 +1328,7 @@
         <w:pStyle w:val="Ttulo1"/>
         <w:pageBreakBefore/>
       </w:pPr>
-      <w:bookmarkStart w:id="0" w:name="_Toc240932412"/>
+      <w:bookmarkStart w:id="0" w:name="_Toc240935196"/>
       <w:r>
         <w:lastRenderedPageBreak/>
         <w:t>1. Qué es PMS SIMARP</w:t>
@@ -1525,7 +1525,7 @@
         <w:pStyle w:val="Ttulo1"/>
         <w:pageBreakBefore/>
       </w:pPr>
-      <w:bookmarkStart w:id="1" w:name="_Toc240932413"/>
+      <w:bookmarkStart w:id="1" w:name="_Toc240935197"/>
       <w:r>
         <w:lastRenderedPageBreak/>
         <w:t>2. Primeros pasos</w:t>
@@ -1818,7 +1818,7 @@
         <w:pStyle w:val="Ttulo1"/>
         <w:pageBreakBefore/>
       </w:pPr>
-      <w:bookmarkStart w:id="2" w:name="_Toc240932414"/>
+      <w:bookmarkStart w:id="2" w:name="_Toc240935198"/>
       <w:r>
         <w:lastRenderedPageBreak/>
         <w:t>3. Roles y permisos</w:t>
@@ -1848,7 +1848,7 @@
           <w:left w:w="10" w:type="dxa"/>
           <w:right w:w="10" w:type="dxa"/>
         </w:tblCellMar>
-        <w:tblLook w:val="04A0" w:firstRow="1" w:lastRow="0" w:firstColumn="1" w:lastColumn="0" w:noHBand="0" w:noVBand="1"/>
+        <w:tblLook w:val="0000" w:firstRow="0" w:lastRow="0" w:firstColumn="0" w:lastColumn="0" w:noHBand="0" w:noVBand="0"/>
       </w:tblPr>
       <w:tblGrid>
         <w:gridCol w:w="2200"/>
@@ -2274,7 +2274,7 @@
         <w:pStyle w:val="Ttulo1"/>
         <w:pageBreakBefore/>
       </w:pPr>
-      <w:bookmarkStart w:id="3" w:name="_Toc240932415"/>
+      <w:bookmarkStart w:id="3" w:name="_Toc240935199"/>
       <w:r>
         <w:lastRenderedPageBreak/>
         <w:t>4. Dashboard de mantenimiento</w:t>
@@ -2304,7 +2304,7 @@
           <w:left w:w="10" w:type="dxa"/>
           <w:right w:w="10" w:type="dxa"/>
         </w:tblCellMar>
-        <w:tblLook w:val="04A0" w:firstRow="1" w:lastRow="0" w:firstColumn="1" w:lastColumn="0" w:noHBand="0" w:noVBand="1"/>
+        <w:tblLook w:val="0000" w:firstRow="0" w:lastRow="0" w:firstColumn="0" w:lastColumn="0" w:noHBand="0" w:noVBand="0"/>
       </w:tblPr>
       <w:tblGrid>
         <w:gridCol w:w="1900"/>
@@ -3104,7 +3104,7 @@
         <w:pStyle w:val="Ttulo1"/>
         <w:pageBreakBefore/>
       </w:pPr>
-      <w:bookmarkStart w:id="4" w:name="_Toc240932416"/>
+      <w:bookmarkStart w:id="4" w:name="_Toc240935200"/>
       <w:r>
         <w:lastRenderedPageBreak/>
         <w:t>5. Activos</w:t>
@@ -3152,7 +3152,7 @@
           <w:left w:w="10" w:type="dxa"/>
           <w:right w:w="10" w:type="dxa"/>
         </w:tblCellMar>
-        <w:tblLook w:val="04A0" w:firstRow="1" w:lastRow="0" w:firstColumn="1" w:lastColumn="0" w:noHBand="0" w:noVBand="1"/>
+        <w:tblLook w:val="0000" w:firstRow="0" w:lastRow="0" w:firstColumn="0" w:lastColumn="0" w:noHBand="0" w:noVBand="0"/>
       </w:tblPr>
       <w:tblGrid>
         <w:gridCol w:w="2800"/>
@@ -3999,7 +3999,7 @@
         <w:pStyle w:val="Ttulo1"/>
         <w:pageBreakBefore/>
       </w:pPr>
-      <w:bookmarkStart w:id="5" w:name="_Toc240932417"/>
+      <w:bookmarkStart w:id="5" w:name="_Toc240935201"/>
       <w:r>
         <w:lastRenderedPageBreak/>
         <w:t>6. Órdenes de trabajo</w:t>
@@ -4037,7 +4037,7 @@
           <w:left w:w="10" w:type="dxa"/>
           <w:right w:w="10" w:type="dxa"/>
         </w:tblCellMar>
-        <w:tblLook w:val="04A0" w:firstRow="1" w:lastRow="0" w:firstColumn="1" w:lastColumn="0" w:noHBand="0" w:noVBand="1"/>
+        <w:tblLook w:val="0000" w:firstRow="0" w:lastRow="0" w:firstColumn="0" w:lastColumn="0" w:noHBand="0" w:noVBand="0"/>
       </w:tblPr>
       <w:tblGrid>
         <w:gridCol w:w="2200"/>
@@ -4739,7 +4739,7 @@
         <w:pStyle w:val="Ttulo1"/>
         <w:pageBreakBefore/>
       </w:pPr>
-      <w:bookmarkStart w:id="6" w:name="_Toc240932418"/>
+      <w:bookmarkStart w:id="6" w:name="_Toc240935202"/>
       <w:r>
         <w:lastRenderedPageBreak/>
         <w:t>7. Ejecutar una rutina preventiva</w:t>
@@ -5140,7 +5140,7 @@
         <w:pStyle w:val="Ttulo1"/>
         <w:pageBreakBefore/>
       </w:pPr>
-      <w:bookmarkStart w:id="7" w:name="_Toc240932419"/>
+      <w:bookmarkStart w:id="7" w:name="_Toc240935203"/>
       <w:r>
         <w:lastRenderedPageBreak/>
         <w:t>8. Aprobación del trabajo</w:t>
@@ -5218,7 +5218,7 @@
         <w:pStyle w:val="Ttulo1"/>
         <w:pageBreakBefore/>
       </w:pPr>
-      <w:bookmarkStart w:id="8" w:name="_Toc240932420"/>
+      <w:bookmarkStart w:id="8" w:name="_Toc240935204"/>
       <w:r>
         <w:lastRenderedPageBreak/>
         <w:t>9. Plan preventivo</w:t>
@@ -5266,7 +5266,7 @@
           <w:left w:w="10" w:type="dxa"/>
           <w:right w:w="10" w:type="dxa"/>
         </w:tblCellMar>
-        <w:tblLook w:val="04A0" w:firstRow="1" w:lastRow="0" w:firstColumn="1" w:lastColumn="0" w:noHBand="0" w:noVBand="1"/>
+        <w:tblLook w:val="0000" w:firstRow="0" w:lastRow="0" w:firstColumn="0" w:lastColumn="0" w:noHBand="0" w:noVBand="0"/>
       </w:tblPr>
       <w:tblGrid>
         <w:gridCol w:w="2600"/>
@@ -5651,7 +5651,7 @@
         <w:pStyle w:val="Ttulo1"/>
         <w:pageBreakBefore/>
       </w:pPr>
-      <w:bookmarkStart w:id="9" w:name="_Toc240932421"/>
+      <w:bookmarkStart w:id="9" w:name="_Toc240935205"/>
       <w:r>
         <w:lastRenderedPageBreak/>
         <w:t>10. Horómetros</w:t>
@@ -5738,7 +5738,7 @@
         <w:pStyle w:val="Ttulo1"/>
         <w:pageBreakBefore/>
       </w:pPr>
-      <w:bookmarkStart w:id="10" w:name="_Toc240932422"/>
+      <w:bookmarkStart w:id="10" w:name="_Toc240935206"/>
       <w:r>
         <w:lastRenderedPageBreak/>
         <w:t>11. Priorización asistida por IA</w:t>
@@ -5786,7 +5786,7 @@
           <w:left w:w="10" w:type="dxa"/>
           <w:right w:w="10" w:type="dxa"/>
         </w:tblCellMar>
-        <w:tblLook w:val="04A0" w:firstRow="1" w:lastRow="0" w:firstColumn="1" w:lastColumn="0" w:noHBand="0" w:noVBand="1"/>
+        <w:tblLook w:val="0000" w:firstRow="0" w:lastRow="0" w:firstColumn="0" w:lastColumn="0" w:noHBand="0" w:noVBand="0"/>
       </w:tblPr>
       <w:tblGrid>
         <w:gridCol w:w="700"/>
@@ -6444,7 +6444,17 @@
         <w:spacing w:after="120" w:line="290" w:lineRule="auto"/>
       </w:pPr>
       <w:r>
-        <w:t xml:space="preserve">Al pulsar el botón de análisis, la IA revisa las órdenes, redacta un </w:t>
+        <w:t xml:space="preserve">Al pulsar </w:t>
+      </w:r>
+      <w:r>
+        <w:rPr>
+          <w:b/>
+          <w:bCs/>
+        </w:rPr>
+        <w:t>Priorizar con IA</w:t>
+      </w:r>
+      <w:r>
+        <w:t xml:space="preserve">, la IA revisa las órdenes, redacta un </w:t>
       </w:r>
       <w:r>
         <w:rPr>
@@ -6455,6 +6465,14 @@
       </w:r>
       <w:r>
         <w:t xml:space="preserve"> y explica por qué propone cada orden. Puede reordenar dentro de una misma categoría o subir una prioridad, pero nunca bajar lo que fijó una regla.</w:t>
+      </w:r>
+    </w:p>
+    <w:p>
+      <w:pPr>
+        <w:spacing w:after="120" w:line="290" w:lineRule="auto"/>
+      </w:pPr>
+      <w:r>
+        <w:t>El análisis puede tardar uno o dos minutos: la IA consulta el historial de los equipos antes de responder. La pantalla muestra siempre el último análisis realizado, con su fecha.</w:t>
       </w:r>
     </w:p>
     <w:p>
@@ -6483,7 +6501,7 @@
         <w:pStyle w:val="Ttulo1"/>
         <w:pageBreakBefore/>
       </w:pPr>
-      <w:bookmarkStart w:id="11" w:name="_Toc240932423"/>
+      <w:bookmarkStart w:id="11" w:name="_Toc240935207"/>
       <w:r>
         <w:lastRenderedPageBreak/>
         <w:t>12. Análisis de causa raíz</w:t>
@@ -6573,7 +6591,17 @@
         <w:spacing w:after="120" w:line="290" w:lineRule="auto"/>
       </w:pPr>
       <w:r>
-        <w:t>Para cada patrón, la IA propone hipótesis de causa a partir de la evidencia: los diagnósticos, las mediciones y los pasos no conformes.</w:t>
+        <w:t xml:space="preserve">Al pulsar </w:t>
+      </w:r>
+      <w:r>
+        <w:rPr>
+          <w:b/>
+          <w:bCs/>
+        </w:rPr>
+        <w:t>Analizar causa raíz</w:t>
+      </w:r>
+      <w:r>
+        <w:t>, la IA propone hipótesis de causa para cada patrón a partir de la evidencia: los diagnósticos, las mediciones y los pasos no conformes. También puede tardar uno o dos minutos.</w:t>
       </w:r>
     </w:p>
     <w:p>
@@ -6601,7 +6629,7 @@
           <w:noProof/>
         </w:rPr>
         <w:drawing>
-          <wp:inline distT="0" distB="0" distL="0" distR="0" wp14:anchorId="66D8BDF0" wp14:editId="23FB924E">
+          <wp:inline distT="0" distB="0" distL="0" distR="0" wp14:anchorId="7A3ABCC9" wp14:editId="3A6961A2">
             <wp:extent cx="5524500" cy="3238500"/>
             <wp:effectExtent l="0" t="0" r="0" b="0"/>
             <wp:docPr id="1" name="Imagen 1"/>
@@ -6661,7 +6689,7 @@
         <w:pStyle w:val="Ttulo1"/>
         <w:pageBreakBefore/>
       </w:pPr>
-      <w:bookmarkStart w:id="12" w:name="_Toc240932424"/>
+      <w:bookmarkStart w:id="12" w:name="_Toc240935208"/>
       <w:r>
         <w:lastRenderedPageBreak/>
         <w:t>13. Reportes</w:t>
@@ -6760,7 +6788,7 @@
         <w:pStyle w:val="Ttulo1"/>
         <w:pageBreakBefore/>
       </w:pPr>
-      <w:bookmarkStart w:id="13" w:name="_Toc240932425"/>
+      <w:bookmarkStart w:id="13" w:name="_Toc240935209"/>
       <w:r>
         <w:lastRenderedPageBreak/>
         <w:t>14. Importar desde Excel</w:t>
@@ -6872,7 +6900,7 @@
           <w:left w:w="10" w:type="dxa"/>
           <w:right w:w="10" w:type="dxa"/>
         </w:tblCellMar>
-        <w:tblLook w:val="04A0" w:firstRow="1" w:lastRow="0" w:firstColumn="1" w:lastColumn="0" w:noHBand="0" w:noVBand="1"/>
+        <w:tblLook w:val="0000" w:firstRow="0" w:lastRow="0" w:firstColumn="0" w:lastColumn="0" w:noHBand="0" w:noVBand="0"/>
       </w:tblPr>
       <w:tblGrid>
         <w:gridCol w:w="3300"/>
@@ -7576,7 +7604,7 @@
         <w:pStyle w:val="Ttulo1"/>
         <w:pageBreakBefore/>
       </w:pPr>
-      <w:bookmarkStart w:id="14" w:name="_Toc240932426"/>
+      <w:bookmarkStart w:id="14" w:name="_Toc240935210"/>
       <w:r>
         <w:lastRenderedPageBreak/>
         <w:t>15. Administración de la instalación</w:t>
@@ -7774,7 +7802,7 @@
         <w:pStyle w:val="Ttulo1"/>
         <w:pageBreakBefore/>
       </w:pPr>
-      <w:bookmarkStart w:id="15" w:name="_Toc240932427"/>
+      <w:bookmarkStart w:id="15" w:name="_Toc240935211"/>
       <w:r>
         <w:lastRenderedPageBreak/>
         <w:t>16. Trazabilidad e historial</w:t>
@@ -7814,7 +7842,7 @@
           <w:left w:w="10" w:type="dxa"/>
           <w:right w:w="10" w:type="dxa"/>
         </w:tblCellMar>
-        <w:tblLook w:val="04A0" w:firstRow="1" w:lastRow="0" w:firstColumn="1" w:lastColumn="0" w:noHBand="0" w:noVBand="1"/>
+        <w:tblLook w:val="0000" w:firstRow="0" w:lastRow="0" w:firstColumn="0" w:lastColumn="0" w:noHBand="0" w:noVBand="0"/>
       </w:tblPr>
       <w:tblGrid>
         <w:gridCol w:w="3300"/>
@@ -8274,7 +8302,7 @@
         <w:pStyle w:val="Ttulo1"/>
         <w:pageBreakBefore/>
       </w:pPr>
-      <w:bookmarkStart w:id="16" w:name="_Toc240932428"/>
+      <w:bookmarkStart w:id="16" w:name="_Toc240935212"/>
       <w:r>
         <w:lastRenderedPageBreak/>
         <w:t>17. Preguntas frecuentes</w:t>
@@ -8386,6 +8414,22 @@
         <w:pStyle w:val="Ttulo3"/>
       </w:pPr>
       <w:r>
+        <w:t>Aparece «Se agotó la cuota de la API de Gemini».</w:t>
+      </w:r>
+    </w:p>
+    <w:p>
+      <w:pPr>
+        <w:spacing w:after="120" w:line="290" w:lineRule="auto"/>
+      </w:pPr>
+      <w:r>
+        <w:t>Se alcanzó el límite de consultas diarias del servicio de IA. Espere y vuelva a intentarlo más tarde, o avise al administrador de la plataforma. El resto del sistema, incluidos el score de riesgo y las reglas de seguridad, sigue funcionando sin la IA.</w:t>
+      </w:r>
+    </w:p>
+    <w:p>
+      <w:pPr>
+        <w:pStyle w:val="Ttulo3"/>
+      </w:pPr>
+      <w:r>
         <w:t>¿La IA puede cambiar mis datos?</w:t>
       </w:r>
     </w:p>
@@ -8402,7 +8446,7 @@
         <w:pStyle w:val="Ttulo1"/>
         <w:pageBreakBefore/>
       </w:pPr>
-      <w:bookmarkStart w:id="17" w:name="_Toc240932429"/>
+      <w:bookmarkStart w:id="17" w:name="_Toc240935213"/>
       <w:r>
         <w:lastRenderedPageBreak/>
         <w:t>18. Glosario</w:t>
@@ -8424,7 +8468,7 @@
           <w:left w:w="10" w:type="dxa"/>
           <w:right w:w="10" w:type="dxa"/>
         </w:tblCellMar>
-        <w:tblLook w:val="04A0" w:firstRow="1" w:lastRow="0" w:firstColumn="1" w:lastColumn="0" w:noHBand="0" w:noVBand="1"/>
+        <w:tblLook w:val="0000" w:firstRow="0" w:lastRow="0" w:firstColumn="0" w:lastColumn="0" w:noHBand="0" w:noVBand="0"/>
       </w:tblPr>
       <w:tblGrid>
         <w:gridCol w:w="2300"/>
@@ -9684,10 +9728,10 @@
 <file path=word/numbering.xml><?xml version="1.0" encoding="utf-8"?>
 <w:numbering xmlns:wpc="http://schemas.microsoft.com/office/word/2010/wordprocessingCanvas" xmlns:cx="http://schemas.microsoft.com/office/drawing/2014/chartex" xmlns:cx1="http://schemas.microsoft.com/office/drawing/2015/9/8/chartex" xmlns:cx2="http://schemas.microsoft.com/office/drawing/2015/10/21/chartex" xmlns:cx3="http://schemas.microsoft.com/office/drawing/2016/5/9/chartex" xmlns:cx4="http://schemas.microsoft.com/office/drawing/2016/5/10/chartex" xmlns:cx5="http://schemas.microsoft.com/office/drawing/2016/5/11/chartex" xmlns:cx6="http://schemas.microsoft.com/office/drawing/2016/5/12/chartex" xmlns:cx7="http://schemas.microsoft.com/office/drawing/2016/5/13/chartex" xmlns:cx8="http://schemas.microsoft.com/office/drawing/2016/5/14/chartex" xmlns:mc="http://schemas.openxmlformats.org/markup-compatibility/2006" xmlns:aink="http://schemas.microsoft.com/office/drawing/2016/ink" xmlns:am3d="http://schemas.microsoft.com/office/drawing/2017/model3d" xmlns:o="urn:schemas-microsoft-com:office:office" xmlns:oel="http://schemas.microsoft.com/office/2019/extlst" xmlns:r="http://schemas.openxmlformats.org/officeDocument/2006/relationships" xmlns:m="http://schemas.openxmlformats.org/officeDocument/2006/math" xmlns:v="urn:schemas-microsoft-com:vml" xmlns:wp14="http://schemas.microsoft.com/office/word/2010/wordprocessingDrawing" xmlns:wp="http://schemas.openxmlformats.org/drawingml/2006/wordprocessingDrawing" xmlns:w10="urn:schemas-microsoft-com:office:word" xmlns:w="http://schemas.openxmlformats.org/wordprocessingml/2006/main" xmlns:w14="http://schemas.microsoft.com/office/word/2010/wordml" xmlns:w15="http://schemas.microsoft.com/office/word/2012/wordml" xmlns:w16cex="http://schemas.microsoft.com/office/word/2018/wordml/cex" xmlns:w16cid="http://schemas.microsoft.com/office/word/2016/wordml/cid" xmlns:w16="http://schemas.microsoft.com/office/word/2018/wordml" xmlns:w16du="http://schemas.microsoft.com/office/word/2023/wordml/word16du" xmlns:w16sdtdh="http://schemas.microsoft.com/office/word/2020/wordml/sdtdatahash" xmlns:w16sdtfl="http://schemas.microsoft.com/office/word/2024/wordml/sdtformatlock" xmlns:w16se="http://schemas.microsoft.com/office/word/2015/wordml/symex" xmlns:wpg="http://schemas.microsoft.com/office/word/2010/wordprocessingGroup" xmlns:wpi="http://schemas.microsoft.com/office/word/2010/wordprocessingInk" xmlns:wne="http://schemas.microsoft.com/office/word/2006/wordml" xmlns:wps="http://schemas.microsoft.com/office/word/2010/wordprocessingShape" mc:Ignorable="w14 w15 w16se w16cid w16 w16cex w16sdtdh w16sdtfl w16du wp14">
   <w:abstractNum w:abstractNumId="0" w15:restartNumberingAfterBreak="0">
-    <w:nsid w:val="112D16F9"/>
+    <w:nsid w:val="035175BE"/>
     <w:multiLevelType w:val="hybridMultilevel"/>
-    <w:tmpl w:val="FF6EE242"/>
-    <w:lvl w:ilvl="0" w:tplc="795E68D0">
+    <w:tmpl w:val="B1D82B86"/>
+    <w:lvl w:ilvl="0" w:tplc="0E5430CA">
       <w:start w:val="1"/>
       <w:numFmt w:val="decimal"/>
       <w:lvlText w:val="%1."/>
@@ -9696,52 +9740,52 @@
         <w:ind w:left="460" w:hanging="320"/>
       </w:pPr>
     </w:lvl>
-    <w:lvl w:ilvl="1" w:tplc="92D0A996">
+    <w:lvl w:ilvl="1" w:tplc="26CEF3C0">
       <w:numFmt w:val="decimal"/>
       <w:lvlText w:val=""/>
       <w:lvlJc w:val="left"/>
     </w:lvl>
-    <w:lvl w:ilvl="2" w:tplc="494A1BB6">
+    <w:lvl w:ilvl="2" w:tplc="BFACCFD0">
       <w:numFmt w:val="decimal"/>
       <w:lvlText w:val=""/>
       <w:lvlJc w:val="left"/>
     </w:lvl>
-    <w:lvl w:ilvl="3" w:tplc="6B4E1F70">
+    <w:lvl w:ilvl="3" w:tplc="06B6DA20">
       <w:numFmt w:val="decimal"/>
       <w:lvlText w:val=""/>
       <w:lvlJc w:val="left"/>
     </w:lvl>
-    <w:lvl w:ilvl="4" w:tplc="9260CFC6">
+    <w:lvl w:ilvl="4" w:tplc="ACF84264">
       <w:numFmt w:val="decimal"/>
       <w:lvlText w:val=""/>
       <w:lvlJc w:val="left"/>
     </w:lvl>
-    <w:lvl w:ilvl="5" w:tplc="5558AB7A">
+    <w:lvl w:ilvl="5" w:tplc="504CFB1E">
       <w:numFmt w:val="decimal"/>
       <w:lvlText w:val=""/>
       <w:lvlJc w:val="left"/>
     </w:lvl>
-    <w:lvl w:ilvl="6" w:tplc="17124DF4">
+    <w:lvl w:ilvl="6" w:tplc="4C7CBEB0">
       <w:numFmt w:val="decimal"/>
       <w:lvlText w:val=""/>
       <w:lvlJc w:val="left"/>
     </w:lvl>
-    <w:lvl w:ilvl="7" w:tplc="22266ECE">
+    <w:lvl w:ilvl="7" w:tplc="13807D4E">
       <w:numFmt w:val="decimal"/>
       <w:lvlText w:val=""/>
       <w:lvlJc w:val="left"/>
     </w:lvl>
-    <w:lvl w:ilvl="8" w:tplc="5E9E3E12">
+    <w:lvl w:ilvl="8" w:tplc="BCC6AA62">
       <w:numFmt w:val="decimal"/>
       <w:lvlText w:val=""/>
       <w:lvlJc w:val="left"/>
     </w:lvl>
   </w:abstractNum>
   <w:abstractNum w:abstractNumId="1" w15:restartNumberingAfterBreak="0">
-    <w:nsid w:val="1CEB2A20"/>
+    <w:nsid w:val="0A917CA8"/>
     <w:multiLevelType w:val="hybridMultilevel"/>
-    <w:tmpl w:val="9718FED6"/>
-    <w:lvl w:ilvl="0" w:tplc="1CEE286A">
+    <w:tmpl w:val="0C46382C"/>
+    <w:lvl w:ilvl="0" w:tplc="3CB66CC0">
       <w:start w:val="1"/>
       <w:numFmt w:val="decimal"/>
       <w:lvlText w:val="%1."/>
@@ -9750,52 +9794,52 @@
         <w:ind w:left="460" w:hanging="320"/>
       </w:pPr>
     </w:lvl>
-    <w:lvl w:ilvl="1" w:tplc="B4547D04">
+    <w:lvl w:ilvl="1" w:tplc="7F78A13A">
       <w:numFmt w:val="decimal"/>
       <w:lvlText w:val=""/>
       <w:lvlJc w:val="left"/>
     </w:lvl>
-    <w:lvl w:ilvl="2" w:tplc="8D7AFFDA">
+    <w:lvl w:ilvl="2" w:tplc="B608F408">
       <w:numFmt w:val="decimal"/>
       <w:lvlText w:val=""/>
       <w:lvlJc w:val="left"/>
     </w:lvl>
-    <w:lvl w:ilvl="3" w:tplc="0D92E8DA">
+    <w:lvl w:ilvl="3" w:tplc="71380E8A">
       <w:numFmt w:val="decimal"/>
       <w:lvlText w:val=""/>
       <w:lvlJc w:val="left"/>
     </w:lvl>
-    <w:lvl w:ilvl="4" w:tplc="AD262672">
+    <w:lvl w:ilvl="4" w:tplc="39A86128">
       <w:numFmt w:val="decimal"/>
       <w:lvlText w:val=""/>
       <w:lvlJc w:val="left"/>
     </w:lvl>
-    <w:lvl w:ilvl="5" w:tplc="32EE4666">
+    <w:lvl w:ilvl="5" w:tplc="BBAC2A6C">
       <w:numFmt w:val="decimal"/>
       <w:lvlText w:val=""/>
       <w:lvlJc w:val="left"/>
     </w:lvl>
-    <w:lvl w:ilvl="6" w:tplc="251602F0">
+    <w:lvl w:ilvl="6" w:tplc="BFA0FD8E">
       <w:numFmt w:val="decimal"/>
       <w:lvlText w:val=""/>
       <w:lvlJc w:val="left"/>
     </w:lvl>
-    <w:lvl w:ilvl="7" w:tplc="1F5C91C4">
+    <w:lvl w:ilvl="7" w:tplc="C4C65EEA">
       <w:numFmt w:val="decimal"/>
       <w:lvlText w:val=""/>
       <w:lvlJc w:val="left"/>
     </w:lvl>
-    <w:lvl w:ilvl="8" w:tplc="8E026080">
+    <w:lvl w:ilvl="8" w:tplc="A1C827DA">
       <w:numFmt w:val="decimal"/>
       <w:lvlText w:val=""/>
       <w:lvlJc w:val="left"/>
     </w:lvl>
   </w:abstractNum>
   <w:abstractNum w:abstractNumId="2" w15:restartNumberingAfterBreak="0">
-    <w:nsid w:val="1EC22CEF"/>
+    <w:nsid w:val="1EFB43F9"/>
     <w:multiLevelType w:val="hybridMultilevel"/>
-    <w:tmpl w:val="1AFA48E2"/>
-    <w:lvl w:ilvl="0" w:tplc="971A6966">
+    <w:tmpl w:val="CC020290"/>
+    <w:lvl w:ilvl="0" w:tplc="AAC0363C">
       <w:start w:val="1"/>
       <w:numFmt w:val="decimal"/>
       <w:lvlText w:val="%1."/>
@@ -9804,52 +9848,52 @@
         <w:ind w:left="460" w:hanging="320"/>
       </w:pPr>
     </w:lvl>
-    <w:lvl w:ilvl="1" w:tplc="ECEEF25E">
+    <w:lvl w:ilvl="1" w:tplc="F416A4CC">
       <w:numFmt w:val="decimal"/>
       <w:lvlText w:val=""/>
       <w:lvlJc w:val="left"/>
     </w:lvl>
-    <w:lvl w:ilvl="2" w:tplc="B5B09B4C">
+    <w:lvl w:ilvl="2" w:tplc="CA108052">
       <w:numFmt w:val="decimal"/>
       <w:lvlText w:val=""/>
       <w:lvlJc w:val="left"/>
     </w:lvl>
-    <w:lvl w:ilvl="3" w:tplc="2D2431BC">
+    <w:lvl w:ilvl="3" w:tplc="364A33E2">
       <w:numFmt w:val="decimal"/>
       <w:lvlText w:val=""/>
       <w:lvlJc w:val="left"/>
     </w:lvl>
-    <w:lvl w:ilvl="4" w:tplc="5E346F52">
+    <w:lvl w:ilvl="4" w:tplc="DDC0B646">
       <w:numFmt w:val="decimal"/>
       <w:lvlText w:val=""/>
       <w:lvlJc w:val="left"/>
     </w:lvl>
-    <w:lvl w:ilvl="5" w:tplc="068200DC">
+    <w:lvl w:ilvl="5" w:tplc="0D9ECD4C">
       <w:numFmt w:val="decimal"/>
       <w:lvlText w:val=""/>
       <w:lvlJc w:val="left"/>
     </w:lvl>
-    <w:lvl w:ilvl="6" w:tplc="345ABD0A">
+    <w:lvl w:ilvl="6" w:tplc="7CF8A816">
       <w:numFmt w:val="decimal"/>
       <w:lvlText w:val=""/>
       <w:lvlJc w:val="left"/>
     </w:lvl>
-    <w:lvl w:ilvl="7" w:tplc="CAFCD4EE">
+    <w:lvl w:ilvl="7" w:tplc="EA3A76B8">
       <w:numFmt w:val="decimal"/>
       <w:lvlText w:val=""/>
       <w:lvlJc w:val="left"/>
     </w:lvl>
-    <w:lvl w:ilvl="8" w:tplc="3CC49358">
+    <w:lvl w:ilvl="8" w:tplc="F7F8A7C6">
       <w:numFmt w:val="decimal"/>
       <w:lvlText w:val=""/>
       <w:lvlJc w:val="left"/>
     </w:lvl>
   </w:abstractNum>
   <w:abstractNum w:abstractNumId="3" w15:restartNumberingAfterBreak="0">
-    <w:nsid w:val="21CB10AD"/>
+    <w:nsid w:val="257C3422"/>
     <w:multiLevelType w:val="hybridMultilevel"/>
-    <w:tmpl w:val="79C62228"/>
-    <w:lvl w:ilvl="0" w:tplc="B442BEEE">
+    <w:tmpl w:val="267EFC82"/>
+    <w:lvl w:ilvl="0" w:tplc="966A020A">
       <w:start w:val="1"/>
       <w:numFmt w:val="bullet"/>
       <w:lvlText w:val="●"/>
@@ -9858,7 +9902,7 @@
         <w:ind w:left="720" w:hanging="360"/>
       </w:pPr>
     </w:lvl>
-    <w:lvl w:ilvl="1" w:tplc="6406D444">
+    <w:lvl w:ilvl="1" w:tplc="86866724">
       <w:start w:val="1"/>
       <w:numFmt w:val="bullet"/>
       <w:lvlText w:val="○"/>
@@ -9867,7 +9911,7 @@
         <w:ind w:left="1440" w:hanging="360"/>
       </w:pPr>
     </w:lvl>
-    <w:lvl w:ilvl="2" w:tplc="C92635FA">
+    <w:lvl w:ilvl="2" w:tplc="2E9A2D30">
       <w:start w:val="1"/>
       <w:numFmt w:val="bullet"/>
       <w:lvlText w:val="■"/>
@@ -9876,7 +9920,7 @@
         <w:ind w:left="2160" w:hanging="360"/>
       </w:pPr>
     </w:lvl>
-    <w:lvl w:ilvl="3" w:tplc="FF26FD4A">
+    <w:lvl w:ilvl="3" w:tplc="10E8E774">
       <w:start w:val="1"/>
       <w:numFmt w:val="bullet"/>
       <w:lvlText w:val="●"/>
@@ -9885,7 +9929,7 @@
         <w:ind w:left="2880" w:hanging="360"/>
       </w:pPr>
     </w:lvl>
-    <w:lvl w:ilvl="4" w:tplc="9D2AE9D6">
+    <w:lvl w:ilvl="4" w:tplc="DB142AA8">
       <w:start w:val="1"/>
       <w:numFmt w:val="bullet"/>
       <w:lvlText w:val="○"/>
@@ -9894,7 +9938,7 @@
         <w:ind w:left="3600" w:hanging="360"/>
       </w:pPr>
     </w:lvl>
-    <w:lvl w:ilvl="5" w:tplc="39305696">
+    <w:lvl w:ilvl="5" w:tplc="B43876A8">
       <w:start w:val="1"/>
       <w:numFmt w:val="bullet"/>
       <w:lvlText w:val="■"/>
@@ -9903,7 +9947,7 @@
         <w:ind w:left="4320" w:hanging="360"/>
       </w:pPr>
     </w:lvl>
-    <w:lvl w:ilvl="6" w:tplc="2894F862">
+    <w:lvl w:ilvl="6" w:tplc="A1EA311A">
       <w:start w:val="1"/>
       <w:numFmt w:val="bullet"/>
       <w:lvlText w:val="●"/>
@@ -9912,7 +9956,7 @@
         <w:ind w:left="5040" w:hanging="360"/>
       </w:pPr>
     </w:lvl>
-    <w:lvl w:ilvl="7" w:tplc="79E8179C">
+    <w:lvl w:ilvl="7" w:tplc="114876F6">
       <w:start w:val="1"/>
       <w:numFmt w:val="bullet"/>
       <w:lvlText w:val="●"/>
@@ -9921,7 +9965,7 @@
         <w:ind w:left="5760" w:hanging="360"/>
       </w:pPr>
     </w:lvl>
-    <w:lvl w:ilvl="8" w:tplc="01D6D2FE">
+    <w:lvl w:ilvl="8" w:tplc="5A34E066">
       <w:start w:val="1"/>
       <w:numFmt w:val="bullet"/>
       <w:lvlText w:val="●"/>
@@ -9932,122 +9976,122 @@
     </w:lvl>
   </w:abstractNum>
   <w:abstractNum w:abstractNumId="4" w15:restartNumberingAfterBreak="0">
-    <w:nsid w:val="24935EC4"/>
+    <w:nsid w:val="25A85D80"/>
     <w:multiLevelType w:val="hybridMultilevel"/>
-    <w:tmpl w:val="99A848BA"/>
-    <w:lvl w:ilvl="0" w:tplc="7E48295A">
+    <w:tmpl w:val="63FC59AA"/>
+    <w:lvl w:ilvl="0" w:tplc="2878D522">
       <w:start w:val="1"/>
-      <w:numFmt w:val="bullet"/>
-      <w:lvlText w:val="•"/>
+      <w:numFmt w:val="decimal"/>
+      <w:lvlText w:val="%1."/>
       <w:lvlJc w:val="left"/>
       <w:pPr>
-        <w:ind w:left="460" w:hanging="280"/>
+        <w:ind w:left="460" w:hanging="320"/>
       </w:pPr>
     </w:lvl>
-    <w:lvl w:ilvl="1" w:tplc="C040FAE8">
-      <w:start w:val="1"/>
-      <w:numFmt w:val="bullet"/>
-      <w:lvlText w:val="–"/>
-      <w:lvlJc w:val="left"/>
-      <w:pPr>
-        <w:ind w:left="900" w:hanging="280"/>
-      </w:pPr>
-    </w:lvl>
-    <w:lvl w:ilvl="2" w:tplc="57F83BAC">
+    <w:lvl w:ilvl="1" w:tplc="1B8AE216">
       <w:numFmt w:val="decimal"/>
       <w:lvlText w:val=""/>
       <w:lvlJc w:val="left"/>
     </w:lvl>
-    <w:lvl w:ilvl="3" w:tplc="8C8C451E">
+    <w:lvl w:ilvl="2" w:tplc="1BB8D712">
       <w:numFmt w:val="decimal"/>
       <w:lvlText w:val=""/>
       <w:lvlJc w:val="left"/>
     </w:lvl>
-    <w:lvl w:ilvl="4" w:tplc="EC60CB82">
+    <w:lvl w:ilvl="3" w:tplc="69F2DA06">
       <w:numFmt w:val="decimal"/>
       <w:lvlText w:val=""/>
       <w:lvlJc w:val="left"/>
     </w:lvl>
-    <w:lvl w:ilvl="5" w:tplc="F5382746">
+    <w:lvl w:ilvl="4" w:tplc="C186E0D0">
       <w:numFmt w:val="decimal"/>
       <w:lvlText w:val=""/>
       <w:lvlJc w:val="left"/>
     </w:lvl>
-    <w:lvl w:ilvl="6" w:tplc="1AE893F8">
+    <w:lvl w:ilvl="5" w:tplc="29E81120">
       <w:numFmt w:val="decimal"/>
       <w:lvlText w:val=""/>
       <w:lvlJc w:val="left"/>
     </w:lvl>
-    <w:lvl w:ilvl="7" w:tplc="2598945E">
+    <w:lvl w:ilvl="6" w:tplc="61A8F10E">
       <w:numFmt w:val="decimal"/>
       <w:lvlText w:val=""/>
       <w:lvlJc w:val="left"/>
     </w:lvl>
-    <w:lvl w:ilvl="8" w:tplc="7466FA6E">
+    <w:lvl w:ilvl="7" w:tplc="5B12296E">
+      <w:numFmt w:val="decimal"/>
+      <w:lvlText w:val=""/>
+      <w:lvlJc w:val="left"/>
+    </w:lvl>
+    <w:lvl w:ilvl="8" w:tplc="E21281C8">
       <w:numFmt w:val="decimal"/>
       <w:lvlText w:val=""/>
       <w:lvlJc w:val="left"/>
     </w:lvl>
   </w:abstractNum>
   <w:abstractNum w:abstractNumId="5" w15:restartNumberingAfterBreak="0">
-    <w:nsid w:val="3C652011"/>
+    <w:nsid w:val="34637351"/>
     <w:multiLevelType w:val="hybridMultilevel"/>
-    <w:tmpl w:val="EC389E94"/>
-    <w:lvl w:ilvl="0" w:tplc="010ED312">
+    <w:tmpl w:val="7F509F02"/>
+    <w:lvl w:ilvl="0" w:tplc="9C2A9FB0">
       <w:start w:val="1"/>
-      <w:numFmt w:val="decimal"/>
-      <w:lvlText w:val="%1."/>
+      <w:numFmt w:val="bullet"/>
+      <w:lvlText w:val="•"/>
       <w:lvlJc w:val="left"/>
       <w:pPr>
-        <w:ind w:left="460" w:hanging="320"/>
+        <w:ind w:left="460" w:hanging="280"/>
       </w:pPr>
     </w:lvl>
-    <w:lvl w:ilvl="1" w:tplc="E0BE52FE">
+    <w:lvl w:ilvl="1" w:tplc="8E1AFAB4">
+      <w:start w:val="1"/>
+      <w:numFmt w:val="bullet"/>
+      <w:lvlText w:val="–"/>
+      <w:lvlJc w:val="left"/>
+      <w:pPr>
+        <w:ind w:left="900" w:hanging="280"/>
+      </w:pPr>
+    </w:lvl>
+    <w:lvl w:ilvl="2" w:tplc="6B82B748">
       <w:numFmt w:val="decimal"/>
       <w:lvlText w:val=""/>
       <w:lvlJc w:val="left"/>
     </w:lvl>
-    <w:lvl w:ilvl="2" w:tplc="62BAFF64">
+    <w:lvl w:ilvl="3" w:tplc="D01409CE">
       <w:numFmt w:val="decimal"/>
       <w:lvlText w:val=""/>
       <w:lvlJc w:val="left"/>
     </w:lvl>
-    <w:lvl w:ilvl="3" w:tplc="506488AA">
+    <w:lvl w:ilvl="4" w:tplc="8572CF88">
       <w:numFmt w:val="decimal"/>
       <w:lvlText w:val=""/>
       <w:lvlJc w:val="left"/>
     </w:lvl>
-    <w:lvl w:ilvl="4" w:tplc="588452EA">
+    <w:lvl w:ilvl="5" w:tplc="52761316">
       <w:numFmt w:val="decimal"/>
       <w:lvlText w:val=""/>
       <w:lvlJc w:val="left"/>
     </w:lvl>
-    <w:lvl w:ilvl="5" w:tplc="3C32CA28">
+    <w:lvl w:ilvl="6" w:tplc="9FF4D65A">
       <w:numFmt w:val="decimal"/>
       <w:lvlText w:val=""/>
       <w:lvlJc w:val="left"/>
     </w:lvl>
-    <w:lvl w:ilvl="6" w:tplc="F39075CE">
+    <w:lvl w:ilvl="7" w:tplc="FCD2A22C">
       <w:numFmt w:val="decimal"/>
       <w:lvlText w:val=""/>
       <w:lvlJc w:val="left"/>
     </w:lvl>
-    <w:lvl w:ilvl="7" w:tplc="BD74C274">
-      <w:numFmt w:val="decimal"/>
-      <w:lvlText w:val=""/>
-      <w:lvlJc w:val="left"/>
-    </w:lvl>
-    <w:lvl w:ilvl="8" w:tplc="684ED9CC">
+    <w:lvl w:ilvl="8" w:tplc="EC56450A">
       <w:numFmt w:val="decimal"/>
       <w:lvlText w:val=""/>
       <w:lvlJc w:val="left"/>
     </w:lvl>
   </w:abstractNum>
   <w:abstractNum w:abstractNumId="6" w15:restartNumberingAfterBreak="0">
-    <w:nsid w:val="48E123C0"/>
+    <w:nsid w:val="45E06526"/>
     <w:multiLevelType w:val="hybridMultilevel"/>
-    <w:tmpl w:val="5A5C1094"/>
-    <w:lvl w:ilvl="0" w:tplc="62105D50">
+    <w:tmpl w:val="54FCDA54"/>
+    <w:lvl w:ilvl="0" w:tplc="6E32D9DA">
       <w:start w:val="1"/>
       <w:numFmt w:val="decimal"/>
       <w:lvlText w:val="%1."/>
@@ -10056,52 +10100,52 @@
         <w:ind w:left="460" w:hanging="320"/>
       </w:pPr>
     </w:lvl>
-    <w:lvl w:ilvl="1" w:tplc="55A0737E">
+    <w:lvl w:ilvl="1" w:tplc="2996BA8E">
       <w:numFmt w:val="decimal"/>
       <w:lvlText w:val=""/>
       <w:lvlJc w:val="left"/>
     </w:lvl>
-    <w:lvl w:ilvl="2" w:tplc="2DE2B196">
+    <w:lvl w:ilvl="2" w:tplc="7AA2F716">
       <w:numFmt w:val="decimal"/>
       <w:lvlText w:val=""/>
       <w:lvlJc w:val="left"/>
     </w:lvl>
-    <w:lvl w:ilvl="3" w:tplc="3D90395C">
+    <w:lvl w:ilvl="3" w:tplc="9802FE50">
       <w:numFmt w:val="decimal"/>
       <w:lvlText w:val=""/>
       <w:lvlJc w:val="left"/>
     </w:lvl>
-    <w:lvl w:ilvl="4" w:tplc="081EEB58">
+    <w:lvl w:ilvl="4" w:tplc="CAA6CF42">
       <w:numFmt w:val="decimal"/>
       <w:lvlText w:val=""/>
       <w:lvlJc w:val="left"/>
     </w:lvl>
-    <w:lvl w:ilvl="5" w:tplc="0DFE2AD4">
+    <w:lvl w:ilvl="5" w:tplc="CBEC9588">
       <w:numFmt w:val="decimal"/>
       <w:lvlText w:val=""/>
       <w:lvlJc w:val="left"/>
     </w:lvl>
-    <w:lvl w:ilvl="6" w:tplc="4C1AF420">
+    <w:lvl w:ilvl="6" w:tplc="29DA1254">
       <w:numFmt w:val="decimal"/>
       <w:lvlText w:val=""/>
       <w:lvlJc w:val="left"/>
     </w:lvl>
-    <w:lvl w:ilvl="7" w:tplc="38B62F68">
+    <w:lvl w:ilvl="7" w:tplc="7FD8F4DC">
       <w:numFmt w:val="decimal"/>
       <w:lvlText w:val=""/>
       <w:lvlJc w:val="left"/>
     </w:lvl>
-    <w:lvl w:ilvl="8" w:tplc="09E4E572">
+    <w:lvl w:ilvl="8" w:tplc="345CF434">
       <w:numFmt w:val="decimal"/>
       <w:lvlText w:val=""/>
       <w:lvlJc w:val="left"/>
     </w:lvl>
   </w:abstractNum>
   <w:abstractNum w:abstractNumId="7" w15:restartNumberingAfterBreak="0">
-    <w:nsid w:val="67B023D2"/>
+    <w:nsid w:val="5B2C792C"/>
     <w:multiLevelType w:val="hybridMultilevel"/>
-    <w:tmpl w:val="D7EC1DB6"/>
-    <w:lvl w:ilvl="0" w:tplc="3CFC0B4A">
+    <w:tmpl w:val="C3C632B6"/>
+    <w:lvl w:ilvl="0" w:tplc="CD62A046">
       <w:start w:val="1"/>
       <w:numFmt w:val="decimal"/>
       <w:lvlText w:val="%1."/>
@@ -10110,52 +10154,52 @@
         <w:ind w:left="460" w:hanging="320"/>
       </w:pPr>
     </w:lvl>
-    <w:lvl w:ilvl="1" w:tplc="90628FFC">
+    <w:lvl w:ilvl="1" w:tplc="149CE3FC">
       <w:numFmt w:val="decimal"/>
       <w:lvlText w:val=""/>
       <w:lvlJc w:val="left"/>
     </w:lvl>
-    <w:lvl w:ilvl="2" w:tplc="4BFEE496">
+    <w:lvl w:ilvl="2" w:tplc="F618AC58">
       <w:numFmt w:val="decimal"/>
       <w:lvlText w:val=""/>
       <w:lvlJc w:val="left"/>
     </w:lvl>
-    <w:lvl w:ilvl="3" w:tplc="CB7CF878">
+    <w:lvl w:ilvl="3" w:tplc="602AA2F2">
       <w:numFmt w:val="decimal"/>
       <w:lvlText w:val=""/>
       <w:lvlJc w:val="left"/>
     </w:lvl>
-    <w:lvl w:ilvl="4" w:tplc="CC18695E">
+    <w:lvl w:ilvl="4" w:tplc="CCAEEED6">
       <w:numFmt w:val="decimal"/>
       <w:lvlText w:val=""/>
       <w:lvlJc w:val="left"/>
     </w:lvl>
-    <w:lvl w:ilvl="5" w:tplc="9BB0570A">
+    <w:lvl w:ilvl="5" w:tplc="1F627CF0">
       <w:numFmt w:val="decimal"/>
       <w:lvlText w:val=""/>
       <w:lvlJc w:val="left"/>
     </w:lvl>
-    <w:lvl w:ilvl="6" w:tplc="7C36B2CA">
+    <w:lvl w:ilvl="6" w:tplc="92CACBE6">
       <w:numFmt w:val="decimal"/>
       <w:lvlText w:val=""/>
       <w:lvlJc w:val="left"/>
     </w:lvl>
-    <w:lvl w:ilvl="7" w:tplc="8AC2CB64">
+    <w:lvl w:ilvl="7" w:tplc="EB581AC6">
       <w:numFmt w:val="decimal"/>
       <w:lvlText w:val=""/>
       <w:lvlJc w:val="left"/>
     </w:lvl>
-    <w:lvl w:ilvl="8" w:tplc="3CD08496">
+    <w:lvl w:ilvl="8" w:tplc="6C907140">
       <w:numFmt w:val="decimal"/>
       <w:lvlText w:val=""/>
       <w:lvlJc w:val="left"/>
     </w:lvl>
   </w:abstractNum>
   <w:abstractNum w:abstractNumId="8" w15:restartNumberingAfterBreak="0">
-    <w:nsid w:val="73B70137"/>
+    <w:nsid w:val="70000DC2"/>
     <w:multiLevelType w:val="hybridMultilevel"/>
-    <w:tmpl w:val="833C1216"/>
-    <w:lvl w:ilvl="0" w:tplc="1C286C4A">
+    <w:tmpl w:val="E89678D6"/>
+    <w:lvl w:ilvl="0" w:tplc="4524E572">
       <w:start w:val="1"/>
       <w:numFmt w:val="decimal"/>
       <w:lvlText w:val="%1."/>
@@ -10164,52 +10208,52 @@
         <w:ind w:left="460" w:hanging="320"/>
       </w:pPr>
     </w:lvl>
-    <w:lvl w:ilvl="1" w:tplc="C89804FA">
+    <w:lvl w:ilvl="1" w:tplc="F4E6C380">
       <w:numFmt w:val="decimal"/>
       <w:lvlText w:val=""/>
       <w:lvlJc w:val="left"/>
     </w:lvl>
-    <w:lvl w:ilvl="2" w:tplc="3690B824">
+    <w:lvl w:ilvl="2" w:tplc="AA18C482">
       <w:numFmt w:val="decimal"/>
       <w:lvlText w:val=""/>
       <w:lvlJc w:val="left"/>
     </w:lvl>
-    <w:lvl w:ilvl="3" w:tplc="E1701718">
+    <w:lvl w:ilvl="3" w:tplc="2E141E7A">
       <w:numFmt w:val="decimal"/>
       <w:lvlText w:val=""/>
       <w:lvlJc w:val="left"/>
     </w:lvl>
-    <w:lvl w:ilvl="4" w:tplc="56DA470C">
+    <w:lvl w:ilvl="4" w:tplc="B0BA56FC">
       <w:numFmt w:val="decimal"/>
       <w:lvlText w:val=""/>
       <w:lvlJc w:val="left"/>
     </w:lvl>
-    <w:lvl w:ilvl="5" w:tplc="FA124A1A">
+    <w:lvl w:ilvl="5" w:tplc="70387518">
       <w:numFmt w:val="decimal"/>
       <w:lvlText w:val=""/>
       <w:lvlJc w:val="left"/>
     </w:lvl>
-    <w:lvl w:ilvl="6" w:tplc="59C8CD7A">
+    <w:lvl w:ilvl="6" w:tplc="AD82F766">
       <w:numFmt w:val="decimal"/>
       <w:lvlText w:val=""/>
       <w:lvlJc w:val="left"/>
     </w:lvl>
-    <w:lvl w:ilvl="7" w:tplc="38EC00C0">
+    <w:lvl w:ilvl="7" w:tplc="9BD816F2">
       <w:numFmt w:val="decimal"/>
       <w:lvlText w:val=""/>
       <w:lvlJc w:val="left"/>
     </w:lvl>
-    <w:lvl w:ilvl="8" w:tplc="072EB87E">
+    <w:lvl w:ilvl="8" w:tplc="A6F6A766">
       <w:numFmt w:val="decimal"/>
       <w:lvlText w:val=""/>
       <w:lvlJc w:val="left"/>
     </w:lvl>
   </w:abstractNum>
   <w:abstractNum w:abstractNumId="9" w15:restartNumberingAfterBreak="0">
-    <w:nsid w:val="7F8C670E"/>
+    <w:nsid w:val="7F7512B6"/>
     <w:multiLevelType w:val="hybridMultilevel"/>
-    <w:tmpl w:val="C862D1B0"/>
-    <w:lvl w:ilvl="0" w:tplc="DE3099A0">
+    <w:tmpl w:val="0EE26A5C"/>
+    <w:lvl w:ilvl="0" w:tplc="EE1A24FA">
       <w:start w:val="1"/>
       <w:numFmt w:val="decimal"/>
       <w:lvlText w:val="%1."/>
@@ -10218,102 +10262,102 @@
         <w:ind w:left="460" w:hanging="320"/>
       </w:pPr>
     </w:lvl>
-    <w:lvl w:ilvl="1" w:tplc="26FA8B9A">
+    <w:lvl w:ilvl="1" w:tplc="CD748058">
       <w:numFmt w:val="decimal"/>
       <w:lvlText w:val=""/>
       <w:lvlJc w:val="left"/>
     </w:lvl>
-    <w:lvl w:ilvl="2" w:tplc="1C3808F2">
+    <w:lvl w:ilvl="2" w:tplc="3BC42558">
       <w:numFmt w:val="decimal"/>
       <w:lvlText w:val=""/>
       <w:lvlJc w:val="left"/>
     </w:lvl>
-    <w:lvl w:ilvl="3" w:tplc="824ADA92">
+    <w:lvl w:ilvl="3" w:tplc="0B02885E">
       <w:numFmt w:val="decimal"/>
       <w:lvlText w:val=""/>
       <w:lvlJc w:val="left"/>
     </w:lvl>
-    <w:lvl w:ilvl="4" w:tplc="C76614DA">
+    <w:lvl w:ilvl="4" w:tplc="04B62B44">
       <w:numFmt w:val="decimal"/>
       <w:lvlText w:val=""/>
       <w:lvlJc w:val="left"/>
     </w:lvl>
-    <w:lvl w:ilvl="5" w:tplc="683A04C8">
+    <w:lvl w:ilvl="5" w:tplc="5330E8A2">
       <w:numFmt w:val="decimal"/>
       <w:lvlText w:val=""/>
       <w:lvlJc w:val="left"/>
     </w:lvl>
-    <w:lvl w:ilvl="6" w:tplc="EC68FAE6">
+    <w:lvl w:ilvl="6" w:tplc="206E5BCE">
       <w:numFmt w:val="decimal"/>
       <w:lvlText w:val=""/>
       <w:lvlJc w:val="left"/>
     </w:lvl>
-    <w:lvl w:ilvl="7" w:tplc="01822F34">
+    <w:lvl w:ilvl="7" w:tplc="77847F5C">
       <w:numFmt w:val="decimal"/>
       <w:lvlText w:val=""/>
       <w:lvlJc w:val="left"/>
     </w:lvl>
-    <w:lvl w:ilvl="8" w:tplc="68CAA0D8">
+    <w:lvl w:ilvl="8" w:tplc="9266DEA2">
       <w:numFmt w:val="decimal"/>
       <w:lvlText w:val=""/>
       <w:lvlJc w:val="left"/>
     </w:lvl>
   </w:abstractNum>
-  <w:num w:numId="1" w16cid:durableId="1781297818">
+  <w:num w:numId="1" w16cid:durableId="325864245">
     <w:abstractNumId w:val="3"/>
     <w:lvlOverride w:ilvl="0">
       <w:startOverride w:val="1"/>
     </w:lvlOverride>
   </w:num>
-  <w:num w:numId="2" w16cid:durableId="398136667">
+  <w:num w:numId="2" w16cid:durableId="773404354">
+    <w:abstractNumId w:val="5"/>
+    <w:lvlOverride w:ilvl="0">
+      <w:startOverride w:val="1"/>
+    </w:lvlOverride>
+  </w:num>
+  <w:num w:numId="3" w16cid:durableId="18169034">
+    <w:abstractNumId w:val="9"/>
+    <w:lvlOverride w:ilvl="0">
+      <w:startOverride w:val="1"/>
+    </w:lvlOverride>
+  </w:num>
+  <w:num w:numId="4" w16cid:durableId="1270314980">
+    <w:abstractNumId w:val="6"/>
+    <w:lvlOverride w:ilvl="0">
+      <w:startOverride w:val="1"/>
+    </w:lvlOverride>
+  </w:num>
+  <w:num w:numId="5" w16cid:durableId="1303773910">
     <w:abstractNumId w:val="4"/>
     <w:lvlOverride w:ilvl="0">
       <w:startOverride w:val="1"/>
     </w:lvlOverride>
   </w:num>
-  <w:num w:numId="3" w16cid:durableId="1678532624">
-    <w:abstractNumId w:val="5"/>
+  <w:num w:numId="6" w16cid:durableId="138427937">
+    <w:abstractNumId w:val="2"/>
     <w:lvlOverride w:ilvl="0">
       <w:startOverride w:val="1"/>
     </w:lvlOverride>
   </w:num>
-  <w:num w:numId="4" w16cid:durableId="1760172529">
-    <w:abstractNumId w:val="9"/>
+  <w:num w:numId="7" w16cid:durableId="615062382">
+    <w:abstractNumId w:val="1"/>
     <w:lvlOverride w:ilvl="0">
       <w:startOverride w:val="1"/>
     </w:lvlOverride>
   </w:num>
-  <w:num w:numId="5" w16cid:durableId="328678693">
+  <w:num w:numId="8" w16cid:durableId="1959485280">
     <w:abstractNumId w:val="7"/>
     <w:lvlOverride w:ilvl="0">
       <w:startOverride w:val="1"/>
     </w:lvlOverride>
   </w:num>
-  <w:num w:numId="6" w16cid:durableId="704331121">
-    <w:abstractNumId w:val="6"/>
-    <w:lvlOverride w:ilvl="0">
-      <w:startOverride w:val="1"/>
-    </w:lvlOverride>
-  </w:num>
-  <w:num w:numId="7" w16cid:durableId="543450951">
-    <w:abstractNumId w:val="2"/>
-    <w:lvlOverride w:ilvl="0">
-      <w:startOverride w:val="1"/>
-    </w:lvlOverride>
-  </w:num>
-  <w:num w:numId="8" w16cid:durableId="958952198">
+  <w:num w:numId="9" w16cid:durableId="1536238805">
     <w:abstractNumId w:val="0"/>
     <w:lvlOverride w:ilvl="0">
       <w:startOverride w:val="1"/>
     </w:lvlOverride>
   </w:num>
-  <w:num w:numId="9" w16cid:durableId="1478761266">
-    <w:abstractNumId w:val="1"/>
-    <w:lvlOverride w:ilvl="0">
-      <w:startOverride w:val="1"/>
-    </w:lvlOverride>
-  </w:num>
-  <w:num w:numId="10" w16cid:durableId="1213733007">
+  <w:num w:numId="10" w16cid:durableId="735905520">
     <w:abstractNumId w:val="8"/>
     <w:lvlOverride w:ilvl="0">
       <w:startOverride w:val="1"/>
@@ -10934,7 +10978,7 @@
     <w:autoRedefine/>
     <w:uiPriority w:val="39"/>
     <w:unhideWhenUsed/>
-    <w:rsid w:val="006D413F"/>
+    <w:rsid w:val="004503CF"/>
     <w:pPr>
       <w:spacing w:after="100"/>
     </w:pPr>

</xml_diff>

<commit_message>
Generar la orden preventiva desde la rutina, con su pauta
- Boton en la ficha de la rutina; copia la pauta y lleva a la orden nueva.
- No emite una segunda orden si ya hay una abierta: muestra el enlace a ella.
- Manual: seccion 9.2 y aviso de que la preventiva manual no trae pauta.

Co-Authored-By: Claude Opus 5 <noreply@anthropic.com>
</commit_message>
<xml_diff>
--- a/docs/gasco/Manual_de_uso_PMS_SIMARP.docx
+++ b/docs/gasco/Manual_de_uso_PMS_SIMARP.docx
@@ -115,7 +115,7 @@
     <w:sdt>
       <w:sdtPr>
         <w:alias w:val="Contenido"/>
-        <w:id w:val="-400134232"/>
+        <w:id w:val="818772046"/>
       </w:sdtPr>
       <w:sdtEndPr/>
       <w:sdtContent>
@@ -143,7 +143,7 @@
           <w:r>
             <w:fldChar w:fldCharType="separate"/>
           </w:r>
-          <w:hyperlink w:anchor="_Toc240935196" w:history="1">
+          <w:hyperlink w:anchor="_Toc240935663" w:history="1">
             <w:r>
               <w:rPr>
                 <w:rStyle w:val="Hipervnculo"/>
@@ -167,7 +167,7 @@
               <w:rPr>
                 <w:noProof/>
               </w:rPr>
-              <w:instrText xml:space="preserve"> PAGEREF _Toc240935196 \h </w:instrText>
+              <w:instrText xml:space="preserve"> PAGEREF _Toc240935663 \h </w:instrText>
             </w:r>
             <w:r>
               <w:rPr>
@@ -209,7 +209,7 @@
               <w14:ligatures w14:val="standardContextual"/>
             </w:rPr>
           </w:pPr>
-          <w:hyperlink w:anchor="_Toc240935197" w:history="1">
+          <w:hyperlink w:anchor="_Toc240935664" w:history="1">
             <w:r>
               <w:rPr>
                 <w:rStyle w:val="Hipervnculo"/>
@@ -233,7 +233,7 @@
               <w:rPr>
                 <w:noProof/>
               </w:rPr>
-              <w:instrText xml:space="preserve"> PAGEREF _Toc240935197 \h </w:instrText>
+              <w:instrText xml:space="preserve"> PAGEREF _Toc240935664 \h </w:instrText>
             </w:r>
             <w:r>
               <w:rPr>
@@ -275,7 +275,7 @@
               <w14:ligatures w14:val="standardContextual"/>
             </w:rPr>
           </w:pPr>
-          <w:hyperlink w:anchor="_Toc240935198" w:history="1">
+          <w:hyperlink w:anchor="_Toc240935665" w:history="1">
             <w:r>
               <w:rPr>
                 <w:rStyle w:val="Hipervnculo"/>
@@ -299,7 +299,7 @@
               <w:rPr>
                 <w:noProof/>
               </w:rPr>
-              <w:instrText xml:space="preserve"> PAGEREF _Toc240935198 \h </w:instrText>
+              <w:instrText xml:space="preserve"> PAGEREF _Toc240935665 \h </w:instrText>
             </w:r>
             <w:r>
               <w:rPr>
@@ -341,7 +341,7 @@
               <w14:ligatures w14:val="standardContextual"/>
             </w:rPr>
           </w:pPr>
-          <w:hyperlink w:anchor="_Toc240935199" w:history="1">
+          <w:hyperlink w:anchor="_Toc240935666" w:history="1">
             <w:r>
               <w:rPr>
                 <w:rStyle w:val="Hipervnculo"/>
@@ -365,7 +365,7 @@
               <w:rPr>
                 <w:noProof/>
               </w:rPr>
-              <w:instrText xml:space="preserve"> PAGEREF _Toc240935199 \h </w:instrText>
+              <w:instrText xml:space="preserve"> PAGEREF _Toc240935666 \h </w:instrText>
             </w:r>
             <w:r>
               <w:rPr>
@@ -407,7 +407,7 @@
               <w14:ligatures w14:val="standardContextual"/>
             </w:rPr>
           </w:pPr>
-          <w:hyperlink w:anchor="_Toc240935200" w:history="1">
+          <w:hyperlink w:anchor="_Toc240935667" w:history="1">
             <w:r>
               <w:rPr>
                 <w:rStyle w:val="Hipervnculo"/>
@@ -431,7 +431,7 @@
               <w:rPr>
                 <w:noProof/>
               </w:rPr>
-              <w:instrText xml:space="preserve"> PAGEREF _Toc240935200 \h </w:instrText>
+              <w:instrText xml:space="preserve"> PAGEREF _Toc240935667 \h </w:instrText>
             </w:r>
             <w:r>
               <w:rPr>
@@ -473,7 +473,7 @@
               <w14:ligatures w14:val="standardContextual"/>
             </w:rPr>
           </w:pPr>
-          <w:hyperlink w:anchor="_Toc240935201" w:history="1">
+          <w:hyperlink w:anchor="_Toc240935668" w:history="1">
             <w:r>
               <w:rPr>
                 <w:rStyle w:val="Hipervnculo"/>
@@ -497,7 +497,7 @@
               <w:rPr>
                 <w:noProof/>
               </w:rPr>
-              <w:instrText xml:space="preserve"> PAGEREF _Toc240935201 \h </w:instrText>
+              <w:instrText xml:space="preserve"> PAGEREF _Toc240935668 \h </w:instrText>
             </w:r>
             <w:r>
               <w:rPr>
@@ -539,7 +539,7 @@
               <w14:ligatures w14:val="standardContextual"/>
             </w:rPr>
           </w:pPr>
-          <w:hyperlink w:anchor="_Toc240935202" w:history="1">
+          <w:hyperlink w:anchor="_Toc240935669" w:history="1">
             <w:r>
               <w:rPr>
                 <w:rStyle w:val="Hipervnculo"/>
@@ -563,7 +563,7 @@
               <w:rPr>
                 <w:noProof/>
               </w:rPr>
-              <w:instrText xml:space="preserve"> PAGEREF _Toc240935202 \h </w:instrText>
+              <w:instrText xml:space="preserve"> PAGEREF _Toc240935669 \h </w:instrText>
             </w:r>
             <w:r>
               <w:rPr>
@@ -605,7 +605,7 @@
               <w14:ligatures w14:val="standardContextual"/>
             </w:rPr>
           </w:pPr>
-          <w:hyperlink w:anchor="_Toc240935203" w:history="1">
+          <w:hyperlink w:anchor="_Toc240935670" w:history="1">
             <w:r>
               <w:rPr>
                 <w:rStyle w:val="Hipervnculo"/>
@@ -629,7 +629,7 @@
               <w:rPr>
                 <w:noProof/>
               </w:rPr>
-              <w:instrText xml:space="preserve"> PAGEREF _Toc240935203 \h </w:instrText>
+              <w:instrText xml:space="preserve"> PAGEREF _Toc240935670 \h </w:instrText>
             </w:r>
             <w:r>
               <w:rPr>
@@ -671,7 +671,7 @@
               <w14:ligatures w14:val="standardContextual"/>
             </w:rPr>
           </w:pPr>
-          <w:hyperlink w:anchor="_Toc240935204" w:history="1">
+          <w:hyperlink w:anchor="_Toc240935671" w:history="1">
             <w:r>
               <w:rPr>
                 <w:rStyle w:val="Hipervnculo"/>
@@ -695,7 +695,7 @@
               <w:rPr>
                 <w:noProof/>
               </w:rPr>
-              <w:instrText xml:space="preserve"> PAGEREF _Toc240935204 \h </w:instrText>
+              <w:instrText xml:space="preserve"> PAGEREF _Toc240935671 \h </w:instrText>
             </w:r>
             <w:r>
               <w:rPr>
@@ -737,7 +737,7 @@
               <w14:ligatures w14:val="standardContextual"/>
             </w:rPr>
           </w:pPr>
-          <w:hyperlink w:anchor="_Toc240935205" w:history="1">
+          <w:hyperlink w:anchor="_Toc240935672" w:history="1">
             <w:r>
               <w:rPr>
                 <w:rStyle w:val="Hipervnculo"/>
@@ -761,7 +761,7 @@
               <w:rPr>
                 <w:noProof/>
               </w:rPr>
-              <w:instrText xml:space="preserve"> PAGEREF _Toc240935205 \h </w:instrText>
+              <w:instrText xml:space="preserve"> PAGEREF _Toc240935672 \h </w:instrText>
             </w:r>
             <w:r>
               <w:rPr>
@@ -803,7 +803,7 @@
               <w14:ligatures w14:val="standardContextual"/>
             </w:rPr>
           </w:pPr>
-          <w:hyperlink w:anchor="_Toc240935206" w:history="1">
+          <w:hyperlink w:anchor="_Toc240935673" w:history="1">
             <w:r>
               <w:rPr>
                 <w:rStyle w:val="Hipervnculo"/>
@@ -827,7 +827,7 @@
               <w:rPr>
                 <w:noProof/>
               </w:rPr>
-              <w:instrText xml:space="preserve"> PAGEREF _Toc240935206 \h </w:instrText>
+              <w:instrText xml:space="preserve"> PAGEREF _Toc240935673 \h </w:instrText>
             </w:r>
             <w:r>
               <w:rPr>
@@ -869,7 +869,7 @@
               <w14:ligatures w14:val="standardContextual"/>
             </w:rPr>
           </w:pPr>
-          <w:hyperlink w:anchor="_Toc240935207" w:history="1">
+          <w:hyperlink w:anchor="_Toc240935674" w:history="1">
             <w:r>
               <w:rPr>
                 <w:rStyle w:val="Hipervnculo"/>
@@ -893,7 +893,7 @@
               <w:rPr>
                 <w:noProof/>
               </w:rPr>
-              <w:instrText xml:space="preserve"> PAGEREF _Toc240935207 \h </w:instrText>
+              <w:instrText xml:space="preserve"> PAGEREF _Toc240935674 \h </w:instrText>
             </w:r>
             <w:r>
               <w:rPr>
@@ -935,7 +935,7 @@
               <w14:ligatures w14:val="standardContextual"/>
             </w:rPr>
           </w:pPr>
-          <w:hyperlink w:anchor="_Toc240935208" w:history="1">
+          <w:hyperlink w:anchor="_Toc240935675" w:history="1">
             <w:r>
               <w:rPr>
                 <w:rStyle w:val="Hipervnculo"/>
@@ -959,7 +959,7 @@
               <w:rPr>
                 <w:noProof/>
               </w:rPr>
-              <w:instrText xml:space="preserve"> PAGEREF _Toc240935208 \h </w:instrText>
+              <w:instrText xml:space="preserve"> PAGEREF _Toc240935675 \h </w:instrText>
             </w:r>
             <w:r>
               <w:rPr>
@@ -1001,7 +1001,7 @@
               <w14:ligatures w14:val="standardContextual"/>
             </w:rPr>
           </w:pPr>
-          <w:hyperlink w:anchor="_Toc240935209" w:history="1">
+          <w:hyperlink w:anchor="_Toc240935676" w:history="1">
             <w:r>
               <w:rPr>
                 <w:rStyle w:val="Hipervnculo"/>
@@ -1025,7 +1025,7 @@
               <w:rPr>
                 <w:noProof/>
               </w:rPr>
-              <w:instrText xml:space="preserve"> PAGEREF _Toc240935209 \h </w:instrText>
+              <w:instrText xml:space="preserve"> PAGEREF _Toc240935676 \h </w:instrText>
             </w:r>
             <w:r>
               <w:rPr>
@@ -1067,7 +1067,7 @@
               <w14:ligatures w14:val="standardContextual"/>
             </w:rPr>
           </w:pPr>
-          <w:hyperlink w:anchor="_Toc240935210" w:history="1">
+          <w:hyperlink w:anchor="_Toc240935677" w:history="1">
             <w:r>
               <w:rPr>
                 <w:rStyle w:val="Hipervnculo"/>
@@ -1091,7 +1091,7 @@
               <w:rPr>
                 <w:noProof/>
               </w:rPr>
-              <w:instrText xml:space="preserve"> PAGEREF _Toc240935210 \h </w:instrText>
+              <w:instrText xml:space="preserve"> PAGEREF _Toc240935677 \h </w:instrText>
             </w:r>
             <w:r>
               <w:rPr>
@@ -1133,7 +1133,7 @@
               <w14:ligatures w14:val="standardContextual"/>
             </w:rPr>
           </w:pPr>
-          <w:hyperlink w:anchor="_Toc240935211" w:history="1">
+          <w:hyperlink w:anchor="_Toc240935678" w:history="1">
             <w:r>
               <w:rPr>
                 <w:rStyle w:val="Hipervnculo"/>
@@ -1157,7 +1157,7 @@
               <w:rPr>
                 <w:noProof/>
               </w:rPr>
-              <w:instrText xml:space="preserve"> PAGEREF _Toc240935211 \h </w:instrText>
+              <w:instrText xml:space="preserve"> PAGEREF _Toc240935678 \h </w:instrText>
             </w:r>
             <w:r>
               <w:rPr>
@@ -1199,7 +1199,7 @@
               <w14:ligatures w14:val="standardContextual"/>
             </w:rPr>
           </w:pPr>
-          <w:hyperlink w:anchor="_Toc240935212" w:history="1">
+          <w:hyperlink w:anchor="_Toc240935679" w:history="1">
             <w:r>
               <w:rPr>
                 <w:rStyle w:val="Hipervnculo"/>
@@ -1223,7 +1223,7 @@
               <w:rPr>
                 <w:noProof/>
               </w:rPr>
-              <w:instrText xml:space="preserve"> PAGEREF _Toc240935212 \h </w:instrText>
+              <w:instrText xml:space="preserve"> PAGEREF _Toc240935679 \h </w:instrText>
             </w:r>
             <w:r>
               <w:rPr>
@@ -1265,7 +1265,7 @@
               <w14:ligatures w14:val="standardContextual"/>
             </w:rPr>
           </w:pPr>
-          <w:hyperlink w:anchor="_Toc240935213" w:history="1">
+          <w:hyperlink w:anchor="_Toc240935680" w:history="1">
             <w:r>
               <w:rPr>
                 <w:rStyle w:val="Hipervnculo"/>
@@ -1289,7 +1289,7 @@
               <w:rPr>
                 <w:noProof/>
               </w:rPr>
-              <w:instrText xml:space="preserve"> PAGEREF _Toc240935213 \h </w:instrText>
+              <w:instrText xml:space="preserve"> PAGEREF _Toc240935680 \h </w:instrText>
             </w:r>
             <w:r>
               <w:rPr>
@@ -1328,7 +1328,7 @@
         <w:pStyle w:val="Ttulo1"/>
         <w:pageBreakBefore/>
       </w:pPr>
-      <w:bookmarkStart w:id="0" w:name="_Toc240935196"/>
+      <w:bookmarkStart w:id="0" w:name="_Toc240935663"/>
       <w:r>
         <w:lastRenderedPageBreak/>
         <w:t>1. Qué es PMS SIMARP</w:t>
@@ -1525,7 +1525,7 @@
         <w:pStyle w:val="Ttulo1"/>
         <w:pageBreakBefore/>
       </w:pPr>
-      <w:bookmarkStart w:id="1" w:name="_Toc240935197"/>
+      <w:bookmarkStart w:id="1" w:name="_Toc240935664"/>
       <w:r>
         <w:lastRenderedPageBreak/>
         <w:t>2. Primeros pasos</w:t>
@@ -1818,7 +1818,7 @@
         <w:pStyle w:val="Ttulo1"/>
         <w:pageBreakBefore/>
       </w:pPr>
-      <w:bookmarkStart w:id="2" w:name="_Toc240935198"/>
+      <w:bookmarkStart w:id="2" w:name="_Toc240935665"/>
       <w:r>
         <w:lastRenderedPageBreak/>
         <w:t>3. Roles y permisos</w:t>
@@ -1848,7 +1848,7 @@
           <w:left w:w="10" w:type="dxa"/>
           <w:right w:w="10" w:type="dxa"/>
         </w:tblCellMar>
-        <w:tblLook w:val="0000" w:firstRow="0" w:lastRow="0" w:firstColumn="0" w:lastColumn="0" w:noHBand="0" w:noVBand="0"/>
+        <w:tblLook w:val="04A0" w:firstRow="1" w:lastRow="0" w:firstColumn="1" w:lastColumn="0" w:noHBand="0" w:noVBand="1"/>
       </w:tblPr>
       <w:tblGrid>
         <w:gridCol w:w="2200"/>
@@ -2274,7 +2274,7 @@
         <w:pStyle w:val="Ttulo1"/>
         <w:pageBreakBefore/>
       </w:pPr>
-      <w:bookmarkStart w:id="3" w:name="_Toc240935199"/>
+      <w:bookmarkStart w:id="3" w:name="_Toc240935666"/>
       <w:r>
         <w:lastRenderedPageBreak/>
         <w:t>4. Dashboard de mantenimiento</w:t>
@@ -2304,7 +2304,7 @@
           <w:left w:w="10" w:type="dxa"/>
           <w:right w:w="10" w:type="dxa"/>
         </w:tblCellMar>
-        <w:tblLook w:val="0000" w:firstRow="0" w:lastRow="0" w:firstColumn="0" w:lastColumn="0" w:noHBand="0" w:noVBand="0"/>
+        <w:tblLook w:val="04A0" w:firstRow="1" w:lastRow="0" w:firstColumn="1" w:lastColumn="0" w:noHBand="0" w:noVBand="1"/>
       </w:tblPr>
       <w:tblGrid>
         <w:gridCol w:w="1900"/>
@@ -3104,7 +3104,7 @@
         <w:pStyle w:val="Ttulo1"/>
         <w:pageBreakBefore/>
       </w:pPr>
-      <w:bookmarkStart w:id="4" w:name="_Toc240935200"/>
+      <w:bookmarkStart w:id="4" w:name="_Toc240935667"/>
       <w:r>
         <w:lastRenderedPageBreak/>
         <w:t>5. Activos</w:t>
@@ -3152,7 +3152,7 @@
           <w:left w:w="10" w:type="dxa"/>
           <w:right w:w="10" w:type="dxa"/>
         </w:tblCellMar>
-        <w:tblLook w:val="0000" w:firstRow="0" w:lastRow="0" w:firstColumn="0" w:lastColumn="0" w:noHBand="0" w:noVBand="0"/>
+        <w:tblLook w:val="04A0" w:firstRow="1" w:lastRow="0" w:firstColumn="1" w:lastColumn="0" w:noHBand="0" w:noVBand="1"/>
       </w:tblPr>
       <w:tblGrid>
         <w:gridCol w:w="2800"/>
@@ -3999,7 +3999,7 @@
         <w:pStyle w:val="Ttulo1"/>
         <w:pageBreakBefore/>
       </w:pPr>
-      <w:bookmarkStart w:id="5" w:name="_Toc240935201"/>
+      <w:bookmarkStart w:id="5" w:name="_Toc240935668"/>
       <w:r>
         <w:lastRenderedPageBreak/>
         <w:t>6. Órdenes de trabajo</w:t>
@@ -4037,7 +4037,7 @@
           <w:left w:w="10" w:type="dxa"/>
           <w:right w:w="10" w:type="dxa"/>
         </w:tblCellMar>
-        <w:tblLook w:val="0000" w:firstRow="0" w:lastRow="0" w:firstColumn="0" w:lastColumn="0" w:noHBand="0" w:noVBand="0"/>
+        <w:tblLook w:val="04A0" w:firstRow="1" w:lastRow="0" w:firstColumn="1" w:lastColumn="0" w:noHBand="0" w:noVBand="1"/>
       </w:tblPr>
       <w:tblGrid>
         <w:gridCol w:w="2200"/>
@@ -4231,7 +4231,17 @@
               <w:spacing w:line="260" w:lineRule="auto"/>
             </w:pPr>
             <w:r>
-              <w:t>Rutina programada. Se genera desde el plan preventivo y trae su pauta.</w:t>
+              <w:t xml:space="preserve">Rutina programada. Se genera con el botón </w:t>
+            </w:r>
+            <w:r>
+              <w:rPr>
+                <w:b/>
+                <w:bCs/>
+              </w:rPr>
+              <w:t>Generar orden de trabajo</w:t>
+            </w:r>
+            <w:r>
+              <w:t xml:space="preserve"> de la rutina (ver 9.2) y trae su pauta.</w:t>
             </w:r>
           </w:p>
         </w:tc>
@@ -4739,7 +4749,7 @@
         <w:pStyle w:val="Ttulo1"/>
         <w:pageBreakBefore/>
       </w:pPr>
-      <w:bookmarkStart w:id="6" w:name="_Toc240935202"/>
+      <w:bookmarkStart w:id="6" w:name="_Toc240935669"/>
       <w:r>
         <w:lastRenderedPageBreak/>
         <w:t>7. Ejecutar una rutina preventiva</w:t>
@@ -5140,7 +5150,7 @@
         <w:pStyle w:val="Ttulo1"/>
         <w:pageBreakBefore/>
       </w:pPr>
-      <w:bookmarkStart w:id="7" w:name="_Toc240935203"/>
+      <w:bookmarkStart w:id="7" w:name="_Toc240935670"/>
       <w:r>
         <w:lastRenderedPageBreak/>
         <w:t>8. Aprobación del trabajo</w:t>
@@ -5218,7 +5228,7 @@
         <w:pStyle w:val="Ttulo1"/>
         <w:pageBreakBefore/>
       </w:pPr>
-      <w:bookmarkStart w:id="8" w:name="_Toc240935204"/>
+      <w:bookmarkStart w:id="8" w:name="_Toc240935671"/>
       <w:r>
         <w:lastRenderedPageBreak/>
         <w:t>9. Plan preventivo</w:t>
@@ -5266,7 +5276,7 @@
           <w:left w:w="10" w:type="dxa"/>
           <w:right w:w="10" w:type="dxa"/>
         </w:tblCellMar>
-        <w:tblLook w:val="0000" w:firstRow="0" w:lastRow="0" w:firstColumn="0" w:lastColumn="0" w:noHBand="0" w:noVBand="0"/>
+        <w:tblLook w:val="04A0" w:firstRow="1" w:lastRow="0" w:firstColumn="1" w:lastColumn="0" w:noHBand="0" w:noVBand="1"/>
       </w:tblPr>
       <w:tblGrid>
         <w:gridCol w:w="2600"/>
@@ -5567,7 +5577,7 @@
         <w:pStyle w:val="Ttulo2"/>
       </w:pPr>
       <w:r>
-        <w:t>9.2 Editar la pauta de una rutina</w:t>
+        <w:t>9.2 Generar la orden de una rutina</w:t>
       </w:r>
     </w:p>
     <w:p>
@@ -5575,7 +5585,17 @@
         <w:spacing w:after="120" w:line="290" w:lineRule="auto"/>
       </w:pPr>
       <w:r>
-        <w:t>Pulse el nombre de una rutina para abrir su pauta. Con rol Planificador o superior se puede:</w:t>
+        <w:t xml:space="preserve">En la ficha de la rutina (pulse su nombre en la lista), el botón </w:t>
+      </w:r>
+      <w:r>
+        <w:rPr>
+          <w:b/>
+          <w:bCs/>
+        </w:rPr>
+        <w:t>Generar orden de trabajo</w:t>
+      </w:r>
+      <w:r>
+        <w:t xml:space="preserve"> crea la orden preventiva con todos los pasos de la pauta y lleva directamente a ella. Requiere el rol Planificador o superior.</w:t>
       </w:r>
     </w:p>
     <w:p>
@@ -5588,14 +5608,7 @@
         <w:spacing w:after="60" w:line="280" w:lineRule="auto"/>
       </w:pPr>
       <w:r>
-        <w:rPr>
-          <w:b/>
-          <w:bCs/>
-        </w:rPr>
-        <w:t>Agregar un paso</w:t>
-      </w:r>
-      <w:r>
-        <w:t xml:space="preserve"> al final, con su tipo, la unidad esperada si es una medición y una advertencia de seguridad opcional.</w:t>
+        <w:t>La orden sale abierta, con la fecha actual, las horas estimadas de la rutina y prioridad alta si el equipo es crítico.</w:t>
       </w:r>
     </w:p>
     <w:p>
@@ -5608,6 +5621,99 @@
         <w:spacing w:after="60" w:line="280" w:lineRule="auto"/>
       </w:pPr>
       <w:r>
+        <w:t>Si la rutina ya tiene una orden abierta, en lugar del botón aparece el enlace a esa orden. No se pueden emitir dos órdenes de la misma mantención.</w:t>
+      </w:r>
+    </w:p>
+    <w:p>
+      <w:pPr>
+        <w:pStyle w:val="Prrafodelista"/>
+        <w:numPr>
+          <w:ilvl w:val="0"/>
+          <w:numId w:val="2"/>
+        </w:numPr>
+        <w:spacing w:after="60" w:line="280" w:lineRule="auto"/>
+      </w:pPr>
+      <w:r>
+        <w:t>Al cerrar la orden, la rutina calcula sola su próximo vencimiento.</w:t>
+      </w:r>
+    </w:p>
+    <w:p>
+      <w:pPr>
+        <w:pBdr>
+          <w:left w:val="single" w:sz="18" w:space="8" w:color="E0A030"/>
+        </w:pBdr>
+        <w:shd w:val="clear" w:color="auto" w:fill="FFF4E0"/>
+        <w:spacing w:before="120" w:after="160" w:line="280" w:lineRule="auto"/>
+        <w:ind w:left="120" w:right="120"/>
+      </w:pPr>
+      <w:r>
+        <w:rPr>
+          <w:b/>
+          <w:bCs/>
+          <w:color w:val="8A5A00"/>
+        </w:rPr>
+        <w:t xml:space="preserve">Importante.  </w:t>
+      </w:r>
+      <w:r>
+        <w:t xml:space="preserve">Una orden preventiva creada a mano desde </w:t>
+      </w:r>
+      <w:r>
+        <w:rPr>
+          <w:b/>
+          <w:bCs/>
+        </w:rPr>
+        <w:t>Órdenes → Nueva orden</w:t>
+      </w:r>
+      <w:r>
+        <w:t xml:space="preserve"> no trae pauta. Las preventivas se generan desde la rutina.</w:t>
+      </w:r>
+    </w:p>
+    <w:p>
+      <w:pPr>
+        <w:pStyle w:val="Ttulo2"/>
+      </w:pPr>
+      <w:r>
+        <w:t>9.3 Editar la pauta de una rutina</w:t>
+      </w:r>
+    </w:p>
+    <w:p>
+      <w:pPr>
+        <w:spacing w:after="120" w:line="290" w:lineRule="auto"/>
+      </w:pPr>
+      <w:r>
+        <w:t>Pulse el nombre de una rutina para abrir su pauta. Con rol Planificador o superior se puede:</w:t>
+      </w:r>
+    </w:p>
+    <w:p>
+      <w:pPr>
+        <w:pStyle w:val="Prrafodelista"/>
+        <w:numPr>
+          <w:ilvl w:val="0"/>
+          <w:numId w:val="2"/>
+        </w:numPr>
+        <w:spacing w:after="60" w:line="280" w:lineRule="auto"/>
+      </w:pPr>
+      <w:r>
+        <w:rPr>
+          <w:b/>
+          <w:bCs/>
+        </w:rPr>
+        <w:t>Agregar un paso</w:t>
+      </w:r>
+      <w:r>
+        <w:t xml:space="preserve"> al final, con su tipo, la unidad esperada si es una medición y una advertencia de seguridad opcional.</w:t>
+      </w:r>
+    </w:p>
+    <w:p>
+      <w:pPr>
+        <w:pStyle w:val="Prrafodelista"/>
+        <w:numPr>
+          <w:ilvl w:val="0"/>
+          <w:numId w:val="2"/>
+        </w:numPr>
+        <w:spacing w:after="60" w:line="280" w:lineRule="auto"/>
+      </w:pPr>
+      <w:r>
         <w:rPr>
           <w:b/>
           <w:bCs/>
@@ -5651,7 +5757,7 @@
         <w:pStyle w:val="Ttulo1"/>
         <w:pageBreakBefore/>
       </w:pPr>
-      <w:bookmarkStart w:id="9" w:name="_Toc240935205"/>
+      <w:bookmarkStart w:id="9" w:name="_Toc240935672"/>
       <w:r>
         <w:lastRenderedPageBreak/>
         <w:t>10. Horómetros</w:t>
@@ -5738,7 +5844,7 @@
         <w:pStyle w:val="Ttulo1"/>
         <w:pageBreakBefore/>
       </w:pPr>
-      <w:bookmarkStart w:id="10" w:name="_Toc240935206"/>
+      <w:bookmarkStart w:id="10" w:name="_Toc240935673"/>
       <w:r>
         <w:lastRenderedPageBreak/>
         <w:t>11. Priorización asistida por IA</w:t>
@@ -5786,7 +5892,7 @@
           <w:left w:w="10" w:type="dxa"/>
           <w:right w:w="10" w:type="dxa"/>
         </w:tblCellMar>
-        <w:tblLook w:val="0000" w:firstRow="0" w:lastRow="0" w:firstColumn="0" w:lastColumn="0" w:noHBand="0" w:noVBand="0"/>
+        <w:tblLook w:val="04A0" w:firstRow="1" w:lastRow="0" w:firstColumn="1" w:lastColumn="0" w:noHBand="0" w:noVBand="1"/>
       </w:tblPr>
       <w:tblGrid>
         <w:gridCol w:w="700"/>
@@ -6501,7 +6607,7 @@
         <w:pStyle w:val="Ttulo1"/>
         <w:pageBreakBefore/>
       </w:pPr>
-      <w:bookmarkStart w:id="11" w:name="_Toc240935207"/>
+      <w:bookmarkStart w:id="11" w:name="_Toc240935674"/>
       <w:r>
         <w:lastRenderedPageBreak/>
         <w:t>12. Análisis de causa raíz</w:t>
@@ -6629,7 +6735,7 @@
           <w:noProof/>
         </w:rPr>
         <w:drawing>
-          <wp:inline distT="0" distB="0" distL="0" distR="0" wp14:anchorId="7A3ABCC9" wp14:editId="3A6961A2">
+          <wp:inline distT="0" distB="0" distL="0" distR="0" wp14:anchorId="43ACDE6A" wp14:editId="59DD6D6F">
             <wp:extent cx="5524500" cy="3238500"/>
             <wp:effectExtent l="0" t="0" r="0" b="0"/>
             <wp:docPr id="1" name="Imagen 1"/>
@@ -6689,7 +6795,7 @@
         <w:pStyle w:val="Ttulo1"/>
         <w:pageBreakBefore/>
       </w:pPr>
-      <w:bookmarkStart w:id="12" w:name="_Toc240935208"/>
+      <w:bookmarkStart w:id="12" w:name="_Toc240935675"/>
       <w:r>
         <w:lastRenderedPageBreak/>
         <w:t>13. Reportes</w:t>
@@ -6788,7 +6894,7 @@
         <w:pStyle w:val="Ttulo1"/>
         <w:pageBreakBefore/>
       </w:pPr>
-      <w:bookmarkStart w:id="13" w:name="_Toc240935209"/>
+      <w:bookmarkStart w:id="13" w:name="_Toc240935676"/>
       <w:r>
         <w:lastRenderedPageBreak/>
         <w:t>14. Importar desde Excel</w:t>
@@ -6900,7 +7006,7 @@
           <w:left w:w="10" w:type="dxa"/>
           <w:right w:w="10" w:type="dxa"/>
         </w:tblCellMar>
-        <w:tblLook w:val="0000" w:firstRow="0" w:lastRow="0" w:firstColumn="0" w:lastColumn="0" w:noHBand="0" w:noVBand="0"/>
+        <w:tblLook w:val="04A0" w:firstRow="1" w:lastRow="0" w:firstColumn="1" w:lastColumn="0" w:noHBand="0" w:noVBand="1"/>
       </w:tblPr>
       <w:tblGrid>
         <w:gridCol w:w="3300"/>
@@ -7604,7 +7710,7 @@
         <w:pStyle w:val="Ttulo1"/>
         <w:pageBreakBefore/>
       </w:pPr>
-      <w:bookmarkStart w:id="14" w:name="_Toc240935210"/>
+      <w:bookmarkStart w:id="14" w:name="_Toc240935677"/>
       <w:r>
         <w:lastRenderedPageBreak/>
         <w:t>15. Administración de la instalación</w:t>
@@ -7802,7 +7908,7 @@
         <w:pStyle w:val="Ttulo1"/>
         <w:pageBreakBefore/>
       </w:pPr>
-      <w:bookmarkStart w:id="15" w:name="_Toc240935211"/>
+      <w:bookmarkStart w:id="15" w:name="_Toc240935678"/>
       <w:r>
         <w:lastRenderedPageBreak/>
         <w:t>16. Trazabilidad e historial</w:t>
@@ -7842,7 +7948,7 @@
           <w:left w:w="10" w:type="dxa"/>
           <w:right w:w="10" w:type="dxa"/>
         </w:tblCellMar>
-        <w:tblLook w:val="0000" w:firstRow="0" w:lastRow="0" w:firstColumn="0" w:lastColumn="0" w:noHBand="0" w:noVBand="0"/>
+        <w:tblLook w:val="04A0" w:firstRow="1" w:lastRow="0" w:firstColumn="1" w:lastColumn="0" w:noHBand="0" w:noVBand="1"/>
       </w:tblPr>
       <w:tblGrid>
         <w:gridCol w:w="3300"/>
@@ -8302,7 +8408,7 @@
         <w:pStyle w:val="Ttulo1"/>
         <w:pageBreakBefore/>
       </w:pPr>
-      <w:bookmarkStart w:id="16" w:name="_Toc240935212"/>
+      <w:bookmarkStart w:id="16" w:name="_Toc240935679"/>
       <w:r>
         <w:lastRenderedPageBreak/>
         <w:t>17. Preguntas frecuentes</w:t>
@@ -8446,7 +8552,7 @@
         <w:pStyle w:val="Ttulo1"/>
         <w:pageBreakBefore/>
       </w:pPr>
-      <w:bookmarkStart w:id="17" w:name="_Toc240935213"/>
+      <w:bookmarkStart w:id="17" w:name="_Toc240935680"/>
       <w:r>
         <w:lastRenderedPageBreak/>
         <w:t>18. Glosario</w:t>
@@ -8468,7 +8574,7 @@
           <w:left w:w="10" w:type="dxa"/>
           <w:right w:w="10" w:type="dxa"/>
         </w:tblCellMar>
-        <w:tblLook w:val="0000" w:firstRow="0" w:lastRow="0" w:firstColumn="0" w:lastColumn="0" w:noHBand="0" w:noVBand="0"/>
+        <w:tblLook w:val="04A0" w:firstRow="1" w:lastRow="0" w:firstColumn="1" w:lastColumn="0" w:noHBand="0" w:noVBand="1"/>
       </w:tblPr>
       <w:tblGrid>
         <w:gridCol w:w="2300"/>
@@ -9728,10 +9834,10 @@
 <file path=word/numbering.xml><?xml version="1.0" encoding="utf-8"?>
 <w:numbering xmlns:wpc="http://schemas.microsoft.com/office/word/2010/wordprocessingCanvas" xmlns:cx="http://schemas.microsoft.com/office/drawing/2014/chartex" xmlns:cx1="http://schemas.microsoft.com/office/drawing/2015/9/8/chartex" xmlns:cx2="http://schemas.microsoft.com/office/drawing/2015/10/21/chartex" xmlns:cx3="http://schemas.microsoft.com/office/drawing/2016/5/9/chartex" xmlns:cx4="http://schemas.microsoft.com/office/drawing/2016/5/10/chartex" xmlns:cx5="http://schemas.microsoft.com/office/drawing/2016/5/11/chartex" xmlns:cx6="http://schemas.microsoft.com/office/drawing/2016/5/12/chartex" xmlns:cx7="http://schemas.microsoft.com/office/drawing/2016/5/13/chartex" xmlns:cx8="http://schemas.microsoft.com/office/drawing/2016/5/14/chartex" xmlns:mc="http://schemas.openxmlformats.org/markup-compatibility/2006" xmlns:aink="http://schemas.microsoft.com/office/drawing/2016/ink" xmlns:am3d="http://schemas.microsoft.com/office/drawing/2017/model3d" xmlns:o="urn:schemas-microsoft-com:office:office" xmlns:oel="http://schemas.microsoft.com/office/2019/extlst" xmlns:r="http://schemas.openxmlformats.org/officeDocument/2006/relationships" xmlns:m="http://schemas.openxmlformats.org/officeDocument/2006/math" xmlns:v="urn:schemas-microsoft-com:vml" xmlns:wp14="http://schemas.microsoft.com/office/word/2010/wordprocessingDrawing" xmlns:wp="http://schemas.openxmlformats.org/drawingml/2006/wordprocessingDrawing" xmlns:w10="urn:schemas-microsoft-com:office:word" xmlns:w="http://schemas.openxmlformats.org/wordprocessingml/2006/main" xmlns:w14="http://schemas.microsoft.com/office/word/2010/wordml" xmlns:w15="http://schemas.microsoft.com/office/word/2012/wordml" xmlns:w16cex="http://schemas.microsoft.com/office/word/2018/wordml/cex" xmlns:w16cid="http://schemas.microsoft.com/office/word/2016/wordml/cid" xmlns:w16="http://schemas.microsoft.com/office/word/2018/wordml" xmlns:w16du="http://schemas.microsoft.com/office/word/2023/wordml/word16du" xmlns:w16sdtdh="http://schemas.microsoft.com/office/word/2020/wordml/sdtdatahash" xmlns:w16sdtfl="http://schemas.microsoft.com/office/word/2024/wordml/sdtformatlock" xmlns:w16se="http://schemas.microsoft.com/office/word/2015/wordml/symex" xmlns:wpg="http://schemas.microsoft.com/office/word/2010/wordprocessingGroup" xmlns:wpi="http://schemas.microsoft.com/office/word/2010/wordprocessingInk" xmlns:wne="http://schemas.microsoft.com/office/word/2006/wordml" xmlns:wps="http://schemas.microsoft.com/office/word/2010/wordprocessingShape" mc:Ignorable="w14 w15 w16se w16cid w16 w16cex w16sdtdh w16sdtfl w16du wp14">
   <w:abstractNum w:abstractNumId="0" w15:restartNumberingAfterBreak="0">
-    <w:nsid w:val="035175BE"/>
+    <w:nsid w:val="02A17C1C"/>
     <w:multiLevelType w:val="hybridMultilevel"/>
-    <w:tmpl w:val="B1D82B86"/>
-    <w:lvl w:ilvl="0" w:tplc="0E5430CA">
+    <w:tmpl w:val="363C2076"/>
+    <w:lvl w:ilvl="0" w:tplc="97D0A2B0">
       <w:start w:val="1"/>
       <w:numFmt w:val="decimal"/>
       <w:lvlText w:val="%1."/>
@@ -9740,106 +9846,110 @@
         <w:ind w:left="460" w:hanging="320"/>
       </w:pPr>
     </w:lvl>
-    <w:lvl w:ilvl="1" w:tplc="26CEF3C0">
+    <w:lvl w:ilvl="1" w:tplc="EA2AFD8A">
       <w:numFmt w:val="decimal"/>
       <w:lvlText w:val=""/>
       <w:lvlJc w:val="left"/>
     </w:lvl>
-    <w:lvl w:ilvl="2" w:tplc="BFACCFD0">
+    <w:lvl w:ilvl="2" w:tplc="2BA260E8">
       <w:numFmt w:val="decimal"/>
       <w:lvlText w:val=""/>
       <w:lvlJc w:val="left"/>
     </w:lvl>
-    <w:lvl w:ilvl="3" w:tplc="06B6DA20">
+    <w:lvl w:ilvl="3" w:tplc="093A398C">
       <w:numFmt w:val="decimal"/>
       <w:lvlText w:val=""/>
       <w:lvlJc w:val="left"/>
     </w:lvl>
-    <w:lvl w:ilvl="4" w:tplc="ACF84264">
+    <w:lvl w:ilvl="4" w:tplc="3BCEBF98">
       <w:numFmt w:val="decimal"/>
       <w:lvlText w:val=""/>
       <w:lvlJc w:val="left"/>
     </w:lvl>
-    <w:lvl w:ilvl="5" w:tplc="504CFB1E">
+    <w:lvl w:ilvl="5" w:tplc="DF9AD714">
       <w:numFmt w:val="decimal"/>
       <w:lvlText w:val=""/>
       <w:lvlJc w:val="left"/>
     </w:lvl>
-    <w:lvl w:ilvl="6" w:tplc="4C7CBEB0">
+    <w:lvl w:ilvl="6" w:tplc="9A8C9A90">
       <w:numFmt w:val="decimal"/>
       <w:lvlText w:val=""/>
       <w:lvlJc w:val="left"/>
     </w:lvl>
-    <w:lvl w:ilvl="7" w:tplc="13807D4E">
+    <w:lvl w:ilvl="7" w:tplc="36EED284">
       <w:numFmt w:val="decimal"/>
       <w:lvlText w:val=""/>
       <w:lvlJc w:val="left"/>
     </w:lvl>
-    <w:lvl w:ilvl="8" w:tplc="BCC6AA62">
+    <w:lvl w:ilvl="8" w:tplc="D16CB076">
       <w:numFmt w:val="decimal"/>
       <w:lvlText w:val=""/>
       <w:lvlJc w:val="left"/>
     </w:lvl>
   </w:abstractNum>
   <w:abstractNum w:abstractNumId="1" w15:restartNumberingAfterBreak="0">
-    <w:nsid w:val="0A917CA8"/>
+    <w:nsid w:val="08C34D90"/>
     <w:multiLevelType w:val="hybridMultilevel"/>
-    <w:tmpl w:val="0C46382C"/>
-    <w:lvl w:ilvl="0" w:tplc="3CB66CC0">
+    <w:tmpl w:val="AC84C850"/>
+    <w:lvl w:ilvl="0" w:tplc="321CDDFA">
       <w:start w:val="1"/>
-      <w:numFmt w:val="decimal"/>
-      <w:lvlText w:val="%1."/>
+      <w:numFmt w:val="bullet"/>
+      <w:lvlText w:val="•"/>
       <w:lvlJc w:val="left"/>
       <w:pPr>
-        <w:ind w:left="460" w:hanging="320"/>
+        <w:ind w:left="460" w:hanging="280"/>
       </w:pPr>
     </w:lvl>
-    <w:lvl w:ilvl="1" w:tplc="7F78A13A">
+    <w:lvl w:ilvl="1" w:tplc="4714619A">
+      <w:start w:val="1"/>
+      <w:numFmt w:val="bullet"/>
+      <w:lvlText w:val="–"/>
+      <w:lvlJc w:val="left"/>
+      <w:pPr>
+        <w:ind w:left="900" w:hanging="280"/>
+      </w:pPr>
+    </w:lvl>
+    <w:lvl w:ilvl="2" w:tplc="E9BA39A8">
       <w:numFmt w:val="decimal"/>
       <w:lvlText w:val=""/>
       <w:lvlJc w:val="left"/>
     </w:lvl>
-    <w:lvl w:ilvl="2" w:tplc="B608F408">
+    <w:lvl w:ilvl="3" w:tplc="31CA6BA0">
       <w:numFmt w:val="decimal"/>
       <w:lvlText w:val=""/>
       <w:lvlJc w:val="left"/>
     </w:lvl>
-    <w:lvl w:ilvl="3" w:tplc="71380E8A">
+    <w:lvl w:ilvl="4" w:tplc="548E207A">
       <w:numFmt w:val="decimal"/>
       <w:lvlText w:val=""/>
       <w:lvlJc w:val="left"/>
     </w:lvl>
-    <w:lvl w:ilvl="4" w:tplc="39A86128">
+    <w:lvl w:ilvl="5" w:tplc="4002DC80">
       <w:numFmt w:val="decimal"/>
       <w:lvlText w:val=""/>
       <w:lvlJc w:val="left"/>
     </w:lvl>
-    <w:lvl w:ilvl="5" w:tplc="BBAC2A6C">
+    <w:lvl w:ilvl="6" w:tplc="D56C3026">
       <w:numFmt w:val="decimal"/>
       <w:lvlText w:val=""/>
       <w:lvlJc w:val="left"/>
     </w:lvl>
-    <w:lvl w:ilvl="6" w:tplc="BFA0FD8E">
+    <w:lvl w:ilvl="7" w:tplc="AB402E20">
       <w:numFmt w:val="decimal"/>
       <w:lvlText w:val=""/>
       <w:lvlJc w:val="left"/>
     </w:lvl>
-    <w:lvl w:ilvl="7" w:tplc="C4C65EEA">
-      <w:numFmt w:val="decimal"/>
-      <w:lvlText w:val=""/>
-      <w:lvlJc w:val="left"/>
-    </w:lvl>
-    <w:lvl w:ilvl="8" w:tplc="A1C827DA">
+    <w:lvl w:ilvl="8" w:tplc="F82C6CFC">
       <w:numFmt w:val="decimal"/>
       <w:lvlText w:val=""/>
       <w:lvlJc w:val="left"/>
     </w:lvl>
   </w:abstractNum>
   <w:abstractNum w:abstractNumId="2" w15:restartNumberingAfterBreak="0">
-    <w:nsid w:val="1EFB43F9"/>
+    <w:nsid w:val="12795FA3"/>
     <w:multiLevelType w:val="hybridMultilevel"/>
-    <w:tmpl w:val="CC020290"/>
-    <w:lvl w:ilvl="0" w:tplc="AAC0363C">
+    <w:tmpl w:val="66EE3D7C"/>
+    <w:lvl w:ilvl="0" w:tplc="10829BCE">
       <w:start w:val="1"/>
       <w:numFmt w:val="decimal"/>
       <w:lvlText w:val="%1."/>
@@ -9848,138 +9958,52 @@
         <w:ind w:left="460" w:hanging="320"/>
       </w:pPr>
     </w:lvl>
-    <w:lvl w:ilvl="1" w:tplc="F416A4CC">
+    <w:lvl w:ilvl="1" w:tplc="BC7A31D4">
       <w:numFmt w:val="decimal"/>
       <w:lvlText w:val=""/>
       <w:lvlJc w:val="left"/>
     </w:lvl>
-    <w:lvl w:ilvl="2" w:tplc="CA108052">
+    <w:lvl w:ilvl="2" w:tplc="07EC5A8E">
       <w:numFmt w:val="decimal"/>
       <w:lvlText w:val=""/>
       <w:lvlJc w:val="left"/>
     </w:lvl>
-    <w:lvl w:ilvl="3" w:tplc="364A33E2">
+    <w:lvl w:ilvl="3" w:tplc="8170201C">
       <w:numFmt w:val="decimal"/>
       <w:lvlText w:val=""/>
       <w:lvlJc w:val="left"/>
     </w:lvl>
-    <w:lvl w:ilvl="4" w:tplc="DDC0B646">
+    <w:lvl w:ilvl="4" w:tplc="55D4FBE2">
       <w:numFmt w:val="decimal"/>
       <w:lvlText w:val=""/>
       <w:lvlJc w:val="left"/>
     </w:lvl>
-    <w:lvl w:ilvl="5" w:tplc="0D9ECD4C">
+    <w:lvl w:ilvl="5" w:tplc="B1E07C22">
       <w:numFmt w:val="decimal"/>
       <w:lvlText w:val=""/>
       <w:lvlJc w:val="left"/>
     </w:lvl>
-    <w:lvl w:ilvl="6" w:tplc="7CF8A816">
+    <w:lvl w:ilvl="6" w:tplc="AD6ED708">
       <w:numFmt w:val="decimal"/>
       <w:lvlText w:val=""/>
       <w:lvlJc w:val="left"/>
     </w:lvl>
-    <w:lvl w:ilvl="7" w:tplc="EA3A76B8">
+    <w:lvl w:ilvl="7" w:tplc="F5BEFAFC">
       <w:numFmt w:val="decimal"/>
       <w:lvlText w:val=""/>
       <w:lvlJc w:val="left"/>
     </w:lvl>
-    <w:lvl w:ilvl="8" w:tplc="F7F8A7C6">
+    <w:lvl w:ilvl="8" w:tplc="197CFCEA">
       <w:numFmt w:val="decimal"/>
       <w:lvlText w:val=""/>
       <w:lvlJc w:val="left"/>
     </w:lvl>
   </w:abstractNum>
   <w:abstractNum w:abstractNumId="3" w15:restartNumberingAfterBreak="0">
-    <w:nsid w:val="257C3422"/>
+    <w:nsid w:val="13AE2ED0"/>
     <w:multiLevelType w:val="hybridMultilevel"/>
-    <w:tmpl w:val="267EFC82"/>
-    <w:lvl w:ilvl="0" w:tplc="966A020A">
-      <w:start w:val="1"/>
-      <w:numFmt w:val="bullet"/>
-      <w:lvlText w:val="●"/>
-      <w:lvlJc w:val="left"/>
-      <w:pPr>
-        <w:ind w:left="720" w:hanging="360"/>
-      </w:pPr>
-    </w:lvl>
-    <w:lvl w:ilvl="1" w:tplc="86866724">
-      <w:start w:val="1"/>
-      <w:numFmt w:val="bullet"/>
-      <w:lvlText w:val="○"/>
-      <w:lvlJc w:val="left"/>
-      <w:pPr>
-        <w:ind w:left="1440" w:hanging="360"/>
-      </w:pPr>
-    </w:lvl>
-    <w:lvl w:ilvl="2" w:tplc="2E9A2D30">
-      <w:start w:val="1"/>
-      <w:numFmt w:val="bullet"/>
-      <w:lvlText w:val="■"/>
-      <w:lvlJc w:val="left"/>
-      <w:pPr>
-        <w:ind w:left="2160" w:hanging="360"/>
-      </w:pPr>
-    </w:lvl>
-    <w:lvl w:ilvl="3" w:tplc="10E8E774">
-      <w:start w:val="1"/>
-      <w:numFmt w:val="bullet"/>
-      <w:lvlText w:val="●"/>
-      <w:lvlJc w:val="left"/>
-      <w:pPr>
-        <w:ind w:left="2880" w:hanging="360"/>
-      </w:pPr>
-    </w:lvl>
-    <w:lvl w:ilvl="4" w:tplc="DB142AA8">
-      <w:start w:val="1"/>
-      <w:numFmt w:val="bullet"/>
-      <w:lvlText w:val="○"/>
-      <w:lvlJc w:val="left"/>
-      <w:pPr>
-        <w:ind w:left="3600" w:hanging="360"/>
-      </w:pPr>
-    </w:lvl>
-    <w:lvl w:ilvl="5" w:tplc="B43876A8">
-      <w:start w:val="1"/>
-      <w:numFmt w:val="bullet"/>
-      <w:lvlText w:val="■"/>
-      <w:lvlJc w:val="left"/>
-      <w:pPr>
-        <w:ind w:left="4320" w:hanging="360"/>
-      </w:pPr>
-    </w:lvl>
-    <w:lvl w:ilvl="6" w:tplc="A1EA311A">
-      <w:start w:val="1"/>
-      <w:numFmt w:val="bullet"/>
-      <w:lvlText w:val="●"/>
-      <w:lvlJc w:val="left"/>
-      <w:pPr>
-        <w:ind w:left="5040" w:hanging="360"/>
-      </w:pPr>
-    </w:lvl>
-    <w:lvl w:ilvl="7" w:tplc="114876F6">
-      <w:start w:val="1"/>
-      <w:numFmt w:val="bullet"/>
-      <w:lvlText w:val="●"/>
-      <w:lvlJc w:val="left"/>
-      <w:pPr>
-        <w:ind w:left="5760" w:hanging="360"/>
-      </w:pPr>
-    </w:lvl>
-    <w:lvl w:ilvl="8" w:tplc="5A34E066">
-      <w:start w:val="1"/>
-      <w:numFmt w:val="bullet"/>
-      <w:lvlText w:val="●"/>
-      <w:lvlJc w:val="left"/>
-      <w:pPr>
-        <w:ind w:left="6480" w:hanging="360"/>
-      </w:pPr>
-    </w:lvl>
-  </w:abstractNum>
-  <w:abstractNum w:abstractNumId="4" w15:restartNumberingAfterBreak="0">
-    <w:nsid w:val="25A85D80"/>
-    <w:multiLevelType w:val="hybridMultilevel"/>
-    <w:tmpl w:val="63FC59AA"/>
-    <w:lvl w:ilvl="0" w:tplc="2878D522">
+    <w:tmpl w:val="5BD8FC7A"/>
+    <w:lvl w:ilvl="0" w:tplc="7D68A414">
       <w:start w:val="1"/>
       <w:numFmt w:val="decimal"/>
       <w:lvlText w:val="%1."/>
@@ -9988,164 +10012,246 @@
         <w:ind w:left="460" w:hanging="320"/>
       </w:pPr>
     </w:lvl>
-    <w:lvl w:ilvl="1" w:tplc="1B8AE216">
+    <w:lvl w:ilvl="1" w:tplc="05C6BF80">
       <w:numFmt w:val="decimal"/>
       <w:lvlText w:val=""/>
       <w:lvlJc w:val="left"/>
     </w:lvl>
-    <w:lvl w:ilvl="2" w:tplc="1BB8D712">
+    <w:lvl w:ilvl="2" w:tplc="3F646094">
       <w:numFmt w:val="decimal"/>
       <w:lvlText w:val=""/>
       <w:lvlJc w:val="left"/>
     </w:lvl>
-    <w:lvl w:ilvl="3" w:tplc="69F2DA06">
+    <w:lvl w:ilvl="3" w:tplc="79A41924">
       <w:numFmt w:val="decimal"/>
       <w:lvlText w:val=""/>
       <w:lvlJc w:val="left"/>
     </w:lvl>
-    <w:lvl w:ilvl="4" w:tplc="C186E0D0">
+    <w:lvl w:ilvl="4" w:tplc="EDB4D2E2">
       <w:numFmt w:val="decimal"/>
       <w:lvlText w:val=""/>
       <w:lvlJc w:val="left"/>
     </w:lvl>
-    <w:lvl w:ilvl="5" w:tplc="29E81120">
+    <w:lvl w:ilvl="5" w:tplc="C0E4A634">
       <w:numFmt w:val="decimal"/>
       <w:lvlText w:val=""/>
       <w:lvlJc w:val="left"/>
     </w:lvl>
-    <w:lvl w:ilvl="6" w:tplc="61A8F10E">
+    <w:lvl w:ilvl="6" w:tplc="B5EE2188">
       <w:numFmt w:val="decimal"/>
       <w:lvlText w:val=""/>
       <w:lvlJc w:val="left"/>
     </w:lvl>
-    <w:lvl w:ilvl="7" w:tplc="5B12296E">
+    <w:lvl w:ilvl="7" w:tplc="A934C380">
       <w:numFmt w:val="decimal"/>
       <w:lvlText w:val=""/>
       <w:lvlJc w:val="left"/>
     </w:lvl>
-    <w:lvl w:ilvl="8" w:tplc="E21281C8">
+    <w:lvl w:ilvl="8" w:tplc="A2FC44BE">
+      <w:numFmt w:val="decimal"/>
+      <w:lvlText w:val=""/>
+      <w:lvlJc w:val="left"/>
+    </w:lvl>
+  </w:abstractNum>
+  <w:abstractNum w:abstractNumId="4" w15:restartNumberingAfterBreak="0">
+    <w:nsid w:val="147A476B"/>
+    <w:multiLevelType w:val="hybridMultilevel"/>
+    <w:tmpl w:val="0F8CC4E0"/>
+    <w:lvl w:ilvl="0" w:tplc="7F0EAE60">
+      <w:start w:val="1"/>
+      <w:numFmt w:val="decimal"/>
+      <w:lvlText w:val="%1."/>
+      <w:lvlJc w:val="left"/>
+      <w:pPr>
+        <w:ind w:left="460" w:hanging="320"/>
+      </w:pPr>
+    </w:lvl>
+    <w:lvl w:ilvl="1" w:tplc="3BF8FCB0">
+      <w:numFmt w:val="decimal"/>
+      <w:lvlText w:val=""/>
+      <w:lvlJc w:val="left"/>
+    </w:lvl>
+    <w:lvl w:ilvl="2" w:tplc="89E476EE">
+      <w:numFmt w:val="decimal"/>
+      <w:lvlText w:val=""/>
+      <w:lvlJc w:val="left"/>
+    </w:lvl>
+    <w:lvl w:ilvl="3" w:tplc="0C0A4B4E">
+      <w:numFmt w:val="decimal"/>
+      <w:lvlText w:val=""/>
+      <w:lvlJc w:val="left"/>
+    </w:lvl>
+    <w:lvl w:ilvl="4" w:tplc="851C20EC">
+      <w:numFmt w:val="decimal"/>
+      <w:lvlText w:val=""/>
+      <w:lvlJc w:val="left"/>
+    </w:lvl>
+    <w:lvl w:ilvl="5" w:tplc="8990FB26">
+      <w:numFmt w:val="decimal"/>
+      <w:lvlText w:val=""/>
+      <w:lvlJc w:val="left"/>
+    </w:lvl>
+    <w:lvl w:ilvl="6" w:tplc="ADDA0662">
+      <w:numFmt w:val="decimal"/>
+      <w:lvlText w:val=""/>
+      <w:lvlJc w:val="left"/>
+    </w:lvl>
+    <w:lvl w:ilvl="7" w:tplc="52AAB1B6">
+      <w:numFmt w:val="decimal"/>
+      <w:lvlText w:val=""/>
+      <w:lvlJc w:val="left"/>
+    </w:lvl>
+    <w:lvl w:ilvl="8" w:tplc="2424C3A6">
       <w:numFmt w:val="decimal"/>
       <w:lvlText w:val=""/>
       <w:lvlJc w:val="left"/>
     </w:lvl>
   </w:abstractNum>
   <w:abstractNum w:abstractNumId="5" w15:restartNumberingAfterBreak="0">
-    <w:nsid w:val="34637351"/>
+    <w:nsid w:val="30A576EB"/>
     <w:multiLevelType w:val="hybridMultilevel"/>
-    <w:tmpl w:val="7F509F02"/>
-    <w:lvl w:ilvl="0" w:tplc="9C2A9FB0">
+    <w:tmpl w:val="E216E0EC"/>
+    <w:lvl w:ilvl="0" w:tplc="49CEFC92">
       <w:start w:val="1"/>
       <w:numFmt w:val="bullet"/>
-      <w:lvlText w:val="•"/>
+      <w:lvlText w:val="●"/>
       <w:lvlJc w:val="left"/>
       <w:pPr>
-        <w:ind w:left="460" w:hanging="280"/>
+        <w:ind w:left="720" w:hanging="360"/>
       </w:pPr>
     </w:lvl>
-    <w:lvl w:ilvl="1" w:tplc="8E1AFAB4">
+    <w:lvl w:ilvl="1" w:tplc="F3103926">
       <w:start w:val="1"/>
       <w:numFmt w:val="bullet"/>
-      <w:lvlText w:val="–"/>
+      <w:lvlText w:val="○"/>
       <w:lvlJc w:val="left"/>
       <w:pPr>
-        <w:ind w:left="900" w:hanging="280"/>
+        <w:ind w:left="1440" w:hanging="360"/>
       </w:pPr>
     </w:lvl>
-    <w:lvl w:ilvl="2" w:tplc="6B82B748">
+    <w:lvl w:ilvl="2" w:tplc="B9044D02">
+      <w:start w:val="1"/>
+      <w:numFmt w:val="bullet"/>
+      <w:lvlText w:val="■"/>
+      <w:lvlJc w:val="left"/>
+      <w:pPr>
+        <w:ind w:left="2160" w:hanging="360"/>
+      </w:pPr>
+    </w:lvl>
+    <w:lvl w:ilvl="3" w:tplc="BD2CBB26">
+      <w:start w:val="1"/>
+      <w:numFmt w:val="bullet"/>
+      <w:lvlText w:val="●"/>
+      <w:lvlJc w:val="left"/>
+      <w:pPr>
+        <w:ind w:left="2880" w:hanging="360"/>
+      </w:pPr>
+    </w:lvl>
+    <w:lvl w:ilvl="4" w:tplc="522EFF2A">
+      <w:start w:val="1"/>
+      <w:numFmt w:val="bullet"/>
+      <w:lvlText w:val="○"/>
+      <w:lvlJc w:val="left"/>
+      <w:pPr>
+        <w:ind w:left="3600" w:hanging="360"/>
+      </w:pPr>
+    </w:lvl>
+    <w:lvl w:ilvl="5" w:tplc="7422CB84">
+      <w:start w:val="1"/>
+      <w:numFmt w:val="bullet"/>
+      <w:lvlText w:val="■"/>
+      <w:lvlJc w:val="left"/>
+      <w:pPr>
+        <w:ind w:left="4320" w:hanging="360"/>
+      </w:pPr>
+    </w:lvl>
+    <w:lvl w:ilvl="6" w:tplc="411C557C">
+      <w:start w:val="1"/>
+      <w:numFmt w:val="bullet"/>
+      <w:lvlText w:val="●"/>
+      <w:lvlJc w:val="left"/>
+      <w:pPr>
+        <w:ind w:left="5040" w:hanging="360"/>
+      </w:pPr>
+    </w:lvl>
+    <w:lvl w:ilvl="7" w:tplc="E0AA6720">
+      <w:start w:val="1"/>
+      <w:numFmt w:val="bullet"/>
+      <w:lvlText w:val="●"/>
+      <w:lvlJc w:val="left"/>
+      <w:pPr>
+        <w:ind w:left="5760" w:hanging="360"/>
+      </w:pPr>
+    </w:lvl>
+    <w:lvl w:ilvl="8" w:tplc="9D600D76">
+      <w:start w:val="1"/>
+      <w:numFmt w:val="bullet"/>
+      <w:lvlText w:val="●"/>
+      <w:lvlJc w:val="left"/>
+      <w:pPr>
+        <w:ind w:left="6480" w:hanging="360"/>
+      </w:pPr>
+    </w:lvl>
+  </w:abstractNum>
+  <w:abstractNum w:abstractNumId="6" w15:restartNumberingAfterBreak="0">
+    <w:nsid w:val="319B3288"/>
+    <w:multiLevelType w:val="hybridMultilevel"/>
+    <w:tmpl w:val="B6F43010"/>
+    <w:lvl w:ilvl="0" w:tplc="310CFC14">
+      <w:start w:val="1"/>
+      <w:numFmt w:val="decimal"/>
+      <w:lvlText w:val="%1."/>
+      <w:lvlJc w:val="left"/>
+      <w:pPr>
+        <w:ind w:left="460" w:hanging="320"/>
+      </w:pPr>
+    </w:lvl>
+    <w:lvl w:ilvl="1" w:tplc="1DB0325A">
       <w:numFmt w:val="decimal"/>
       <w:lvlText w:val=""/>
       <w:lvlJc w:val="left"/>
     </w:lvl>
-    <w:lvl w:ilvl="3" w:tplc="D01409CE">
+    <w:lvl w:ilvl="2" w:tplc="3092B2B4">
       <w:numFmt w:val="decimal"/>
       <w:lvlText w:val=""/>
       <w:lvlJc w:val="left"/>
     </w:lvl>
-    <w:lvl w:ilvl="4" w:tplc="8572CF88">
+    <w:lvl w:ilvl="3" w:tplc="1F508114">
       <w:numFmt w:val="decimal"/>
       <w:lvlText w:val=""/>
       <w:lvlJc w:val="left"/>
     </w:lvl>
-    <w:lvl w:ilvl="5" w:tplc="52761316">
+    <w:lvl w:ilvl="4" w:tplc="60C83F5A">
       <w:numFmt w:val="decimal"/>
       <w:lvlText w:val=""/>
       <w:lvlJc w:val="left"/>
     </w:lvl>
-    <w:lvl w:ilvl="6" w:tplc="9FF4D65A">
+    <w:lvl w:ilvl="5" w:tplc="AF1669B6">
       <w:numFmt w:val="decimal"/>
       <w:lvlText w:val=""/>
       <w:lvlJc w:val="left"/>
     </w:lvl>
-    <w:lvl w:ilvl="7" w:tplc="FCD2A22C">
+    <w:lvl w:ilvl="6" w:tplc="F0CE96CE">
       <w:numFmt w:val="decimal"/>
       <w:lvlText w:val=""/>
       <w:lvlJc w:val="left"/>
     </w:lvl>
-    <w:lvl w:ilvl="8" w:tplc="EC56450A">
+    <w:lvl w:ilvl="7" w:tplc="ED9AB8DC">
       <w:numFmt w:val="decimal"/>
       <w:lvlText w:val=""/>
       <w:lvlJc w:val="left"/>
     </w:lvl>
-  </w:abstractNum>
-  <w:abstractNum w:abstractNumId="6" w15:restartNumberingAfterBreak="0">
-    <w:nsid w:val="45E06526"/>
-    <w:multiLevelType w:val="hybridMultilevel"/>
-    <w:tmpl w:val="54FCDA54"/>
-    <w:lvl w:ilvl="0" w:tplc="6E32D9DA">
-      <w:start w:val="1"/>
-      <w:numFmt w:val="decimal"/>
-      <w:lvlText w:val="%1."/>
-      <w:lvlJc w:val="left"/>
-      <w:pPr>
-        <w:ind w:left="460" w:hanging="320"/>
-      </w:pPr>
-    </w:lvl>
-    <w:lvl w:ilvl="1" w:tplc="2996BA8E">
-      <w:numFmt w:val="decimal"/>
-      <w:lvlText w:val=""/>
-      <w:lvlJc w:val="left"/>
-    </w:lvl>
-    <w:lvl w:ilvl="2" w:tplc="7AA2F716">
-      <w:numFmt w:val="decimal"/>
-      <w:lvlText w:val=""/>
-      <w:lvlJc w:val="left"/>
-    </w:lvl>
-    <w:lvl w:ilvl="3" w:tplc="9802FE50">
-      <w:numFmt w:val="decimal"/>
-      <w:lvlText w:val=""/>
-      <w:lvlJc w:val="left"/>
-    </w:lvl>
-    <w:lvl w:ilvl="4" w:tplc="CAA6CF42">
-      <w:numFmt w:val="decimal"/>
-      <w:lvlText w:val=""/>
-      <w:lvlJc w:val="left"/>
-    </w:lvl>
-    <w:lvl w:ilvl="5" w:tplc="CBEC9588">
-      <w:numFmt w:val="decimal"/>
-      <w:lvlText w:val=""/>
-      <w:lvlJc w:val="left"/>
-    </w:lvl>
-    <w:lvl w:ilvl="6" w:tplc="29DA1254">
-      <w:numFmt w:val="decimal"/>
-      <w:lvlText w:val=""/>
-      <w:lvlJc w:val="left"/>
-    </w:lvl>
-    <w:lvl w:ilvl="7" w:tplc="7FD8F4DC">
-      <w:numFmt w:val="decimal"/>
-      <w:lvlText w:val=""/>
-      <w:lvlJc w:val="left"/>
-    </w:lvl>
-    <w:lvl w:ilvl="8" w:tplc="345CF434">
+    <w:lvl w:ilvl="8" w:tplc="6670321A">
       <w:numFmt w:val="decimal"/>
       <w:lvlText w:val=""/>
       <w:lvlJc w:val="left"/>
     </w:lvl>
   </w:abstractNum>
   <w:abstractNum w:abstractNumId="7" w15:restartNumberingAfterBreak="0">
-    <w:nsid w:val="5B2C792C"/>
+    <w:nsid w:val="4A393384"/>
     <w:multiLevelType w:val="hybridMultilevel"/>
-    <w:tmpl w:val="C3C632B6"/>
-    <w:lvl w:ilvl="0" w:tplc="CD62A046">
+    <w:tmpl w:val="F4422A76"/>
+    <w:lvl w:ilvl="0" w:tplc="4E8E15FE">
       <w:start w:val="1"/>
       <w:numFmt w:val="decimal"/>
       <w:lvlText w:val="%1."/>
@@ -10154,52 +10260,52 @@
         <w:ind w:left="460" w:hanging="320"/>
       </w:pPr>
     </w:lvl>
-    <w:lvl w:ilvl="1" w:tplc="149CE3FC">
+    <w:lvl w:ilvl="1" w:tplc="0DF60D7E">
       <w:numFmt w:val="decimal"/>
       <w:lvlText w:val=""/>
       <w:lvlJc w:val="left"/>
     </w:lvl>
-    <w:lvl w:ilvl="2" w:tplc="F618AC58">
+    <w:lvl w:ilvl="2" w:tplc="E0EC4D6C">
       <w:numFmt w:val="decimal"/>
       <w:lvlText w:val=""/>
       <w:lvlJc w:val="left"/>
     </w:lvl>
-    <w:lvl w:ilvl="3" w:tplc="602AA2F2">
+    <w:lvl w:ilvl="3" w:tplc="A39E75E8">
       <w:numFmt w:val="decimal"/>
       <w:lvlText w:val=""/>
       <w:lvlJc w:val="left"/>
     </w:lvl>
-    <w:lvl w:ilvl="4" w:tplc="CCAEEED6">
+    <w:lvl w:ilvl="4" w:tplc="E916A3BC">
       <w:numFmt w:val="decimal"/>
       <w:lvlText w:val=""/>
       <w:lvlJc w:val="left"/>
     </w:lvl>
-    <w:lvl w:ilvl="5" w:tplc="1F627CF0">
+    <w:lvl w:ilvl="5" w:tplc="F04AF05A">
       <w:numFmt w:val="decimal"/>
       <w:lvlText w:val=""/>
       <w:lvlJc w:val="left"/>
     </w:lvl>
-    <w:lvl w:ilvl="6" w:tplc="92CACBE6">
+    <w:lvl w:ilvl="6" w:tplc="2F563F0C">
       <w:numFmt w:val="decimal"/>
       <w:lvlText w:val=""/>
       <w:lvlJc w:val="left"/>
     </w:lvl>
-    <w:lvl w:ilvl="7" w:tplc="EB581AC6">
+    <w:lvl w:ilvl="7" w:tplc="14BCF462">
       <w:numFmt w:val="decimal"/>
       <w:lvlText w:val=""/>
       <w:lvlJc w:val="left"/>
     </w:lvl>
-    <w:lvl w:ilvl="8" w:tplc="6C907140">
+    <w:lvl w:ilvl="8" w:tplc="D5548F88">
       <w:numFmt w:val="decimal"/>
       <w:lvlText w:val=""/>
       <w:lvlJc w:val="left"/>
     </w:lvl>
   </w:abstractNum>
   <w:abstractNum w:abstractNumId="8" w15:restartNumberingAfterBreak="0">
-    <w:nsid w:val="70000DC2"/>
+    <w:nsid w:val="552E7D01"/>
     <w:multiLevelType w:val="hybridMultilevel"/>
-    <w:tmpl w:val="E89678D6"/>
-    <w:lvl w:ilvl="0" w:tplc="4524E572">
+    <w:tmpl w:val="DC2C0694"/>
+    <w:lvl w:ilvl="0" w:tplc="A502BDA8">
       <w:start w:val="1"/>
       <w:numFmt w:val="decimal"/>
       <w:lvlText w:val="%1."/>
@@ -10208,52 +10314,52 @@
         <w:ind w:left="460" w:hanging="320"/>
       </w:pPr>
     </w:lvl>
-    <w:lvl w:ilvl="1" w:tplc="F4E6C380">
+    <w:lvl w:ilvl="1" w:tplc="46B4DF08">
       <w:numFmt w:val="decimal"/>
       <w:lvlText w:val=""/>
       <w:lvlJc w:val="left"/>
     </w:lvl>
-    <w:lvl w:ilvl="2" w:tplc="AA18C482">
+    <w:lvl w:ilvl="2" w:tplc="CA1AD392">
       <w:numFmt w:val="decimal"/>
       <w:lvlText w:val=""/>
       <w:lvlJc w:val="left"/>
     </w:lvl>
-    <w:lvl w:ilvl="3" w:tplc="2E141E7A">
+    <w:lvl w:ilvl="3" w:tplc="2ABE298A">
       <w:numFmt w:val="decimal"/>
       <w:lvlText w:val=""/>
       <w:lvlJc w:val="left"/>
     </w:lvl>
-    <w:lvl w:ilvl="4" w:tplc="B0BA56FC">
+    <w:lvl w:ilvl="4" w:tplc="E884CC10">
       <w:numFmt w:val="decimal"/>
       <w:lvlText w:val=""/>
       <w:lvlJc w:val="left"/>
     </w:lvl>
-    <w:lvl w:ilvl="5" w:tplc="70387518">
+    <w:lvl w:ilvl="5" w:tplc="31BC7286">
       <w:numFmt w:val="decimal"/>
       <w:lvlText w:val=""/>
       <w:lvlJc w:val="left"/>
     </w:lvl>
-    <w:lvl w:ilvl="6" w:tplc="AD82F766">
+    <w:lvl w:ilvl="6" w:tplc="0D9A4ED8">
       <w:numFmt w:val="decimal"/>
       <w:lvlText w:val=""/>
       <w:lvlJc w:val="left"/>
     </w:lvl>
-    <w:lvl w:ilvl="7" w:tplc="9BD816F2">
+    <w:lvl w:ilvl="7" w:tplc="02E43490">
       <w:numFmt w:val="decimal"/>
       <w:lvlText w:val=""/>
       <w:lvlJc w:val="left"/>
     </w:lvl>
-    <w:lvl w:ilvl="8" w:tplc="A6F6A766">
+    <w:lvl w:ilvl="8" w:tplc="FC1A1A96">
       <w:numFmt w:val="decimal"/>
       <w:lvlText w:val=""/>
       <w:lvlJc w:val="left"/>
     </w:lvl>
   </w:abstractNum>
   <w:abstractNum w:abstractNumId="9" w15:restartNumberingAfterBreak="0">
-    <w:nsid w:val="7F7512B6"/>
+    <w:nsid w:val="757C6911"/>
     <w:multiLevelType w:val="hybridMultilevel"/>
-    <w:tmpl w:val="0EE26A5C"/>
-    <w:lvl w:ilvl="0" w:tplc="EE1A24FA">
+    <w:tmpl w:val="F58C9832"/>
+    <w:lvl w:ilvl="0" w:tplc="540CAF0C">
       <w:start w:val="1"/>
       <w:numFmt w:val="decimal"/>
       <w:lvlText w:val="%1."/>
@@ -10262,103 +10368,103 @@
         <w:ind w:left="460" w:hanging="320"/>
       </w:pPr>
     </w:lvl>
-    <w:lvl w:ilvl="1" w:tplc="CD748058">
+    <w:lvl w:ilvl="1" w:tplc="E828E2CE">
       <w:numFmt w:val="decimal"/>
       <w:lvlText w:val=""/>
       <w:lvlJc w:val="left"/>
     </w:lvl>
-    <w:lvl w:ilvl="2" w:tplc="3BC42558">
+    <w:lvl w:ilvl="2" w:tplc="74488CAC">
       <w:numFmt w:val="decimal"/>
       <w:lvlText w:val=""/>
       <w:lvlJc w:val="left"/>
     </w:lvl>
-    <w:lvl w:ilvl="3" w:tplc="0B02885E">
+    <w:lvl w:ilvl="3" w:tplc="3E9A145E">
       <w:numFmt w:val="decimal"/>
       <w:lvlText w:val=""/>
       <w:lvlJc w:val="left"/>
     </w:lvl>
-    <w:lvl w:ilvl="4" w:tplc="04B62B44">
+    <w:lvl w:ilvl="4" w:tplc="9C12CF8A">
       <w:numFmt w:val="decimal"/>
       <w:lvlText w:val=""/>
       <w:lvlJc w:val="left"/>
     </w:lvl>
-    <w:lvl w:ilvl="5" w:tplc="5330E8A2">
+    <w:lvl w:ilvl="5" w:tplc="9C18E206">
       <w:numFmt w:val="decimal"/>
       <w:lvlText w:val=""/>
       <w:lvlJc w:val="left"/>
     </w:lvl>
-    <w:lvl w:ilvl="6" w:tplc="206E5BCE">
+    <w:lvl w:ilvl="6" w:tplc="B414F06C">
       <w:numFmt w:val="decimal"/>
       <w:lvlText w:val=""/>
       <w:lvlJc w:val="left"/>
     </w:lvl>
-    <w:lvl w:ilvl="7" w:tplc="77847F5C">
+    <w:lvl w:ilvl="7" w:tplc="E61A1EEE">
       <w:numFmt w:val="decimal"/>
       <w:lvlText w:val=""/>
       <w:lvlJc w:val="left"/>
     </w:lvl>
-    <w:lvl w:ilvl="8" w:tplc="9266DEA2">
+    <w:lvl w:ilvl="8" w:tplc="00BC73A6">
       <w:numFmt w:val="decimal"/>
       <w:lvlText w:val=""/>
       <w:lvlJc w:val="left"/>
     </w:lvl>
   </w:abstractNum>
-  <w:num w:numId="1" w16cid:durableId="325864245">
+  <w:num w:numId="1" w16cid:durableId="412628398">
+    <w:abstractNumId w:val="5"/>
+    <w:lvlOverride w:ilvl="0">
+      <w:startOverride w:val="1"/>
+    </w:lvlOverride>
+  </w:num>
+  <w:num w:numId="2" w16cid:durableId="422075141">
+    <w:abstractNumId w:val="1"/>
+    <w:lvlOverride w:ilvl="0">
+      <w:startOverride w:val="1"/>
+    </w:lvlOverride>
+  </w:num>
+  <w:num w:numId="3" w16cid:durableId="1190685837">
+    <w:abstractNumId w:val="8"/>
+    <w:lvlOverride w:ilvl="0">
+      <w:startOverride w:val="1"/>
+    </w:lvlOverride>
+  </w:num>
+  <w:num w:numId="4" w16cid:durableId="1240291272">
+    <w:abstractNumId w:val="6"/>
+    <w:lvlOverride w:ilvl="0">
+      <w:startOverride w:val="1"/>
+    </w:lvlOverride>
+  </w:num>
+  <w:num w:numId="5" w16cid:durableId="759839946">
+    <w:abstractNumId w:val="2"/>
+    <w:lvlOverride w:ilvl="0">
+      <w:startOverride w:val="1"/>
+    </w:lvlOverride>
+  </w:num>
+  <w:num w:numId="6" w16cid:durableId="1581258807">
+    <w:abstractNumId w:val="4"/>
+    <w:lvlOverride w:ilvl="0">
+      <w:startOverride w:val="1"/>
+    </w:lvlOverride>
+  </w:num>
+  <w:num w:numId="7" w16cid:durableId="384182415">
+    <w:abstractNumId w:val="7"/>
+    <w:lvlOverride w:ilvl="0">
+      <w:startOverride w:val="1"/>
+    </w:lvlOverride>
+  </w:num>
+  <w:num w:numId="8" w16cid:durableId="17899005">
+    <w:abstractNumId w:val="0"/>
+    <w:lvlOverride w:ilvl="0">
+      <w:startOverride w:val="1"/>
+    </w:lvlOverride>
+  </w:num>
+  <w:num w:numId="9" w16cid:durableId="718748575">
     <w:abstractNumId w:val="3"/>
     <w:lvlOverride w:ilvl="0">
       <w:startOverride w:val="1"/>
     </w:lvlOverride>
   </w:num>
-  <w:num w:numId="2" w16cid:durableId="773404354">
-    <w:abstractNumId w:val="5"/>
-    <w:lvlOverride w:ilvl="0">
-      <w:startOverride w:val="1"/>
-    </w:lvlOverride>
-  </w:num>
-  <w:num w:numId="3" w16cid:durableId="18169034">
+  <w:num w:numId="10" w16cid:durableId="392696640">
     <w:abstractNumId w:val="9"/>
-    <w:lvlOverride w:ilvl="0">
-      <w:startOverride w:val="1"/>
-    </w:lvlOverride>
-  </w:num>
-  <w:num w:numId="4" w16cid:durableId="1270314980">
-    <w:abstractNumId w:val="6"/>
-    <w:lvlOverride w:ilvl="0">
-      <w:startOverride w:val="1"/>
-    </w:lvlOverride>
-  </w:num>
-  <w:num w:numId="5" w16cid:durableId="1303773910">
-    <w:abstractNumId w:val="4"/>
-    <w:lvlOverride w:ilvl="0">
-      <w:startOverride w:val="1"/>
-    </w:lvlOverride>
-  </w:num>
-  <w:num w:numId="6" w16cid:durableId="138427937">
-    <w:abstractNumId w:val="2"/>
-    <w:lvlOverride w:ilvl="0">
-      <w:startOverride w:val="1"/>
-    </w:lvlOverride>
-  </w:num>
-  <w:num w:numId="7" w16cid:durableId="615062382">
-    <w:abstractNumId w:val="1"/>
-    <w:lvlOverride w:ilvl="0">
-      <w:startOverride w:val="1"/>
-    </w:lvlOverride>
-  </w:num>
-  <w:num w:numId="8" w16cid:durableId="1959485280">
-    <w:abstractNumId w:val="7"/>
-    <w:lvlOverride w:ilvl="0">
-      <w:startOverride w:val="1"/>
-    </w:lvlOverride>
-  </w:num>
-  <w:num w:numId="9" w16cid:durableId="1536238805">
-    <w:abstractNumId w:val="0"/>
-    <w:lvlOverride w:ilvl="0">
-      <w:startOverride w:val="1"/>
-    </w:lvlOverride>
-  </w:num>
-  <w:num w:numId="10" w16cid:durableId="735905520">
-    <w:abstractNumId w:val="8"/>
     <w:lvlOverride w:ilvl="0">
       <w:startOverride w:val="1"/>
     </w:lvlOverride>
@@ -10978,7 +11084,7 @@
     <w:autoRedefine/>
     <w:uiPriority w:val="39"/>
     <w:unhideWhenUsed/>
-    <w:rsid w:val="004503CF"/>
+    <w:rsid w:val="005436F0"/>
     <w:pPr>
       <w:spacing w:after="100"/>
     </w:pPr>

</xml_diff>